<commit_message>
Add missing in-text citations (5 papers) and remove zero-width spaces (\u200b)
</commit_message>
<xml_diff>
--- a/เค้าโครงโครงงานคอมพิวเตอร์-ฉบับปรับปรุง.docx
+++ b/เค้าโครงโครงงานคอมพิวเตอร์-ฉบับปรับปรุง.docx
@@ -15,7 +15,7 @@
           <w:sz w:val="32"/>
           <w:szCs w:val="32"/>
         </w:rPr>
-        <w:t xml:space="preserve">CS2569/หมายเลข​กลุ่ม</w:t>
+        <w:t xml:space="preserve">CS2569/หมายเลขกลุ่ม</w:t>
       </w:r>
     </w:p>
     <w:p>
@@ -57,7 +57,7 @@
           <w:sz w:val="36"/>
           <w:szCs w:val="36"/>
         </w:rPr>
-        <w:t xml:space="preserve">เค้าโครง​โครง​งาน​คอมพิวเตอร์</w:t>
+        <w:t xml:space="preserve">เค้าโครงโครงงานคอมพิวเตอร์</w:t>
       </w:r>
     </w:p>
     <w:p>
@@ -99,7 +99,7 @@
           <w:sz w:val="36"/>
           <w:szCs w:val="36"/>
         </w:rPr>
-        <w:t xml:space="preserve">การ​เพิ่ม​ประสิทธิภาพ​การ​ตรวจ​จับ​ภาวะ​ปอด​อักเสบ​จาก​ภาพ​เอกซเรย์</w:t>
+        <w:t xml:space="preserve">การเพิ่มประสิทธิภาพการตรวจจับภาวะปอดอักเสบจากภาพเอกซเรย์</w:t>
       </w:r>
     </w:p>
     <w:p>
@@ -115,7 +115,7 @@
           <w:sz w:val="36"/>
           <w:szCs w:val="36"/>
         </w:rPr>
-        <w:t xml:space="preserve">ทรวงอก​ด้วย​การ​ลด​สัญญาณ​รบกวน​และ​ปัญญา​ประดิษฐ์</w:t>
+        <w:t xml:space="preserve">ทรวงอกด้วยการลดสัญญาณรบกวนและปัญญาประดิษฐ์</w:t>
       </w:r>
     </w:p>
     <w:p>
@@ -131,7 +131,7 @@
           <w:sz w:val="36"/>
           <w:szCs w:val="36"/>
         </w:rPr>
-        <w:t xml:space="preserve">ที่​อธิบาย​ได้</w:t>
+        <w:t xml:space="preserve">ที่อธิบายได้</w:t>
       </w:r>
     </w:p>
     <w:p>
@@ -234,7 +234,7 @@
           <w:sz w:val="32"/>
           <w:szCs w:val="32"/>
         </w:rPr>
-        <w:t xml:space="preserve">นาย​ปิยะ​พล ตุ่น​ป่า  รหัส​ประจำ​ตัว 673380280-2</w:t>
+        <w:t xml:space="preserve">นายปิยะพล ตุ่นป่า  รหัสประจำตัว 673380280-2</w:t>
       </w:r>
     </w:p>
     <w:p>
@@ -250,7 +250,7 @@
           <w:sz w:val="32"/>
           <w:szCs w:val="32"/>
         </w:rPr>
-        <w:t xml:space="preserve">นาย​สัพพัญญู คำ​ตุ้ม  รหัส​ประจำ​ตัว 673380066-4</w:t>
+        <w:t xml:space="preserve">นายสัพพัญญู คำตุ้ม  รหัสประจำตัว 673380066-4</w:t>
       </w:r>
     </w:p>
     <w:p>
@@ -279,7 +279,7 @@
           <w:sz w:val="32"/>
           <w:szCs w:val="32"/>
         </w:rPr>
-        <w:t xml:space="preserve">อาจารย์​ที่​ปรึกษา  อ.ดร.พบพร ด่าน​วิ​รุ​ทัย</w:t>
+        <w:t xml:space="preserve">อาจารย์ที่ปรึกษา  อ.ดร.พบพร ด่านวิรุทัย</w:t>
       </w:r>
     </w:p>
     <w:p>
@@ -347,7 +347,7 @@
           <w:sz w:val="32"/>
           <w:szCs w:val="32"/>
         </w:rPr>
-        <w:t xml:space="preserve">รายงาน​นี้​เป็น​ส่วน​หนึ่ง​ของ​การ​ศึกษา​วิชา CP353761 สัมมนา​ทาง​วิทยาการ​คอมพิวเตอร์</w:t>
+        <w:t xml:space="preserve">รายงานนี้เป็นส่วนหนึ่งของการศึกษาวิชา CP353761 สัมมนาทางวิทยาการคอมพิวเตอร์</w:t>
       </w:r>
     </w:p>
     <w:p>
@@ -363,7 +363,7 @@
           <w:sz w:val="32"/>
           <w:szCs w:val="32"/>
         </w:rPr>
-        <w:t xml:space="preserve">ภาค​เรียน​ที่ 1 ปี​การ​ศึกษา 2569</w:t>
+        <w:t xml:space="preserve">ภาคเรียนที่ 1 ปีการศึกษา 2569</w:t>
       </w:r>
     </w:p>
     <w:p>
@@ -379,7 +379,7 @@
           <w:sz w:val="32"/>
           <w:szCs w:val="32"/>
         </w:rPr>
-        <w:t xml:space="preserve">สาขา​วิชา​วิทยาการ​คอมพิวเตอร์ วิทยาลัย​การ​คอมพิวเตอร์</w:t>
+        <w:t xml:space="preserve">สาขาวิชาวิทยาการคอมพิวเตอร์ วิทยาลัยการคอมพิวเตอร์</w:t>
       </w:r>
     </w:p>
     <w:p>
@@ -395,7 +395,7 @@
           <w:sz w:val="32"/>
           <w:szCs w:val="32"/>
         </w:rPr>
-        <w:t xml:space="preserve">มหาวิทยาลัย​ขอนแก่น</w:t>
+        <w:t xml:space="preserve">มหาวิทยาลัยขอนแก่น</w:t>
       </w:r>
     </w:p>
     <w:p>
@@ -432,7 +432,7 @@
           <w:sz w:val="36"/>
           <w:szCs w:val="36"/>
         </w:rPr>
-        <w:t xml:space="preserve">การ​เสนอ​เค้าโครง​โครง​งาน​คอมพิวเตอร์</w:t>
+        <w:t xml:space="preserve">การเสนอเค้าโครงโครงงานคอมพิวเตอร์</w:t>
       </w:r>
     </w:p>
     <w:p>
@@ -448,7 +448,7 @@
           <w:sz w:val="32"/>
           <w:szCs w:val="32"/>
         </w:rPr>
-        <w:t xml:space="preserve">สาขา​วิชา​วิทยาการ​คอมพิวเตอร์  วิทยาลัย​การ​คอมพิวเตอร์  มหาวิทยาลัย​ขอนแก่น</w:t>
+        <w:t xml:space="preserve">สาขาวิชาวิทยาการคอมพิวเตอร์  วิทยาลัยการคอมพิวเตอร์  มหาวิทยาลัยขอนแก่น</w:t>
       </w:r>
     </w:p>
     <w:p>
@@ -646,7 +646,7 @@
           <w:sz w:val="32"/>
           <w:szCs w:val="32"/>
         </w:rPr>
-        <w:t xml:space="preserve">1. ชื่อ​หัวข้อ​โครง​งาน</w:t>
+        <w:t xml:space="preserve">1. ชื่อหัวข้อโครงงาน</w:t>
       </w:r>
     </w:p>
     <w:p>
@@ -664,15 +664,15 @@
           <w:sz w:val="28"/>
           <w:szCs w:val="28"/>
         </w:rPr>
-        <w:t xml:space="preserve">ภาษา​ไทย :	</w:t>
-      </w:r>
-      <w:r>
-        <w:rPr>
-          <w:rFonts w:ascii="TH Sarabun New" w:cs="TH Sarabun New" w:eastAsia="TH Sarabun New" w:hAnsi="TH Sarabun New"/>
-          <w:sz w:val="28"/>
-          <w:szCs w:val="28"/>
-        </w:rPr>
-        <w:t xml:space="preserve">การ​เพิ่ม​ประสิทธิภาพ​การ​ตรวจ​จับ​ภาวะ​ปอด​อักเสบ​จาก​ภาพ​เอกซเรย์​ทรวงอก​ด้วย​การ​ลด​สัญญาณ​รบกวน​และ​ปัญญา​ประดิษฐ์​ที่​อธิบาย​ได้</w:t>
+        <w:t xml:space="preserve">ภาษาไทย :	</w:t>
+      </w:r>
+      <w:r>
+        <w:rPr>
+          <w:rFonts w:ascii="TH Sarabun New" w:cs="TH Sarabun New" w:eastAsia="TH Sarabun New" w:hAnsi="TH Sarabun New"/>
+          <w:sz w:val="28"/>
+          <w:szCs w:val="28"/>
+        </w:rPr>
+        <w:t xml:space="preserve">การเพิ่มประสิทธิภาพการตรวจจับภาวะปอดอักเสบจากภาพเอกซเรย์ทรวงอกด้วยการลดสัญญาณรบกวนและปัญญาประดิษฐ์ที่อธิบายได้</w:t>
       </w:r>
     </w:p>
     <w:p>
@@ -690,7 +690,7 @@
           <w:sz w:val="28"/>
           <w:szCs w:val="28"/>
         </w:rPr>
-        <w:t xml:space="preserve">ภาษา​อังกฤษ :	</w:t>
+        <w:t xml:space="preserve">ภาษาอังกฤษ :	</w:t>
       </w:r>
       <w:r>
         <w:rPr>
@@ -715,7 +715,7 @@
           <w:sz w:val="32"/>
           <w:szCs w:val="32"/>
         </w:rPr>
-        <w:t xml:space="preserve">2. หลัก​การ​และ​เหตุผล</w:t>
+        <w:t xml:space="preserve">2. หลักการและเหตุผล</w:t>
       </w:r>
     </w:p>
     <w:p>
@@ -730,7 +730,7 @@
           <w:sz w:val="28"/>
           <w:szCs w:val="28"/>
         </w:rPr>
-        <w:t xml:space="preserve">โรค​ระบบ​ทาง​เดิน​หายใจ​และ​ความ​ผิด​ปกติ​ของ​ปอด​ถือ​เป็น​หนึ่ง​ใน​สาเหตุ​สำคัญ​ของ​การ​เจ็บ​ป่วย​และ​เสีย​ชีวิต​ใน​ระดับ​สากล โดย​เฉพาะ​ภาวะ​ฝ้า​ใน​ปอด​หรือ​ปอด​อักเสบ​แทรกซึม (Pulmonary Infiltration) ซึ่ง​เกิด​จาก​การ​สะสม​ของ​ของเหลว เซลล์​อักเสบ หรือ​หนองใน​ถุง​ลม​ปอด​จาก​สาเหตุ​ต่าง ๆ เช่น โรค​ปอดบวม (Pneumonia) หรือ​การ​ติด​เชื้อ​ใน​ระบบ​ทาง​เดิน​หายใจ (World Health Organization [WHO], 2024) การ​ตรวจ​เอกซเรย์​ทรวงอก (Chest X-ray: CXR) จัด​เป็น​หัตถการ​รังสี​วินิจฉัย​ด่าน​แรก​ที่​นิยม​ใช้​มาก​ที่สุด​เนื่องจาก​มี​ความ​รวดเร็ว เข้า​ถึง​ง่าย และ​มี​ค่า​ใช้​จ่าย​ต่ำ อย่างไร​ก็ตาม ด้วย​ปริมาณ​ภาพถ่าย​รังสี​ที่​เพิ่ม​ขึ้น​อย่าง​มหาศาล สวน​ทาง​กับ​จำนวน​รังสีแพทย์​ผู้​เชี่ยวชาญ ประกอบ​กับ​ลักษณะ​รอย​โรค​ของ Infiltration มัก​มี​ลักษณะ​เป็น​ฝ้า​กระจาย​ตัว ขอบเขต​ไม่​ชัดเจน (Diffuse and Ill-defined Opacity) และ​กลมกลืน​กับ​เนื้อเยื่อ​ปอด​ปกติ จึง​มัก​เกิด​ความ​แปรปรวน​ใน​การ​อ่าน​ผล (Inter-observer Variability) และ​ส่ง​ผล​ให้​แพทย์​มี​ภาระ​งาน​สูง​จน​อาจ​เกิด​ความ​ผิด​พลาด​ใน​การ​วินิจฉัย​เบื้อง​ต้น​ได้ (Raoof et al., 2012; Wang et al., 2017)</w:t>
+        <w:t xml:space="preserve">โรคระบบทางเดินหายใจและความผิดปกติของปอดถือเป็นหนึ่งในสาเหตุสำคัญของการเจ็บป่วยและเสียชีวิตในระดับสากล โดยเฉพาะภาวะฝ้าในปอดหรือปอดอักเสบแทรกซึม (Pulmonary Infiltration) ซึ่งเกิดจากการสะสมของของเหลว เซลล์อักเสบ หรือหนองในถุงลมปอดจากสาเหตุต่าง ๆ เช่น โรคปอดบวม (Pneumonia) หรือการติดเชื้อในระบบทางเดินหายใจ (World Health Organization [WHO], 2024) การตรวจเอกซเรย์ทรวงอก (Chest X-ray: CXR) จัดเป็นหัตถการรังสีวินิจฉัยด่านแรกที่นิยมใช้มากที่สุดเนื่องจากมีความรวดเร็ว เข้าถึงง่าย และมีค่าใช้จ่ายต่ำ อย่างไรก็ตาม ด้วยปริมาณภาพถ่ายรังสีที่เพิ่มขึ้นอย่างมหาศาล สวนทางกับจำนวนรังสีแพทย์ผู้เชี่ยวชาญ ประกอบกับลักษณะรอยโรคของ Infiltration มักมีลักษณะเป็นฝ้ากระจายตัว ขอบเขตไม่ชัดเจน (Diffuse and Ill-defined Opacity) และกลมกลืนกับเนื้อเยื่อปอดปกติ จึงมักเกิดความแปรปรวนในการอ่านผล (Inter-observer Variability) และส่งผลให้แพทย์มีภาระงานสูงจนอาจเกิดความผิดพลาดในการวินิจฉัยเบื้องต้นได้ (Raoof et al., 2012; Wang et al., 2017)</w:t>
       </w:r>
     </w:p>
     <w:p>
@@ -745,7 +745,7 @@
           <w:sz w:val="28"/>
           <w:szCs w:val="28"/>
         </w:rPr>
-        <w:t xml:space="preserve">ด้วย​เหตุ​นี้ ใน​ช่วง​ไม่​กี่​ปี​ที่​ผ่าน​มา​จึง​มี​การนำ​ปัญญา​ประดิษฐ์ โดย​เฉพาะ​การ​เรียน​รู้​เชิง​ลึก (Deep Learning) และ​โครง​ข่าย​ประสาท​เทียม​แบบ​คอน​โว​ลู​ชัน (Convolutional Neural Networks: CNN) มา​ประยุกต์​ใช้​เพื่อ​ตรวจ​จับ​และ​จำแนก​ความ​ผิด​ปกติ​จาก​ภาพ​เอกซเรย์​ทรวงอก ซึ่ง​มี​ประสิทธิภาพ​และ​ค่า​ความ​แม่นยำ​สูง​ใน​ระดับ​เทียบ​เท่า​ผู้​เชี่ยวชาญ (Rajpurkar et al., 2017) ทว่า​ปัญหา​สำคัญ​ที่​เป็น​อุปสรรค​ต่อ​การนำ​ไป​ใช้​จริง​ใน​งาน​บริการ​ทางการ​แพทย์​คือ "ปัญหา​โมเดล​กล่อง​ดำ" (Black-Box Problem) เนื่องจาก​โครง​ข่าย​ประสาท​เทียม​ตัดสิน​ผลลัพธ์​ผ่าน​ความ​สัมพันธ์​ทาง​คณิตศาสตร์​ที่​ซับ​ซ้อน ทำให้​บุคลากร​ทางการ​แพทย์​ไม่​สามารถ​ทราบ​ได้​ว่า​โมเดล​ตัดสิน​ใจ​จาก​รอย​โรค​จริง​หรือ​จาก​สิ่ง​แปลก​ปลอม (Artifacts/Confounders) เช่น สาย​ระโยง​ทางการ​แพทย์ หรือ​สัญญาณ​รบกวน (Noise) บน​ภาพถ่าย ส่ง​ผล​ให้​ขาด​ความ​น่า​เชื่อ​ถือ​และ​ความ​โปร่งใส​ใน​การนำ​ไป​สนับสนุน​การ​ตัดสิน​ใจ​ทาง​คลินิก (Rudin, 2019; van der Velden et al., 2022)</w:t>
+        <w:t xml:space="preserve">ด้วยเหตุนี้ ในช่วงไม่กี่ปีที่ผ่านมาจึงมีการนำปัญญาประดิษฐ์ โดยเฉพาะการเรียนรู้เชิงลึก (Deep Learning) และโครงข่ายประสาทเทียมแบบคอนโวลูชัน (Convolutional Neural Networks: CNN) มาประยุกต์ใช้เพื่อตรวจจับและจำแนกความผิดปกติจากภาพเอกซเรย์ทรวงอก ซึ่งมีประสิทธิภาพและค่าความแม่นยำสูงในระดับเทียบเท่าผู้เชี่ยวชาญ (Rajpurkar et al., 2017; Parra-Cabrera et al., 2026) ทว่าปัญหาสำคัญที่เป็นอุปสรรคต่อการนำไปใช้จริงในงานบริการทางการแพทย์คือ "ปัญหาโมเดลกล่องดำ" (Black-Box Problem) เนื่องจากโครงข่ายประสาทเทียมตัดสินผลลัพธ์ผ่านความสัมพันธ์ทางคณิตศาสตร์ที่ซับซ้อน ทำให้บุคลากรทางการแพทย์ไม่สามารถทราบได้ว่าโมเดลตัดสินใจจากรอยโรคจริงหรือจากสิ่งแปลกปลอม (Artifacts/Confounders) เช่น สายระโยงทางการแพทย์ หรือสัญญาณรบกวน (Noise) บนภาพถ่าย ส่งผลให้ขาดความน่าเชื่อถือและความโปร่งใสในการนำไปสนับสนุนการตัดสินใจทางคลินิก (Rudin, 2019; van der Velden et al., 2022; Dhar et al., 2023)</w:t>
       </w:r>
     </w:p>
     <w:p>
@@ -760,7 +760,7 @@
           <w:sz w:val="28"/>
           <w:szCs w:val="28"/>
         </w:rPr>
-        <w:t xml:space="preserve">เพื่อ​แก้​ปัญหา​ความ​โปร่งใส เทคโนโลยี​ปัญญา​ประดิษฐ์​ที่​อธิบาย​ได้ (Explainable Artificial Intelligence: XAI) เช่น Grad-CAM และ SHAP (SHapley Additive exPlanations) จึง​เข้า​มา​มี​บทบาท​สำคัญ​ใน​การ​สร้าง​แผนที่​ความ​สนใจ​และ​วิเคราะห์​ค่าน้ำ​หนัก​ฟีเจอร์​ระดับ​พิกเซล (Feature Attribution) เพื่อ​ระบุ​ตำแหน่ง​รอย​โรค (Lundberg &amp; Lee, 2017; Sheu et al., 2023) อย่างไร​ก็ตาม จาก​การ​สังเคราะห์​วรรณกรรม​พบ​ช่อง​ว่าง​ทาง​ความ​รู้​ที่​สำคัญ 2 ประการ</w:t>
+        <w:t xml:space="preserve">เพื่อแก้ปัญหาความโปร่งใส เทคโนโลยีปัญญาประดิษฐ์ที่อธิบายได้ (Explainable Artificial Intelligence: XAI) เช่น Grad-CAM และ SHAP (SHapley Additive exPlanations) จึงเข้ามามีบทบาทสำคัญในการสร้างแผนที่ความสนใจและวิเคราะห์ค่าน้ำหนักฟีเจอร์ระดับพิกเซล (Feature Attribution) เพื่อระบุตำแหน่งรอยโรค (Lundberg &amp; Lee, 2017; Sheu et al., 2023) อย่างไรก็ตาม จากการสังเคราะห์วรรณกรรมพบช่องว่างทางความรู้ที่สำคัญ 2 ประการ</w:t>
       </w:r>
     </w:p>
     <w:p>
@@ -777,15 +777,15 @@
           <w:sz w:val="28"/>
           <w:szCs w:val="28"/>
         </w:rPr>
-        <w:t xml:space="preserve">ประการ​แรก</w:t>
-      </w:r>
-      <w:r>
-        <w:rPr>
-          <w:rFonts w:ascii="TH Sarabun New" w:cs="TH Sarabun New" w:eastAsia="TH Sarabun New" w:hAnsi="TH Sarabun New"/>
-          <w:sz w:val="28"/>
-          <w:szCs w:val="28"/>
-        </w:rPr>
-        <w:t xml:space="preserve"> รอย​โรค​แบบ​ฝ้า​กระจาย (Infiltration) มัก​ให้​ความ​แม่นยำ​และ​ค่า F1-Score ต่ำ​กว่า​รอย​โรค​ที่​มี​ขอบเขต​ชัดเจน (เช่น Nodule หรือ Cardiomegaly) และ​แผนภาพ​อธิบาย​ผล​ของ AI มัก​ล้ม​เหลว​ใน​การ​ระบุ​ขอบเขต​รอย​โรค​ที่​แพร่​กระจาย​ตัวอย่าง​ถูก​ต้อง (Chrysoula, 2023)</w:t>
+        <w:t xml:space="preserve">ประการแรก</w:t>
+      </w:r>
+      <w:r>
+        <w:rPr>
+          <w:rFonts w:ascii="TH Sarabun New" w:cs="TH Sarabun New" w:eastAsia="TH Sarabun New" w:hAnsi="TH Sarabun New"/>
+          <w:sz w:val="28"/>
+          <w:szCs w:val="28"/>
+        </w:rPr>
+        <w:t xml:space="preserve"> รอยโรคแบบฝ้ากระจาย (Infiltration) มักให้ความแม่นยำและค่า F1-Score ต่ำกว่ารอยโรคที่มีขอบเขตชัดเจน (เช่น Nodule หรือ Cardiomegaly) และแผนภาพอธิบายผลของ AI มักล้มเหลวในการระบุขอบเขตรอยโรคที่แพร่กระจายตัวอย่างถูกต้อง (Chrysoula, 2023)</w:t>
       </w:r>
     </w:p>
     <w:p>
@@ -802,15 +802,15 @@
           <w:sz w:val="28"/>
           <w:szCs w:val="28"/>
         </w:rPr>
-        <w:t xml:space="preserve">ประการ​ที่​สอง</w:t>
-      </w:r>
-      <w:r>
-        <w:rPr>
-          <w:rFonts w:ascii="TH Sarabun New" w:cs="TH Sarabun New" w:eastAsia="TH Sarabun New" w:hAnsi="TH Sarabun New"/>
-          <w:sz w:val="28"/>
-          <w:szCs w:val="28"/>
-        </w:rPr>
-        <w:t xml:space="preserve"> ภาพ​เอกซเรย์​ใน​เวช​ปฏิบัติ​จริง​มัก​มี​สัญญาณ​รบกวน​และ​ความ​เปรียบ​ต่าง​ต่ำ ซึ่ง​ส่ง​ผลก​ระ​ทบ​โดยตรง​ต่อ​เสถียรภาพ​ของ​แผนภาพ XAI (Adebayo et al., 2018) แต่​การนำ​เทคนิค​การ​ลด​สัญญาณ​รบกวน (Image Denoising) มา​ใช้​ก็​มี​ความ​เสี่ยง​ที่​จะ​เกิด​ภาวะ Over-smoothing ที่​อาจ​ลบรอย​ฝ้า​บาง​จาง​ของ Infiltration ทิ้ง​ไป​พร้อม​กับ​สัญญาณ​รบกวน นอกจาก​นี้ งาน​วิจัย​ส่วน​ใหญ่​ยัง​ประเมิน​แผนภาพ XAI เพียง​การ​มอง​ด้วย​สายตา (Qualitative) และ​ยัง​ขาด​การ​ศึกษา​เปรียบ​เทียบ​อย่าง​เป็น​ระบบ (Fair Comparison) ว่าการ​ลด​สัญญาณ​รบกวน​ใน​แต่ละ​ระดับ (เช่น Median Filter, CLAHE + DWT หรือ Denoising Autoencoder) ช่วย​เพิ่ม​ความ​แม่นยำ​ใน​การ​ชี้​ตำแหน่ง​รอย​โรค​จริง​ของ​แพทย์​ใน​เชิง​ปริมาณ (Quantitative Localization) ได้​มาก​น้อย​เพียง​ใด</w:t>
+        <w:t xml:space="preserve">ประการที่สอง</w:t>
+      </w:r>
+      <w:r>
+        <w:rPr>
+          <w:rFonts w:ascii="TH Sarabun New" w:cs="TH Sarabun New" w:eastAsia="TH Sarabun New" w:hAnsi="TH Sarabun New"/>
+          <w:sz w:val="28"/>
+          <w:szCs w:val="28"/>
+        </w:rPr>
+        <w:t xml:space="preserve"> ภาพเอกซเรย์ในเวชปฏิบัติจริงมักมีสัญญาณรบกวนและความเปรียบต่างต่ำ ซึ่งส่งผลกระทบโดยตรงต่อเสถียรภาพของแผนภาพ XAI (Adebayo et al., 2018) แต่การนำเทคนิคการลดสัญญาณรบกวนและการปรับปรุงคุณภาพภาพ (Image Denoising and Enhancement) มาใช้ (Rahman et al., 2021; Song et al., 2025) ก็มีความเสี่ยงที่จะเกิดภาวะ Over-smoothing ที่อาจลบรอยฝ้าบางจางของ Infiltration ทิ้งไปพร้อมกับสัญญาณรบกวน นอกจากนี้ แม้จะมีการศึกษาที่ผสานการลดสัญญาณรบกวนเข้ากับ XAI (Byeon et al., 2025) แต่งานวิจัยส่วนใหญ่ยังประเมินแผนภาพ XAI เพียงการมองด้วยสายตา (Qualitative) และยังขาดการศึกษาเปรียบเทียบอย่างเป็นระบบ (Fair Comparison) ว่าการลดสัญญาณรบกวนในแต่ละระดับ (เช่น Median Filter, CLAHE + DWT หรือ Denoising Autoencoder) ช่วยเพิ่มความแม่นยำในการชี้ตำแหน่งรอยโรคจริงของแพทย์ในเชิงปริมาณ (Quantitative Localization) ได้มากน้อยเพียงใด</w:t>
       </w:r>
     </w:p>
     <w:p>
@@ -825,7 +825,7 @@
           <w:sz w:val="28"/>
           <w:szCs w:val="28"/>
         </w:rPr>
-        <w:t xml:space="preserve">นอกจาก​นี้ สัญญาณ​รบกวน​ใน​ภาพ​เอกซเรย์​ทรวงอก​มี​หลาย​ลักษณะ​ตาม​แหล่ง​กำเนิด ได้แก่ Gaussian Noise จาก​วงจร​อิเล็กทรอนิกส์​ของ​ตัว​รับ​ภาพ, Poisson (Quantum) Noise จาก​การก​ระ​จา​ย​ตัว​เชิง​สถิติ​ของ​โฟ​ตอน​รัง​สี​เอก​ซ์, Poisson–Gaussian Noise ซึ่ง​เป็น​แบบ​จำลอง​ผสม​ที่​ใกล้​เคียง​สภาวะ​จริง​ของ​ตัว​รับ​ภาพ​ดิจิทัล (Foi et al., 2008), Salt-and-Pepper Noise จาก​พิกเซล​บกพร่อง​หรือ​ความ​ผิด​พลาด​ใน​การ​ส่ง​ข้อมูล และ Speckle Noise ซึ่ง​เป็น​สัญญาณ​รบกวน​แบบ​คูณ เทคนิค​การ​ลด​สัญญาณ​รบกวน​แต่ละ​แบบ​จึง​อาจ​เหมาะ​สม​กับ​สัญญาณ​รบกวน​ต่าง​ชนิด​กัน อีก​ทั้ง​ราย​ละเอียด​ของ​รอย​โรค​แบบ​ฝ้า​กระจาย​ยัง​กระจาย​อยู่​ใน​หลาย​ย่าน​ความถี่​ของ​ภาพ การ​แยก​ย่าน​ความถี่​ด้วย​การ​แป​ลง​เวฟ​เล็ต​แบบ​ไม่​ต่อ​เนื่อง (Discrete Wavelet Transform: DWT) หรือ​การ​แป​ลง​ฟู​เรียร์​แบบ​ไม่​ต่อ​เนื่อง (Discrete Fourier Transform: DFT) แล้ว​รวม​หลาย​มุม​มอง​เข้า​ด้วย​กัน (Multi-view Frequency Fusion) จึง​เป็น​อีก​แนวทาง​ที่​ควร​ศึกษา​ควบคู่​กับ​การ​ปรับ​ความ​แรง​ของ​การ​ลด​สัญญาณ​รบกวน​หลาย​ระดับ (L1–L4) เพื่อ​หา​จุด​สมดุล​ก่อน​เกิด​ภาวะ Over-smoothing</w:t>
+        <w:t xml:space="preserve">นอกจากนี้ สัญญาณรบกวนในภาพเอกซเรย์ทรวงอกมีหลายลักษณะตามแหล่งกำเนิด ได้แก่ Gaussian Noise จากวงจรอิเล็กทรอนิกส์ของตัวรับภาพ, Poisson (Quantum) Noise จากการกระจายตัวเชิงสถิติของโฟตอนรังสีเอกซ์, Poisson–Gaussian Noise ซึ่งเป็นแบบจำลองผสมที่ใกล้เคียงสภาวะจริงของตัวรับภาพดิจิทัล (Foi et al., 2008), Salt-and-Pepper Noise จากพิกเซลบกพร่องหรือความผิดพลาดในการส่งข้อมูล และ Speckle Noise ซึ่งเป็นสัญญาณรบกวนแบบคูณ เทคนิคการลดสัญญาณรบกวนแต่ละแบบจึงอาจเหมาะสมกับสัญญาณรบกวนต่างชนิดกัน อีกทั้งรายละเอียดของรอยโรคแบบฝ้ากระจายยังกระจายอยู่ในหลายย่านความถี่ของภาพ การแยกย่านความถี่ด้วยการแปลงเวฟเล็ตแบบไม่ต่อเนื่อง (Discrete Wavelet Transform: DWT) หรือการแปลงฟูเรียร์แบบไม่ต่อเนื่อง (Discrete Fourier Transform: DFT) แล้วรวมหลายมุมมองเข้าด้วยกัน (Multi-view Frequency Fusion) จึงเป็นอีกแนวทางที่ควรศึกษาควบคู่กับการปรับความแรงของการลดสัญญาณรบกวนหลายระดับ (L1–L4) เพื่อหาจุดสมดุลก่อนเกิดภาวะ Over-smoothing</w:t>
       </w:r>
     </w:p>
     <w:p>
@@ -840,7 +840,7 @@
           <w:sz w:val="28"/>
           <w:szCs w:val="28"/>
         </w:rPr>
-        <w:t xml:space="preserve">ดัง​นั้น คณะ​ผู้​จัด​ทำ​จึง​มี​แนวคิด​ใน​การ​พัฒนา​โครง​งาน​เรื่อง "การ​เพิ่ม​ประสิทธิภาพ​การ​ตรวจ​จับ​ภาวะ​ปอด​อักเสบ​จาก​ภาพ​เอกซเรย์​ทรวงอก​ด้วย​การ​ลด​สัญญาณ​รบกวน​และ​ปัญญา​ประดิษฐ์​ที่​อธิบาย​ได้" (Enhancing Chest X-ray Infiltration Detection Using Noise Reduction and Explainable AI) เพื่อ​ศึกษา​และ​เปรียบ​เทียบ​ผลก​ระ​ทบ​ของ​เทคนิค​การ​ลด​สัญญาณ​รบกวน​หลาย​ระดับ (L1–L4) การ​แยก​ย่าน​ความถี่ และ​การ​รวม​เทคนิค​เชิง​ความถี่ ต่อ​ความ​แม่นยำ​ของ​โมเดล CNN บน​ชุด​ข้อมูล​มาตรฐาน 2 ชุด ได้แก่ NIH ChestX-ray14 (Wang et al., 2017) และ VinBigData Chest X-ray (Nguyen et al., 2022) ทั้ง​บน​ภาพ​ต้นฉบับ​และ​ภาพ​จำลอง​สัญญาณ​รบกวน 5 ตระกูล 3 ระดับ​ความ​แรง ควบคู่​กับ​การ​ประเมิน​คุณภาพ​ภาพ (PSNR และ SSIM) และ​การ​ประเมิน​ความ​ถูก​ต้อง​ของ​การ​ชี้​ตำแหน่ง​รอย​โรค​เชิง​ปริมาณ (Quantitative Localization Evaluation) ผ่าน​แผนภาพ Grad-CAM และ SHAP ด้วย​ตัว​ชี้​วัด Pointing Game Hit Rate, Energy Inside Bounding Box และ IoU เทียบ​กับ​กรอบ​รอย​โรค​จริง​ของ​รังสีแพทย์ (Ground-Truth Bounding Box) ผลลัพธ์​จาก​โครง​งาน​นี้​จะ​ช่วย​สร้าง​ความ​เข้าใจ​ถึง​ผลก​ระ​ทบ​ของ​การเต​รี​ยม​ภาพ​ต่อ​ความ​สามารถ​ใน​การ​จำแนก​และ​อธิบาย​ผล​ของ AI ป้องกัน​ปัญหา Over-smoothing และ​ยก​ระดับ​ความ​น่า​เชื่อ​ถือ​ของ​ระบบ​ปัญญา​ประดิษฐ์​สำหรับ​สนับสนุน​การ​ตัดสิน​ใจ​ทางการ​แพทย์​ต่อ​ไป​ใน​อนาคต</w:t>
+        <w:t xml:space="preserve">ดังนั้น คณะผู้จัดทำจึงมีแนวคิดในการพัฒนาโครงงานเรื่อง "การเพิ่มประสิทธิภาพการตรวจจับภาวะปอดอักเสบจากภาพเอกซเรย์ทรวงอกด้วยการลดสัญญาณรบกวนและปัญญาประดิษฐ์ที่อธิบายได้" (Enhancing Chest X-ray Infiltration Detection Using Noise Reduction and Explainable AI) เพื่อศึกษาและเปรียบเทียบผลกระทบของเทคนิคการลดสัญญาณรบกวนหลายระดับ (L1–L4) การแยกย่านความถี่ และการรวมเทคนิคเชิงความถี่ ต่อความแม่นยำของโมเดล CNN บนชุดข้อมูลมาตรฐาน 2 ชุด ได้แก่ NIH ChestX-ray14 (Wang et al., 2017) และ VinBigData Chest X-ray (Nguyen et al., 2022) ทั้งบนภาพต้นฉบับและภาพจำลองสัญญาณรบกวน 5 ตระกูล 3 ระดับความแรง ควบคู่กับการประเมินคุณภาพภาพ (PSNR และ SSIM) และการประเมินความถูกต้องของการชี้ตำแหน่งรอยโรคเชิงปริมาณ (Quantitative Localization Evaluation) ผ่านแผนภาพ Grad-CAM และ SHAP ด้วยตัวชี้วัด Pointing Game Hit Rate, Energy Inside Bounding Box และ IoU เทียบกับกรอบรอยโรคจริงของรังสีแพทย์ (Ground-Truth Bounding Box) ผลลัพธ์จากโครงงานนี้จะช่วยสร้างความเข้าใจถึงผลกระทบของการเตรียมภาพต่อความสามารถในการจำแนกและอธิบายผลของ AI ป้องกันปัญหา Over-smoothing และยกระดับความน่าเชื่อถือของระบบปัญญาประดิษฐ์สำหรับสนับสนุนการตัดสินใจทางการแพทย์ต่อไปในอนาคต</w:t>
       </w:r>
     </w:p>
     <w:p>
@@ -856,7 +856,7 @@
           <w:sz w:val="32"/>
           <w:szCs w:val="32"/>
         </w:rPr>
-        <w:t xml:space="preserve">3. วัตถุประสงค์​ของ​โครง​งาน</w:t>
+        <w:t xml:space="preserve">3. วัตถุประสงค์ของโครงงาน</w:t>
       </w:r>
     </w:p>
     <w:p>
@@ -882,7 +882,7 @@
           <w:sz w:val="28"/>
           <w:szCs w:val="28"/>
         </w:rPr>
-        <w:t xml:space="preserve">เพื่อ​ศึกษา​และ​เปรียบ​เทียบ​ประสิทธิภาพ​ของ​เทคนิค​การ​ลด​สัญญาณ​รบกวน​หลาย​ระดับ (L1–L4) ได้แก่ ภาพ​ดั้งเดิม (Baseline), Median Filter, CLAHE ร่วม​กับ DWT, Denoising Autoencoder (DAE) ร่วม​กับ CLAHE, การ​แยก​ย่าน​ความถี่​ด้วย DWT และ​การ​รวม​เทคนิค​เชิง​ความถี่ (Multi-view DWT L1–L4 Fusion และ DFT Low/Mid/High Fusion) ต่อ​ความ​สามารถ​ใน​การ​จำแนก​ภาวะ Infiltration บน​ชุด​ข้อมูล NIH ChestX-ray14 และ VinBigData</w:t>
+        <w:t xml:space="preserve">เพื่อศึกษาและเปรียบเทียบประสิทธิภาพของเทคนิคการลดสัญญาณรบกวนหลายระดับ (L1–L4) ได้แก่ ภาพดั้งเดิม (Baseline), Median Filter, CLAHE ร่วมกับ DWT, Denoising Autoencoder (DAE) ร่วมกับ CLAHE, การแยกย่านความถี่ด้วย DWT และการรวมเทคนิคเชิงความถี่ (Multi-view DWT L1–L4 Fusion และ DFT Low/Mid/High Fusion) ต่อความสามารถในการจำแนกภาวะ Infiltration บนชุดข้อมูล NIH ChestX-ray14 และ VinBigData</w:t>
       </w:r>
     </w:p>
     <w:p>
@@ -908,7 +908,7 @@
           <w:sz w:val="28"/>
           <w:szCs w:val="28"/>
         </w:rPr>
-        <w:t xml:space="preserve">เพื่อ​พัฒนา​และ​ฝึกสอน​แบบ​จำลอง​การ​เรียน​รู้​เชิง​ลึก (ResNet-50) ภาย​ใต้​เงื่อนไข​การ​ทดลอง​ที่​ควบคุม​อย่าง​เป็น​ธรรม (Fair Comparison) และ​ทดสอบ​ความ​ทนทาน (Robustness) ของ​แบบ​จำลอง​ทั้ง​บน​ภาพ​ต้นฉบับ​และ​ภาพ​จำลอง​สัญญาณ​รบกวน 5 ตระกูล (Gaussian, Poisson, Poisson–Gaussian, Salt-and-Pepper และ Speckle) ใน 3 ระดับ​ความ​แรง (N1–N3) รวม 16 สภาวะ</w:t>
+        <w:t xml:space="preserve">เพื่อพัฒนาและฝึกสอนแบบจำลองการเรียนรู้เชิงลึก (ResNet-50) ภายใต้เงื่อนไขการทดลองที่ควบคุมอย่างเป็นธรรม (Fair Comparison) และทดสอบความทนทาน (Robustness) ของแบบจำลองทั้งบนภาพต้นฉบับและภาพจำลองสัญญาณรบกวน 5 ตระกูล (Gaussian, Poisson, Poisson–Gaussian, Salt-and-Pepper และ Speckle) ใน 3 ระดับความแรง (N1–N3) รวม 16 สภาวะ</w:t>
       </w:r>
     </w:p>
     <w:p>
@@ -934,7 +934,7 @@
           <w:sz w:val="28"/>
           <w:szCs w:val="28"/>
         </w:rPr>
-        <w:t xml:space="preserve">เพื่อ​ประยุกต์​ใช้​เทคนิค​ปัญญา​ประดิษฐ์​ที่​อธิบาย​ได้ (Explainable AI: Grad-CAM และ SHAP) ใน​การ​แสดง​และ​วิเคราะห์​บริเวณ​รอย​โรค​ที่​ส่ง​ผล​ต่อ​การ​ตัดสิน​ใจ​ของ​แบบ​จำลอง</w:t>
+        <w:t xml:space="preserve">เพื่อประยุกต์ใช้เทคนิคปัญญาประดิษฐ์ที่อธิบายได้ (Explainable AI: Grad-CAM และ SHAP) ในการแสดงและวิเคราะห์บริเวณรอยโรคที่ส่งผลต่อการตัดสินใจของแบบจำลอง</w:t>
       </w:r>
     </w:p>
     <w:p>
@@ -960,7 +960,7 @@
           <w:sz w:val="28"/>
           <w:szCs w:val="28"/>
         </w:rPr>
-        <w:t xml:space="preserve">เพื่อ​ประเมิน​ผลก​ระ​ทบ​ของ​การ​ลด​สัญญาณ​รบกวน​ต่อ​ความ​แม่นยำ​ใน​การ​ระบุ​ตำแหน่ง​รอย​โรค​ของ XAI ใน​เชิง​ปริมาณ (Quantitative Localization Evaluation) ผ่าน​ตัว​ชี้​วัด Pointing Game Hit Rate, Energy Inside Bounding Box และ IoU เทียบ​กับ​พิกัด​รอย​โรค​จริง​ของ​รังสีแพทย์ (Ground-Truth Bounding Box)</w:t>
+        <w:t xml:space="preserve">เพื่อประเมินผลกระทบของการลดสัญญาณรบกวนต่อความแม่นยำในการระบุตำแหน่งรอยโรคของ XAI ในเชิงปริมาณ (Quantitative Localization Evaluation) ผ่านตัวชี้วัด Pointing Game Hit Rate, Energy Inside Bounding Box และ IoU เทียบกับพิกัดรอยโรคจริงของรังสีแพทย์ (Ground-Truth Bounding Box)</w:t>
       </w:r>
     </w:p>
     <w:p>
@@ -976,7 +976,7 @@
           <w:sz w:val="32"/>
           <w:szCs w:val="32"/>
         </w:rPr>
-        <w:t xml:space="preserve">4. ทฤษฎี​และ​ผล​งาน​วิจัย​ที่​เกี่ยวข้อง</w:t>
+        <w:t xml:space="preserve">4. ทฤษฎีและผลงานวิจัยที่เกี่ยวข้อง</w:t>
       </w:r>
     </w:p>
     <w:p>
@@ -993,7 +993,7 @@
           <w:sz w:val="28"/>
           <w:szCs w:val="28"/>
         </w:rPr>
-        <w:t xml:space="preserve">4.1 พยาธิ​สภาพ​ของ​ภาวะ​ฝ้า​ใน​ปอด (Pulmonary Infiltration)</w:t>
+        <w:t xml:space="preserve">4.1 พยาธิสภาพของภาวะฝ้าในปอด (Pulmonary Infiltration)</w:t>
       </w:r>
     </w:p>
     <w:p>
@@ -1008,7 +1008,7 @@
           <w:sz w:val="28"/>
           <w:szCs w:val="28"/>
         </w:rPr>
-        <w:t xml:space="preserve">ภาวะ Infiltration ทาง​รังสีวิทยา​มี​ลักษณะ​เป็น​ความ​ทึบ​แสง​ใน​เนื้อ​ปอด (Lung Parenchymal Opacity) เกิด​จาก​การ​ที่​อากาศ​ใน​ถุง​ลม​ปอด​ถูก​แทนที่​ด้วย​ของเหลว​หรือ​เซลล์​อักเสบ รอย​โรค​นี้​มี​ลักษณะ​สำคัญ​คือ​เป็น​ฝ้า​จาง ๆ กระจาย​ตัว (Diffuse, Ill-defined, Hazy Ground-glass Opacities) ไม่มี​ขอบเขต​ทรง​กลม​ชัดเจน​เหมือน​ก้อน​เนื้อ (Mass) หรือ​จุด​เดี่ยว (Nodule) ทำให้​การ​ตรวจ​จับ​ด้วย​คอมพิวเตอร์​มี​ความ​ท้าทาย​สูง โดย​เฉพาะ​เมื่อ​ภาพ​มี​สัญญาณ​รบกวน​ทาง​รังสี (Quantum Noise) หรือ​ถูก​บดบัง​ด้วย​กระดูก​ซี่โครง</w:t>
+        <w:t xml:space="preserve">ภาวะ Infiltration ทางรังสีวิทยามีลักษณะเป็นความทึบแสงในเนื้อปอด (Lung Parenchymal Opacity) เกิดจากการที่อากาศในถุงลมปอดถูกแทนที่ด้วยของเหลวหรือเซลล์อักเสบ รอยโรคนี้มีลักษณะสำคัญคือเป็นฝ้าจาง ๆ กระจายตัว (Diffuse, Ill-defined, Hazy Ground-glass Opacities) ไม่มีขอบเขตทรงกลมชัดเจนเหมือนก้อนเนื้อ (Mass) หรือจุดเดี่ยว (Nodule) ทำให้การตรวจจับด้วยคอมพิวเตอร์มีความท้าทายสูง โดยเฉพาะเมื่อภาพมีสัญญาณรบกวนทางรังสี (Quantum Noise) หรือถูกบดบังด้วยกระดูกซี่โครง</w:t>
       </w:r>
     </w:p>
     <w:p>
@@ -1025,7 +1025,7 @@
           <w:sz w:val="28"/>
           <w:szCs w:val="28"/>
         </w:rPr>
-        <w:t xml:space="preserve">4.2 สถาปัตยกรรม​โครง​ข่าย​ประสาท​เทียม​สำหรับ​การ​ประมวล​ผล​ภาพ​ทางการ​แพทย์</w:t>
+        <w:t xml:space="preserve">4.2 สถาปัตยกรรมโครงข่ายประสาทเทียมสำหรับการประมวลผลภาพทางการแพทย์</w:t>
       </w:r>
     </w:p>
     <w:p>
@@ -1050,7 +1050,7 @@
           <w:sz w:val="28"/>
           <w:szCs w:val="28"/>
         </w:rPr>
-        <w:t xml:space="preserve"> สถาปัตยกรรม Residual Network ที่​ใช้ Residual Connections (y = F(x) + x) ช่วย​ให้​สามารถ​ฝึก​โครง​ข่าย​ที่​มี​ความ​ลึก​สูง​ได้​โดย​ไม่​เกิด​ปัญหา Vanishing Gradient ใน​งาน​วิจัย​นี้​ถูก​ใช้​เป็น​โมเดล​หลัก (Fixed Backbone) โดย​เริ่ม​จาก​ค่าน้ำ​หนัก​ที่​ฝึก​ล่วง​หน้า​บน ImageNet เพื่อ​ควบคุม​ตัวแปร​ให้​เป็น Fair Comparison</w:t>
+        <w:t xml:space="preserve"> สถาปัตยกรรม Residual Network ที่ใช้ Residual Connections (y = F(x) + x) ช่วยให้สามารถฝึกโครงข่ายที่มีความลึกสูงได้โดยไม่เกิดปัญหา Vanishing Gradient ในงานวิจัยนี้ถูกใช้เป็นโมเดลหลัก (Fixed Backbone) โดยเริ่มจากค่าน้ำหนักที่ฝึกล่วงหน้าบน ImageNet เพื่อควบคุมตัวแปรให้เป็น Fair Comparison</w:t>
       </w:r>
     </w:p>
     <w:p>
@@ -1067,7 +1067,7 @@
           <w:sz w:val="28"/>
           <w:szCs w:val="28"/>
         </w:rPr>
-        <w:t xml:space="preserve">4.3 ชนิด​ของ​สัญญาณ​รบกวน​ใน​ภาพถ่าย​รังสี (Noise Families)</w:t>
+        <w:t xml:space="preserve">4.3 ชนิดของสัญญาณรบกวนในภาพถ่ายรังสี (Noise Families)</w:t>
       </w:r>
     </w:p>
     <w:p>
@@ -1082,7 +1082,7 @@
           <w:sz w:val="28"/>
           <w:szCs w:val="28"/>
         </w:rPr>
-        <w:t xml:space="preserve">สัญญาณ​รบกวน​ใน​ภาพ​เอกซเรย์​ทรวงอก​แบ่ง​ได้​เป็น 5 ตระกูล​หลัก​ตาม​แหล่ง​กำเนิด ซึ่ง​งาน​วิจัย​นี้​นำ​มา​ใช้​จำลอง​เพื่อ​ทดสอบ​ความ​ทนทาน​ของ​แบบ​จำลอง ดังนี้</w:t>
+        <w:t xml:space="preserve">สัญญาณรบกวนในภาพเอกซเรย์ทรวงอกแบ่งได้เป็น 5 ตระกูลหลักตามแหล่งกำเนิด ซึ่งงานวิจัยนี้นำมาใช้จำลองเพื่อทดสอบความทนทานของแบบจำลอง ดังนี้</w:t>
       </w:r>
     </w:p>
     <w:p>
@@ -1118,7 +1118,7 @@
           <w:sz w:val="28"/>
           <w:szCs w:val="28"/>
         </w:rPr>
-        <w:t xml:space="preserve"> สัญญาณ​รบกวน​แบบ​บวก (Additive) จาก​ความ​ร้อน​และ​วงจร​อิเล็กทรอนิกส์​ของ​ตัว​รับ​ภาพ มี​การก​ระ​จาย​แบบ​ปกติ กำหนด​ความ​แรง​ด้วย​ส่วน​เบี่ยง​เบน​มาตรฐาน σ</w:t>
+        <w:t xml:space="preserve"> สัญญาณรบกวนแบบบวก (Additive) จากความร้อนและวงจรอิเล็กทรอนิกส์ของตัวรับภาพ มีการกระจายแบบปกติ กำหนดความแรงด้วยส่วนเบี่ยงเบนมาตรฐาน σ</w:t>
       </w:r>
     </w:p>
     <w:p>
@@ -1154,7 +1154,7 @@
           <w:sz w:val="28"/>
           <w:szCs w:val="28"/>
         </w:rPr>
-        <w:t xml:space="preserve"> สัญญาณ​รบกวน​จาก​การก​ระ​จา​ย​ตัว​เชิง​สถิติ​ของ​จำ​นว​นโฟ​ตอน​รัง​สี​เอก​ซ์​ที่​ตกกระ​ทบ​ตัว​รับ​ภาพ ความ​แปรปรวน​แปรผัน​ตาม​ความ​เข้ม​ของ​สัญญาณ จึง​รุนแรง​ขึ้น​เมื่อ​ใช้​ปริมาณ​รังสี​ต่ำ</w:t>
+        <w:t xml:space="preserve"> สัญญาณรบกวนจากการกระจายตัวเชิงสถิติของจำนวนโฟตอนรังสีเอกซ์ที่ตกกระทบตัวรับภาพ ความแปรปรวนแปรผันตามความเข้มของสัญญาณ จึงรุนแรงขึ้นเมื่อใช้ปริมาณรังสีต่ำ</w:t>
       </w:r>
     </w:p>
     <w:p>
@@ -1190,7 +1190,7 @@
           <w:sz w:val="28"/>
           <w:szCs w:val="28"/>
         </w:rPr>
-        <w:t xml:space="preserve"> สัญญาณ​รบกวน​ผสม​ระหว่าง​ส่วน​ที่​ขึ้น​กับ​สัญญาณ (Poisson) และ​ส่วน​ที่​ไม่​ขึ้น​กับ​สัญญาณ (Gaussian) ซึ่ง​สะท้อน​พฤติกรรม​ของ​ตัว​รับ​ภาพ​ดิจิทัล​จริง​ได้​ใกล้​เคียง​ที่สุด (Foi et al., 2008)</w:t>
+        <w:t xml:space="preserve"> สัญญาณรบกวนผสมระหว่างส่วนที่ขึ้นกับสัญญาณ (Poisson) และส่วนที่ไม่ขึ้นกับสัญญาณ (Gaussian) ซึ่งสะท้อนพฤติกรรมของตัวรับภาพดิจิทัลจริงได้ใกล้เคียงที่สุด (Foi et al., 2008)</w:t>
       </w:r>
     </w:p>
     <w:p>
@@ -1226,7 +1226,7 @@
           <w:sz w:val="28"/>
           <w:szCs w:val="28"/>
         </w:rPr>
-        <w:t xml:space="preserve"> พิกเซล​ผิด​ปกติ​แบบ​จุด​ขาว​หรือ​จุด​ดำ​กระจาย​แบบ​สุ่ม เกิด​จาก​พิกเซล​ของ​ตัว​รับ​ภาพ​บกพร่อง​หรือ​ความ​ผิด​พลาด​ใน​การ​ส่ง​ข้อมูล</w:t>
+        <w:t xml:space="preserve"> พิกเซลผิดปกติแบบจุดขาวหรือจุดดำกระจายแบบสุ่ม เกิดจากพิกเซลของตัวรับภาพบกพร่องหรือความผิดพลาดในการส่งข้อมูล</w:t>
       </w:r>
     </w:p>
     <w:p>
@@ -1262,7 +1262,7 @@
           <w:sz w:val="28"/>
           <w:szCs w:val="28"/>
         </w:rPr>
-        <w:t xml:space="preserve"> สัญญาณ​รบกวน​แบบ​คูณ (Multiplicative Noise) ใน​รูป I(1 + n) ทำให้​ลวดลาย​ของ​เนื้อเยื่อ​ผิด​เพี้ยน​และ​ลด​ความ​เปรียบ​ต่าง​ของ​บริเวณ​ที่​มี​ความ​เข้ม​สูง</w:t>
+        <w:t xml:space="preserve"> สัญญาณรบกวนแบบคูณ (Multiplicative Noise) ในรูป I(1 + n) ทำให้ลวดลายของเนื้อเยื่อผิดเพี้ยนและลดความเปรียบต่างของบริเวณที่มีความเข้มสูง</w:t>
       </w:r>
     </w:p>
     <w:p>
@@ -1279,7 +1279,7 @@
           <w:sz w:val="28"/>
           <w:szCs w:val="28"/>
         </w:rPr>
-        <w:t xml:space="preserve">4.4 เทคนิค​การ​ลด​สัญญาณ​รบกวน​และ​การ​เพิ่ม​คุณภาพ​ของ​ภาพ (Image Denoising &amp; Enhancement)</w:t>
+        <w:t xml:space="preserve">4.4 เทคนิคการลดสัญญาณรบกวนและการเพิ่มคุณภาพของภาพ (Image Denoising &amp; Enhancement)</w:t>
       </w:r>
     </w:p>
     <w:p>
@@ -1304,7 +1304,7 @@
           <w:sz w:val="28"/>
           <w:szCs w:val="28"/>
         </w:rPr>
-        <w:t xml:space="preserve"> ตัว​กรอง​สถิติ​อันดับ​ที่​แทน​ค่า​พิกเซล​ด้วย​ค่า​มัธยฐาน​ใน​หน้าต่าง​พื้นที่ k × k ช่วย​ขจัด Impulse Noise ได้​ดี งาน​วิจัย​นี้​กำหนด​ขนาด Kernel เป็น 3×3 (L1), 5×5 (L2), 7×7 (L3) และ 9×9 (L4) เพื่อ​ศึกษา​จุดอิ่มตัว เนื่องจาก Chattopadhyay (2022) ระบุ​ว่า​หาก​ใช้​ขนาด Kernel ที่​ใหญ่​เกิน​ไป​จะ​ทำให้​เกิด Over-smoothing จน​ขอบเขต​เนื้อเยื่อ​ฝ้า​จาง ๆ สูญหาย</w:t>
+        <w:t xml:space="preserve"> ตัวกรองสถิติอันดับที่แทนค่าพิกเซลด้วยค่ามัธยฐานในหน้าต่างพื้นที่ k × k ช่วยขจัด Impulse Noise ได้ดี งานวิจัยนี้กำหนดขนาด Kernel เป็น 3×3 (L1), 5×5 (L2), 7×7 (L3) และ 9×9 (L4) เพื่อศึกษาจุดอิ่มตัว เนื่องจาก Chattopadhyay (2022) ระบุว่าหากใช้ขนาด Kernel ที่ใหญ่เกินไปจะทำให้เกิด Over-smoothing จนขอบเขตเนื้อเยื่อฝ้าจาง ๆ สูญหาย</w:t>
       </w:r>
     </w:p>
     <w:p>
@@ -1321,15 +1321,15 @@
           <w:sz w:val="28"/>
           <w:szCs w:val="28"/>
         </w:rPr>
-        <w:t xml:space="preserve">4.4.2 CLAHE ร่วม​กับ DWT และ​การ​แยก​ย่าน​ความถี่ (Chutia et al., 2024):</w:t>
-      </w:r>
-      <w:r>
-        <w:rPr>
-          <w:rFonts w:ascii="TH Sarabun New" w:cs="TH Sarabun New" w:eastAsia="TH Sarabun New" w:hAnsi="TH Sarabun New"/>
-          <w:sz w:val="28"/>
-          <w:szCs w:val="28"/>
-        </w:rPr>
-        <w:t xml:space="preserve"> การ​ใช้ Contrast Limited Adaptive Histogram Equalization (CLAHE) เพื่อ​ปรับ​ความ​เปรียบ​ต่าง​เฉพาะ​ที่ ควบคู่​กับ​การ​แปลง Discrete Wavelet Transform (DWT) ซึ่ง​แยก​ภาพ​ออก​เป็น​สัมประสิทธิ์​ความถี่​ต่ำ (Approximation: LL) และ​ความถี่​สูง (Detail: LH, HL, HH) แล้วก​รอง​สัมประสิทธิ์​ความถี่​สูง​ด้วย Soft Thresholding เมื่อ​แยก​ย่อย​หลาย​ระดับ (Multi-level Decomposition) จะ​ได้​ย่าน​ความถี่​ต่ำ (A3), ย่าน​ความถี่​กลาง (D3 และ D2) และ​ย่าน​ความถี่​สูง (D1) ซึ่ง​สามารถ​สังเคราะห์​ภาพ​กลับ​เฉพาะ​ย่าน​เพื่อ​วิเคราะห์​บทบาท​ของ​แต่ละ​ย่าน​ต่อ​การ​จำแนก​โรค​ได้ อย่างไร​ก็​ดี การ​สังเคราะห์​ภาพ​กลับ​อาจ​สร้าง​สัญญาณ​แปลก​ปลอม​บริเวณ​ขอบเขต​ภาพ (Boundary Ringing Artifacts)</w:t>
+        <w:t xml:space="preserve">4.4.2 CLAHE ร่วมกับ DWT และการแยกย่านความถี่ (Chutia et al., 2024):</w:t>
+      </w:r>
+      <w:r>
+        <w:rPr>
+          <w:rFonts w:ascii="TH Sarabun New" w:cs="TH Sarabun New" w:eastAsia="TH Sarabun New" w:hAnsi="TH Sarabun New"/>
+          <w:sz w:val="28"/>
+          <w:szCs w:val="28"/>
+        </w:rPr>
+        <w:t xml:space="preserve"> การใช้ Contrast Limited Adaptive Histogram Equalization (CLAHE) เพื่อปรับความเปรียบต่างเฉพาะที่ของภาพเอกซเรย์ปอด (Rahman et al., 2021) ควบคู่กับการแปลง Discrete Wavelet Transform (DWT) ซึ่งแยกภาพออกเป็นสัมประสิทธิ์ความถี่ต่ำ (Approximation: LL) และความถี่สูง (Detail: LH, HL, HH) แล้วกรองสัมประสิทธิ์ความถี่สูงด้วย Soft Thresholding เมื่อแยกย่อยหลายระดับ (Multi-level Decomposition) จะได้ย่านความถี่ต่ำ (A3), ย่านความถี่กลาง (D3 และ D2) และย่านความถี่สูง (D1) ซึ่งสามารถสังเคราะห์ภาพกลับเฉพาะย่านเพื่อวิเคราะห์บทบาทของแต่ละย่านต่อการจำแนกโรคได้ อย่างไรก็ดี การสังเคราะห์ภาพกลับอาจสร้างสัญญาณแปลกปลอมบริเวณขอบเขตภาพ (Boundary Ringing Artifacts)</w:t>
       </w:r>
     </w:p>
     <w:p>
@@ -1346,15 +1346,15 @@
           <w:sz w:val="28"/>
           <w:szCs w:val="28"/>
         </w:rPr>
-        <w:t xml:space="preserve">4.4.3 Deep Denoising Autoencoder ร่วม​กับ CLAHE (Thamilarasi et al., 2025):</w:t>
-      </w:r>
-      <w:r>
-        <w:rPr>
-          <w:rFonts w:ascii="TH Sarabun New" w:cs="TH Sarabun New" w:eastAsia="TH Sarabun New" w:hAnsi="TH Sarabun New"/>
-          <w:sz w:val="28"/>
-          <w:szCs w:val="28"/>
-        </w:rPr>
-        <w:t xml:space="preserve"> การ​ใช้​โครง​ข่าย Deep Autoencoder พร้อม Skip Connections ใน​การ​เรียน​รู้​การก​ระ​จา​ย​ตัว​ของ​สัญญาณ​รบกวน​ทาง​รังสี​เอกซเรย์​ปอด​โดย​เฉพาะ โดย​ใช้​ภาพ​ที่​เติม​สัญญาณ​รบกวน​เป็น​ข้อมูล​นำ​เข้า​และ​ภาพ​ก่อน​เติม​เป็น​เป้า​หมาย ทำให้​สามารถ​กำจัด Noise ได้​โดย​คง​โครงสร้าง​ทาง​กายวิภาค​และ​เนื้อเยื่อ​ฝ้า​ไว้ จาก​นั้น​จึง​ปรับ​ความ​เปรียบ​ต่าง​เฉพาะ​ที่​ด้วย CLAHE</w:t>
+        <w:t xml:space="preserve">4.4.3 Deep Denoising Autoencoder ร่วมกับ CLAHE (Thamilarasi et al., 2025):</w:t>
+      </w:r>
+      <w:r>
+        <w:rPr>
+          <w:rFonts w:ascii="TH Sarabun New" w:cs="TH Sarabun New" w:eastAsia="TH Sarabun New" w:hAnsi="TH Sarabun New"/>
+          <w:sz w:val="28"/>
+          <w:szCs w:val="28"/>
+        </w:rPr>
+        <w:t xml:space="preserve"> การใช้โครงข่าย Deep Autoencoder พร้อม Skip Connections ในการเรียนรู้การกระจายตัวของสัญญาณรบกวนและการปรับปรุงคุณภาพภาพเอกซเรย์ปอดโดยเฉพาะ (Song et al., 2025) โดยใช้ภาพที่เติมสัญญาณรบกวนเป็นข้อมูลนำเข้าและภาพก่อนเติมเป็นเป้าหมาย ทำให้สามารถกำจัด Noise ได้โดยคงโครงสร้างทางกายวิภาคและเนื้อเยื่อฝ้าไว้ จากนั้นจึงปรับความเปรียบต่างเฉพาะที่ด้วย CLAHE</w:t>
       </w:r>
     </w:p>
     <w:p>
@@ -1371,15 +1371,15 @@
           <w:sz w:val="28"/>
           <w:szCs w:val="28"/>
         </w:rPr>
-        <w:t xml:space="preserve">4.4.4 การ​แป​ลง​ฟู​เรียร์​แบบ​ไม่​ต่อ​เนื่อง​และ​การ​รวม​หลาย​มุม​มอง (DFT &amp; Multi-view Fusion):</w:t>
-      </w:r>
-      <w:r>
-        <w:rPr>
-          <w:rFonts w:ascii="TH Sarabun New" w:cs="TH Sarabun New" w:eastAsia="TH Sarabun New" w:hAnsi="TH Sarabun New"/>
-          <w:sz w:val="28"/>
-          <w:szCs w:val="28"/>
-        </w:rPr>
-        <w:t xml:space="preserve"> การ​แปลง Discrete Fourier Transform สอง​มิติ​แปลง​ภาพ​ไป​อยู่​ใน​โดเมน​ความถี่ จาก​นั้น​ใช้​หน้ากาก​ความถี่​แบบ​รัศมี (Radial Mask) แยก​เป็น​ย่าน​ความถี่​ต่ำ (&lt; 0.125 cycles/pixel), กลาง (0.125–0.25 cycles/pixel) และ​สูง (&gt; 0.25 cycles/pixel) แล้ว​แปลง​กลับ​เป็น​ภาพ​แต่ละ​ย่าน ภาพ​จาก​แต่ละ​ย่าน (หรือ​จาก​การ​แยก DWT แต่ละ​ระดับ) ถือ​เป็น "มุม​มอง" (View) ของ​ภาพ​เดียวกัน การ​รวม​หลาย​มุม​มอง​เข้า​ด้วย​กัน​ก่อน​การ​ตัดสิน​ใจ​ของ ResNet-50 (Multi-view Fusion) ช่วย​ให้​แบบ​จำลอง​เข้า​ถึง​ทั้ง​โครงสร้าง​รวม​ความถี่​ต่ำ​และ​ราย​ละเอียด​ขอบ​ความถี่​สูง​ได้​พร้อม​กัน</w:t>
+        <w:t xml:space="preserve">4.4.4 การแปลงฟูเรียร์แบบไม่ต่อเนื่องและการรวมหลายมุมมอง (DFT &amp; Multi-view Fusion):</w:t>
+      </w:r>
+      <w:r>
+        <w:rPr>
+          <w:rFonts w:ascii="TH Sarabun New" w:cs="TH Sarabun New" w:eastAsia="TH Sarabun New" w:hAnsi="TH Sarabun New"/>
+          <w:sz w:val="28"/>
+          <w:szCs w:val="28"/>
+        </w:rPr>
+        <w:t xml:space="preserve"> การแปลง Discrete Fourier Transform สองมิติแปลงภาพไปอยู่ในโดเมนความถี่ จากนั้นใช้หน้ากากความถี่แบบรัศมี (Radial Mask) แยกเป็นย่านความถี่ต่ำ (&lt; 0.125 cycles/pixel), กลาง (0.125–0.25 cycles/pixel) และสูง (&gt; 0.25 cycles/pixel) แล้วแปลงกลับเป็นภาพแต่ละย่าน ภาพจากแต่ละย่าน (หรือจากการแยก DWT แต่ละระดับ) ถือเป็น "มุมมอง" (View) ของภาพเดียวกัน การรวมหลายมุมมองเข้าด้วยกันก่อนการตัดสินใจของ ResNet-50 (Multi-view Fusion) ช่วยให้แบบจำลองเข้าถึงทั้งโครงสร้างรวมความถี่ต่ำและรายละเอียดขอบความถี่สูงได้พร้อมกัน</w:t>
       </w:r>
     </w:p>
     <w:p>
@@ -1396,7 +1396,7 @@
           <w:sz w:val="28"/>
           <w:szCs w:val="28"/>
         </w:rPr>
-        <w:t xml:space="preserve">4.5 ปัญญา​ประดิษฐ์​ที่​อธิบาย​ได้ (Explainable AI: XAI)</w:t>
+        <w:t xml:space="preserve">4.5 ปัญญาประดิษฐ์ที่อธิบายได้ (Explainable AI: XAI)</w:t>
       </w:r>
     </w:p>
     <w:p>
@@ -1421,7 +1421,7 @@
           <w:sz w:val="28"/>
           <w:szCs w:val="28"/>
         </w:rPr>
-        <w:t xml:space="preserve"> ใช้ Gradient ของ​คะแนน​คลาส​เป้า​หมาย​เทียบ​กับ Feature Map ใน Convolutional Layer สุดท้าย​เพื่อ​ถ่วง​น้ำ​หนัก​ความ​สำคัญ​เชิง​พื้นที่</w:t>
+        <w:t xml:space="preserve"> ใช้ Gradient ของคะแนนคลาสเป้าหมายเทียบกับ Feature Map ใน Convolutional Layer สุดท้ายเพื่อถ่วงน้ำหนักความสำคัญเชิงพื้นที่</w:t>
       </w:r>
     </w:p>
     <w:p>
@@ -1446,7 +1446,7 @@
           <w:sz w:val="28"/>
           <w:szCs w:val="28"/>
         </w:rPr>
-        <w:t xml:space="preserve"> การ​ประยุกต์​ใช้​ทฤษฎี​เกม​เพื่อ​คำนวณ​ค่า Shapley Value ใน​ระดับ​พิกเซล ทำให้​สามารถ​แยกแยะ​ระหว่าง​พิกเซล​ที่​สนับสนุน​การ​เกิด​โรค (Positive Attribution) กับ​พิกเซล​ที่​สนับสนุน​ว่า​ปอด​ปกติ (Negative Attribution) ได้​อย่าง​ละเอียด</w:t>
+        <w:t xml:space="preserve"> การประยุกต์ใช้ทฤษฎีเกมเพื่อคำนวณค่า Shapley Value ในระดับพิกเซล ทำให้สามารถแยกแยะระหว่างพิกเซลที่สนับสนุนการเกิดโรค (Positive Attribution) กับพิกเซลที่สนับสนุนว่าปอดปกติ (Negative Attribution) ได้อย่างละเอียด</w:t>
       </w:r>
     </w:p>
     <w:p>
@@ -1463,7 +1463,7 @@
           <w:sz w:val="28"/>
           <w:szCs w:val="28"/>
         </w:rPr>
-        <w:t xml:space="preserve">4.6 ตัว​ชี้​วัด​คุณภาพ​ของ​ภาพ (Image Quality Metrics)</w:t>
+        <w:t xml:space="preserve">4.6 ตัวชี้วัดคุณภาพของภาพ (Image Quality Metrics)</w:t>
       </w:r>
     </w:p>
     <w:p>
@@ -1478,7 +1478,7 @@
           <w:sz w:val="28"/>
           <w:szCs w:val="28"/>
         </w:rPr>
-        <w:t xml:space="preserve">Peak Signal-to-Noise Ratio (PSNR) วัด​ความ​เที่ยง​ตรง​ของ​สัญญาณ​ภาพ​เทียบ​กับ​ภาพ​อ้างอิง​ใน​หน่วย​เดซิ​เบล ส่วน Structural Similarity Index (SSIM) วัด​ความ​คล้ายคลึง​เชิง​โครงสร้าง ความ​สว่าง และ​ความ​เปรียบ​ต่าง​ระหว่าง​ภาพ (Wang et al., 2004) อย่างไร​ก็ตาม ค่า​ทั้ง​สอง​สะท้อน​ความ​ใกล้​เคียง​กับ​ภาพ​อ้างอิง​ทาง​สถิติ ซึ่ง​ไม่​จำเป็น​ต้อง​สอดคล้อง​กับ​ความ​สามารถ​ใน​การ​จำแนก​โรค​ของ​แบบ​จำลอง​เสมอ​ไป</w:t>
+        <w:t xml:space="preserve">Peak Signal-to-Noise Ratio (PSNR) วัดความเที่ยงตรงของสัญญาณภาพเทียบกับภาพอ้างอิงในหน่วยเดซิเบล ส่วน Structural Similarity Index (SSIM) วัดความคล้ายคลึงเชิงโครงสร้าง ความสว่าง และความเปรียบต่างระหว่างภาพ (Wang et al., 2004) อย่างไรก็ตาม ค่าทั้งสองสะท้อนความใกล้เคียงกับภาพอ้างอิงทางสถิติ ซึ่งไม่จำเป็นต้องสอดคล้องกับความสามารถในการจำแนกโรคของแบบจำลองเสมอไป</w:t>
       </w:r>
     </w:p>
     <w:p>
@@ -1494,7 +1494,7 @@
           <w:sz w:val="32"/>
           <w:szCs w:val="32"/>
         </w:rPr>
-        <w:t xml:space="preserve">5. วิธี​ดำเนิน​การ​วิจัย</w:t>
+        <w:t xml:space="preserve">5. วิธีดำเนินการวิจัย</w:t>
       </w:r>
     </w:p>
     <w:p>
@@ -1511,7 +1511,7 @@
           <w:sz w:val="28"/>
           <w:szCs w:val="28"/>
         </w:rPr>
-        <w:t xml:space="preserve">5.1 การ​จัดหา​และ​คัด​เลือก​ชุด​ข้อมูล​ทางการ​แพทย์ (Dataset Acquisition &amp; Integrity)</w:t>
+        <w:t xml:space="preserve">5.1 การจัดหาและคัดเลือกชุดข้อมูลทางการแพทย์ (Dataset Acquisition &amp; Integrity)</w:t>
       </w:r>
     </w:p>
     <w:p>
@@ -1526,7 +1526,7 @@
           <w:sz w:val="28"/>
           <w:szCs w:val="28"/>
         </w:rPr>
-        <w:t xml:space="preserve">งาน​วิจัย​นี้​ศึกษา​บน​ชุด​ข้อมูล​มาตรฐาน 2 ชุด เพื่อ​ตรวจ​สอบ​ความ​สอดคล้อง​ของ​แนว​โน้ม​ผลลัพธ์​ข้าม​ชุด​ข้อมูล (Cross-dataset Validation) ดังนี้</w:t>
+        <w:t xml:space="preserve">งานวิจัยนี้ศึกษาบนชุดข้อมูลมาตรฐาน 2 ชุด เพื่อตรวจสอบความสอดคล้องของแนวโน้มผลลัพธ์ข้ามชุดข้อมูล (Cross-dataset Validation) ดังนี้</w:t>
       </w:r>
     </w:p>
     <w:p>
@@ -1554,15 +1554,15 @@
           <w:sz w:val="28"/>
           <w:szCs w:val="28"/>
         </w:rPr>
-        <w:t xml:space="preserve">ชุด​ข้อมูล NIH ChestX-ray14</w:t>
-      </w:r>
-      <w:r>
-        <w:rPr>
-          <w:rFonts w:ascii="TH Sarabun New" w:cs="TH Sarabun New" w:eastAsia="TH Sarabun New" w:hAnsi="TH Sarabun New"/>
-          <w:sz w:val="28"/>
-          <w:szCs w:val="28"/>
-        </w:rPr>
-        <w:t xml:space="preserve"> (Wang et al., 2017) จำนวน​รวม 112,120 ภาพ จาก​ผู้​ป่วย 30,805 คน</w:t>
+        <w:t xml:space="preserve">ชุดข้อมูล NIH ChestX-ray14</w:t>
+      </w:r>
+      <w:r>
+        <w:rPr>
+          <w:rFonts w:ascii="TH Sarabun New" w:cs="TH Sarabun New" w:eastAsia="TH Sarabun New" w:hAnsi="TH Sarabun New"/>
+          <w:sz w:val="28"/>
+          <w:szCs w:val="28"/>
+        </w:rPr>
+        <w:t xml:space="preserve"> (Wang et al., 2017) จำนวนรวม 112,120 ภาพ จากผู้ป่วย 30,805 คน</w:t>
       </w:r>
     </w:p>
     <w:p>
@@ -1588,7 +1588,7 @@
           <w:sz w:val="28"/>
           <w:szCs w:val="28"/>
         </w:rPr>
-        <w:t xml:space="preserve">Positive Class: ภาพ​ที่​มี​ฉลาก​ภาวะ Infiltration</w:t>
+        <w:t xml:space="preserve">Positive Class: ภาพที่มีฉลากภาวะ Infiltration</w:t>
       </w:r>
     </w:p>
     <w:p>
@@ -1614,7 +1614,7 @@
           <w:sz w:val="28"/>
           <w:szCs w:val="28"/>
         </w:rPr>
-        <w:t xml:space="preserve">Negative Class: ภาพ​ที่​มี​ฉลาก No Finding เท่านั้น (ไม่​นำ​ภาพ​ที่​มี​โรค​แทรกซ้อน​อื่น เช่น Effusion หรือ Atelectasis มา​รวม เพื่อ​ป้องกัน​ไม่​ให้​โมเดล​เรียน​รู้​ฟีเจอร์​พยาธิ​สภาพ​อื่น​ปะปน)</w:t>
+        <w:t xml:space="preserve">Negative Class: ภาพที่มีฉลาก No Finding เท่านั้น (ไม่นำภาพที่มีโรคแทรกซ้อนอื่น เช่น Effusion หรือ Atelectasis มารวม เพื่อป้องกันไม่ให้โมเดลเรียนรู้ฟีเจอร์พยาธิสภาพอื่นปะปน)</w:t>
       </w:r>
     </w:p>
     <w:p>
@@ -1640,7 +1640,7 @@
           <w:sz w:val="28"/>
           <w:szCs w:val="28"/>
         </w:rPr>
-        <w:t xml:space="preserve">ตรึง​การ​แบ่ง​ชุด​ข้อมูล​ตาม train_val_list.txt และ test_list.txt ของ NIH ซึ่ง​เป็นการ​แบ่ง​ระดับ​ผู้​ป่วย (Patient-level Split) เพื่อ​ป้องกัน​ปัญหา Data Leakage</w:t>
+        <w:t xml:space="preserve">ตรึงการแบ่งชุดข้อมูลตาม train_val_list.txt และ test_list.txt ของ NIH ซึ่งเป็นการแบ่งระดับผู้ป่วย (Patient-level Split) เพื่อป้องกันปัญหา Data Leakage</w:t>
       </w:r>
     </w:p>
     <w:p>
@@ -1666,7 +1666,7 @@
           <w:sz w:val="28"/>
           <w:szCs w:val="28"/>
         </w:rPr>
-        <w:t xml:space="preserve">การ​ทดลอง​ที่ 1 ใช้​ชุด​ฝึกสอน 400 ภาพ (Infiltration 200 ภาพ, No Finding 200 ภาพ) ชุด​ตรวจ​สอบ (Validation) 80 ภาพ และ​ชุด​ทดสอบ​แบบ​สมดุล (Balanced Test Subset) 100 ภาพ (Infiltration 50 ภาพ, No Finding 50 ภาพ)</w:t>
+        <w:t xml:space="preserve">การทดลองที่ 1 ใช้ชุดฝึกสอน 400 ภาพ (Infiltration 200 ภาพ, No Finding 200 ภาพ) ชุดตรวจสอบ (Validation) 80 ภาพ และชุดทดสอบแบบสมดุล (Balanced Test Subset) 100 ภาพ (Infiltration 50 ภาพ, No Finding 50 ภาพ)</w:t>
       </w:r>
     </w:p>
     <w:p>
@@ -1692,7 +1692,7 @@
           <w:sz w:val="28"/>
           <w:szCs w:val="28"/>
         </w:rPr>
-        <w:t xml:space="preserve">การ​ทดลอง​ที่ 2 วัด​ระดับ​สัญญาณ​รบกวน​เดิม​ของ​ภาพ​ด้วย​วิธี Wavelet MAD (db2) บน​ภาพ​ต้นฉบับ 70,012 ภาพ แล้ว​คัด​ภาพ​ที่​มี​สัญญาณ​รบกวน​เดิม​ต่ำ​ที่สุด​แยก​ตาม​คลาส​และ​ชุด​ข้อมูล ได้​ชุด​ฝึกสอน 320 ภาพ (คลาส​ละ 160 ภาพ) ชุด​ตรวจ​สอบ 80 ภาพ และ​ชุด​ทดสอบ 100 ภาพ (จาก​ผู้​ป่วย 56 ราย) เพื่อ​ให้​ภาพ​อ้างอิง​สะอาด​พอ​สำหรับ​การ​เติม​สัญญาณ​รบกวน​จำลอง</w:t>
+        <w:t xml:space="preserve">การทดลองที่ 2 วัดระดับสัญญาณรบกวนเดิมของภาพด้วยวิธี Wavelet MAD (db2) บนภาพต้นฉบับ 70,012 ภาพ แล้วคัดภาพที่มีสัญญาณรบกวนเดิมต่ำที่สุดแยกตามคลาสและชุดข้อมูล ได้ชุดฝึกสอน 320 ภาพ (คลาสละ 160 ภาพ) ชุดตรวจสอบ 80 ภาพ และชุดทดสอบ 100 ภาพ (จากผู้ป่วย 56 ราย) เพื่อให้ภาพอ้างอิงสะอาดพอสำหรับการเติมสัญญาณรบกวนจำลอง</w:t>
       </w:r>
     </w:p>
     <w:p>
@@ -1720,15 +1720,15 @@
           <w:sz w:val="28"/>
           <w:szCs w:val="28"/>
         </w:rPr>
-        <w:t xml:space="preserve">ชุด​ข้อมูล VinBigData Chest X-ray (ขนาด 512×512)</w:t>
-      </w:r>
-      <w:r>
-        <w:rPr>
-          <w:rFonts w:ascii="TH Sarabun New" w:cs="TH Sarabun New" w:eastAsia="TH Sarabun New" w:hAnsi="TH Sarabun New"/>
-          <w:sz w:val="28"/>
-          <w:szCs w:val="28"/>
-        </w:rPr>
-        <w:t xml:space="preserve"> (Nguyen et al., 2022) ซึ่ง​มี​รอย​โรค​ชัดเจน​และ​ฉลาก​จาก​รังสีแพทย์</w:t>
+        <w:t xml:space="preserve">ชุดข้อมูล VinBigData Chest X-ray (ขนาด 512×512)</w:t>
+      </w:r>
+      <w:r>
+        <w:rPr>
+          <w:rFonts w:ascii="TH Sarabun New" w:cs="TH Sarabun New" w:eastAsia="TH Sarabun New" w:hAnsi="TH Sarabun New"/>
+          <w:sz w:val="28"/>
+          <w:szCs w:val="28"/>
+        </w:rPr>
+        <w:t xml:space="preserve"> (Nguyen et al., 2022) ซึ่งมีรอยโรคชัดเจนและฉลากจากรังสีแพทย์</w:t>
       </w:r>
     </w:p>
     <w:p>
@@ -1754,7 +1754,7 @@
           <w:sz w:val="28"/>
           <w:szCs w:val="28"/>
         </w:rPr>
-        <w:t xml:space="preserve">Positive Class: ภาพ​ที่​มี​การ​ระบุ​รอย​โรค Infiltration (รวม​ภาพ​ที่​มี​โรค​ร่วม) และ Negative Class: ภาพ​ที่​ไม่​พบ​ความ​ผิด​ปกติ (No Finding)</w:t>
+        <w:t xml:space="preserve">Positive Class: ภาพที่มีการระบุรอยโรค Infiltration (รวมภาพที่มีโรคร่วม) และ Negative Class: ภาพที่ไม่พบความผิดปกติ (No Finding)</w:t>
       </w:r>
     </w:p>
     <w:p>
@@ -1780,7 +1780,7 @@
           <w:sz w:val="28"/>
           <w:szCs w:val="28"/>
         </w:rPr>
-        <w:t xml:space="preserve">คัด​เลือก​ใน​สัดส่วน​เดียว​กับ NIH คือ การ​ทดลอง​ที่ 1 ใช้ Train 400 ภาพ, Validation 80 ภาพ และ Balanced Test Subset 100 ภาพ ส่วน​การ​ทดลอง​ที่ 2 ใช้ Train 320 ภาพ, Validation 80 ภาพ และ Test 100 ภาพ</w:t>
+        <w:t xml:space="preserve">คัดเลือกในสัดส่วนเดียวกับ NIH คือ การทดลองที่ 1 ใช้ Train 400 ภาพ, Validation 80 ภาพ และ Balanced Test Subset 100 ภาพ ส่วนการทดลองที่ 2 ใช้ Train 320 ภาพ, Validation 80 ภาพ และ Test 100 ภาพ</w:t>
       </w:r>
     </w:p>
     <w:p>
@@ -1806,7 +1806,7 @@
           <w:sz w:val="28"/>
           <w:szCs w:val="28"/>
         </w:rPr>
-        <w:t xml:space="preserve">คัด​เลือก​ชุด​ทดสอบ​สำหรับ​การ​ประเมิน XAI ที่​มี​กรอบ Ground-Truth Bounding Box จาก​รังสีแพทย์ เพื่อ​ใช้​ใน​การ​ประเมิน​เชิง​ปริมาณ​ใน​ระยะ​ถัด​ไป</w:t>
+        <w:t xml:space="preserve">คัดเลือกชุดทดสอบสำหรับการประเมิน XAI ที่มีกรอบ Ground-Truth Bounding Box จากรังสีแพทย์ เพื่อใช้ในการประเมินเชิงปริมาณในระยะถัดไป</w:t>
       </w:r>
     </w:p>
     <w:p>
@@ -1823,7 +1823,7 @@
           <w:sz w:val="28"/>
           <w:szCs w:val="28"/>
         </w:rPr>
-        <w:t xml:space="preserve">5.2 การเต​รี​ยม​และ​การ​ปรับ​สภาพ​ข้อมูล​ภาพ (Data Preprocessing)</w:t>
+        <w:t xml:space="preserve">5.2 การเตรียมและการปรับสภาพข้อมูลภาพ (Data Preprocessing)</w:t>
       </w:r>
     </w:p>
     <w:p>
@@ -1851,15 +1851,15 @@
           <w:sz w:val="28"/>
           <w:szCs w:val="28"/>
         </w:rPr>
-        <w:t xml:space="preserve">การ​ปรับ​ขนาด​ภาพ:</w:t>
-      </w:r>
-      <w:r>
-        <w:rPr>
-          <w:rFonts w:ascii="TH Sarabun New" w:cs="TH Sarabun New" w:eastAsia="TH Sarabun New" w:hAnsi="TH Sarabun New"/>
-          <w:sz w:val="28"/>
-          <w:szCs w:val="28"/>
-        </w:rPr>
-        <w:t xml:space="preserve"> ปรับ​ขนาด​ภาพ​จาก 1024×1024 พิกเซล (NIH) หรือ 512×512 พิกเซล (VinBigData) เป็น 256×256 พิกเซล​สำหรับ​ขั้น​ตอน​ลด​สัญญาณ​รบกวน และ 224×224 พิกเซล​สำหรับ​ป้อน​เข้า ResNet-50 พร้อม Normalize ด้วย​ค่า​เฉลี่ย​และ​ส่วน​เบี่ยง​เบน​มาตรฐาน​ของ ImageNet เพื่อ​ลด​ภาระ​การ​คำนวณ​และ​หน่วย​ความ​จำ</w:t>
+        <w:t xml:space="preserve">การปรับขนาดภาพ:</w:t>
+      </w:r>
+      <w:r>
+        <w:rPr>
+          <w:rFonts w:ascii="TH Sarabun New" w:cs="TH Sarabun New" w:eastAsia="TH Sarabun New" w:hAnsi="TH Sarabun New"/>
+          <w:sz w:val="28"/>
+          <w:szCs w:val="28"/>
+        </w:rPr>
+        <w:t xml:space="preserve"> ปรับขนาดภาพจาก 1024×1024 พิกเซล (NIH) หรือ 512×512 พิกเซล (VinBigData) เป็น 256×256 พิกเซลสำหรับขั้นตอนลดสัญญาณรบกวน และ 224×224 พิกเซลสำหรับป้อนเข้า ResNet-50 พร้อม Normalize ด้วยค่าเฉลี่ยและส่วนเบี่ยงเบนมาตรฐานของ ImageNet เพื่อลดภาระการคำนวณและหน่วยความจำ</w:t>
       </w:r>
     </w:p>
     <w:p>
@@ -1887,15 +1887,15 @@
           <w:sz w:val="28"/>
           <w:szCs w:val="28"/>
         </w:rPr>
-        <w:t xml:space="preserve">การ​กำหนด​สัญญา​ข้อมูล​ภาพ (Image Contract):</w:t>
-      </w:r>
-      <w:r>
-        <w:rPr>
-          <w:rFonts w:ascii="TH Sarabun New" w:cs="TH Sarabun New" w:eastAsia="TH Sarabun New" w:hAnsi="TH Sarabun New"/>
-          <w:sz w:val="28"/>
-          <w:szCs w:val="28"/>
-        </w:rPr>
-        <w:t xml:space="preserve"> กำหนด​ให้​ภาพ​อยู่​ใน​รูป​แบบ​อาร์เรย์ NumPy สอง​มิติ ชนิด​ข้อมูล uint8 และ​มี​ค่า​ความ​สว่าง​ใน​ช่วง [0, 255] เพื่อ​ให้​ทุก​เทคนิค​การ​ปรับ​ภาพ​รับ​และ​ส่ง​ข้อมูล​ด้วย​มาตรฐาน​เดียวกัน ลด​ข้อ​ผิด​พลาด​จาก​ความ​แตก​ต่าง​ของ​ชนิด​ข้อมูล จำนวน​มิติ และ​ช่วง​ค่า​ความ​สว่าง ส่ง​ผล​ให้​กระบวนการ​ประมวล​ผล​มี​ความ​สม่ำเสมอ ตรวจ​สอบ​ได้ และ​ทำ​ซ้ำ​ได้</w:t>
+        <w:t xml:space="preserve">การกำหนดสัญญาข้อมูลภาพ (Image Contract):</w:t>
+      </w:r>
+      <w:r>
+        <w:rPr>
+          <w:rFonts w:ascii="TH Sarabun New" w:cs="TH Sarabun New" w:eastAsia="TH Sarabun New" w:hAnsi="TH Sarabun New"/>
+          <w:sz w:val="28"/>
+          <w:szCs w:val="28"/>
+        </w:rPr>
+        <w:t xml:space="preserve"> กำหนดให้ภาพอยู่ในรูปแบบอาร์เรย์ NumPy สองมิติ ชนิดข้อมูล uint8 และมีค่าความสว่างในช่วง [0, 255] เพื่อให้ทุกเทคนิคการปรับภาพรับและส่งข้อมูลด้วยมาตรฐานเดียวกัน ลดข้อผิดพลาดจากความแตกต่างของชนิดข้อมูล จำนวนมิติ และช่วงค่าความสว่าง ส่งผลให้กระบวนการประมวลผลมีความสม่ำเสมอ ตรวจสอบได้ และทำซ้ำได้</w:t>
       </w:r>
     </w:p>
     <w:p>
@@ -1912,7 +1912,7 @@
           <w:sz w:val="28"/>
           <w:szCs w:val="28"/>
         </w:rPr>
-        <w:t xml:space="preserve">5.3 การ​ทดลอง​และ​เปรียบ​เทียบ​เทคนิค​การ​ลด​สัญญาณ​รบกวน​และ​การ​รวม​เทคนิค</w:t>
+        <w:t xml:space="preserve">5.3 การทดลองและเปรียบเทียบเทคนิคการลดสัญญาณรบกวนและการรวมเทคนิค</w:t>
       </w:r>
     </w:p>
     <w:p>
@@ -1927,7 +1927,7 @@
           <w:sz w:val="28"/>
           <w:szCs w:val="28"/>
         </w:rPr>
-        <w:t xml:space="preserve">กำหนดการ​ทดลอง​เป็น 2 การ​ทดลอง​หลัก โดย​ใช้​ภาพ​ดิบ​ที่​ไม่​ผ่าน​การ​ลด​สัญญาณ​รบกวน​เป็น Baseline ใน​ทุก​การ​ทดลอง เพื่อ​ตรวจ​สอบ​ว่า​เทคนิค​ที่​เลือก​ช่วย​ให้​ผล​ดี​ขึ้น​จาก​ภาพ​ต้นฉบับ​หรือ​ไม่ ทั้งนี้ ระดับ L1–L4 เป็น​เงื่อนไข​ของ​งาน​วิจัย​นี้​ที่​ใช้​ศึกษา​ผล​ของ​การ​เพิ่ม​ความ​แรง​ภายใน​แต่ละ​เทคนิค ไม่​ได้​หมาย​ถึง​ความ​แรง​ที่​เทียบ​เท่า​กัน​ระหว่าง​เทคนิค</w:t>
+        <w:t xml:space="preserve">กำหนดการทดลองเป็น 2 การทดลองหลัก โดยใช้ภาพดิบที่ไม่ผ่านการลดสัญญาณรบกวนเป็น Baseline ในทุกการทดลอง เพื่อตรวจสอบว่าเทคนิคที่เลือกช่วยให้ผลดีขึ้นจากภาพต้นฉบับหรือไม่ ทั้งนี้ ระดับ L1–L4 เป็นเงื่อนไขของงานวิจัยนี้ที่ใช้ศึกษาผลของการเพิ่มความแรงภายในแต่ละเทคนิค ไม่ได้หมายถึงความแรงที่เทียบเท่ากันระหว่างเทคนิค</w:t>
       </w:r>
     </w:p>
     <w:p>
@@ -1944,7 +1944,7 @@
           <w:sz w:val="28"/>
           <w:szCs w:val="28"/>
         </w:rPr>
-        <w:t xml:space="preserve">การ​ทดลอง​ที่ 1: การ​เปรียบ​เทียบ​วิธี​ลด​สัญญาณ​รบกวน​ระดับ L1–L4 และ​การ​แยก​ย่าน​ความถี่​บน​ภาพ​ต้นฉบับ (21 สภาวะ)</w:t>
+        <w:t xml:space="preserve">การทดลองที่ 1: การเปรียบเทียบวิธีลดสัญญาณรบกวนระดับ L1–L4 และการแยกย่านความถี่บนภาพต้นฉบับ (21 สภาวะ)</w:t>
       </w:r>
     </w:p>
     <w:p>
@@ -1959,7 +1959,7 @@
           <w:sz w:val="28"/>
           <w:szCs w:val="28"/>
         </w:rPr>
-        <w:t xml:space="preserve">ฝึกสอน ResNet-50 แยก​กัน 1 แบบ​จำลอง​ต่อ 1 สภาวะ รวม 21 สภาวะ (Baseline 1 สภาวะ และ​วิธี​ลด​สัญญาณ​รบกวน 20 สภาวะ) แบ่ง​เป็น 6 กลุ่ม ดัง​ตาราง​ที่ 1</w:t>
+        <w:t xml:space="preserve">ฝึกสอน ResNet-50 แยกกัน 1 แบบจำลองต่อ 1 สภาวะ รวม 21 สภาวะ (Baseline 1 สภาวะ และวิธีลดสัญญาณรบกวน 20 สภาวะ) แบ่งเป็น 6 กลุ่ม ดังตารางที่ 1</w:t>
       </w:r>
     </w:p>
     <w:p>
@@ -1984,7 +1984,7 @@
           <w:sz w:val="28"/>
           <w:szCs w:val="28"/>
         </w:rPr>
-        <w:t xml:space="preserve">  สภาวะ​การ​ทดลอง​และ​พารามิเตอร์​ของ​การ​ทดลอง​ที่ 1</w:t>
+        <w:t xml:space="preserve">  สภาวะการทดลองและพารามิเตอร์ของการทดลองที่ 1</w:t>
       </w:r>
     </w:p>
     <w:tbl>
@@ -2325,7 +2325,7 @@
                 <w:sz w:val="24"/>
                 <w:szCs w:val="24"/>
               </w:rPr>
-              <w:t xml:space="preserve">ภาพ​ดิบ ไม่​ผ่าน​การ​ลด​สัญญาณ​รบกวน (1 สภาวะ)</w:t>
+              <w:t xml:space="preserve">ภาพดิบ ไม่ผ่านการลดสัญญาณรบกวน (1 สภาวะ)</w:t>
             </w:r>
           </w:p>
         </w:tc>
@@ -3005,7 +3005,7 @@
                 <w:sz w:val="24"/>
                 <w:szCs w:val="24"/>
               </w:rPr>
-              <w:t xml:space="preserve">Pure DWT db1 ไม่​ใช้ CLAHE (thresh_ratio)</w:t>
+              <w:t xml:space="preserve">Pure DWT db1 ไม่ใช้ CLAHE (thresh_ratio)</w:t>
             </w:r>
           </w:p>
         </w:tc>
@@ -3363,7 +3363,7 @@
           <w:sz w:val="28"/>
           <w:szCs w:val="28"/>
         </w:rPr>
-        <w:t xml:space="preserve">สำหรับ​กลุ่ม​ที่ 6 ภาพ​ถูก​แยก​ย่อย​ด้วย DWT (db1) 3 ระดับ แล้ว​สังเคราะห์​กลับ​เฉพาะ​ย่าน​ความถี่​ต่ำ (A3), ย่าน​ความถี่​กลาง (D3 และ D2) หรือ​ย่าน​ความถี่​สูง (D1) ส่วน Selective DWT ทำ Soft Thresholding เฉพาะ​สัมประสิทธิ์​ความถี่​สูง​โดย​คง​ย่าน​ความถี่​ต่ำ​และ​กลาง​ไว้ ทุก​สภาวะ​ฝึกสอน​ด้วย​ภาพ​ชุด​เดียวกัน​และ​เงื่อนไข​การ​ฝึก​เดียวกัน</w:t>
+        <w:t xml:space="preserve">สำหรับกลุ่มที่ 6 ภาพถูกแยกย่อยด้วย DWT (db1) 3 ระดับ แล้วสังเคราะห์กลับเฉพาะย่านความถี่ต่ำ (A3), ย่านความถี่กลาง (D3 และ D2) หรือย่านความถี่สูง (D1) ส่วน Selective DWT ทำ Soft Thresholding เฉพาะสัมประสิทธิ์ความถี่สูงโดยคงย่านความถี่ต่ำและกลางไว้ ทุกสภาวะฝึกสอนด้วยภาพชุดเดียวกันและเงื่อนไขการฝึกเดียวกัน</w:t>
       </w:r>
     </w:p>
     <w:p>
@@ -3380,7 +3380,7 @@
           <w:sz w:val="28"/>
           <w:szCs w:val="28"/>
         </w:rPr>
-        <w:t xml:space="preserve">การ​ทดลอง​ที่ 2: การ​ทดสอบ​ความ​ทนทาน​ต่อ​สัญญาณ​รบกวน​จำลอง 5 ตระกูล × 3 ระดับ และ​การ​รวม​เทคนิค (12 วิธี × 16 สภาวะ)</w:t>
+        <w:t xml:space="preserve">การทดลองที่ 2: การทดสอบความทนทานต่อสัญญาณรบกวนจำลอง 5 ตระกูล × 3 ระดับ และการรวมเทคนิค (12 วิธี × 16 สภาวะ)</w:t>
       </w:r>
     </w:p>
     <w:p>
@@ -3395,7 +3395,7 @@
           <w:sz w:val="28"/>
           <w:szCs w:val="28"/>
         </w:rPr>
-        <w:t xml:space="preserve">นำ​ภาพ​อ้างอิง​ที่​ผ่าน​การ​คัด​เลือก​ให้​มี​สัญญาณ​รบกวน​เดิม​ต่ำ (หัวข้อ 5.1) มา​ย่อ​เป็น 256×256 พิกเซล แปลง​เป็น​ช่วง [0, 1] แล้ว​เติม​สัญญาณ​รบกวน​จำลอง 5 ตระกูล ตระกูล​ละ 3 ระดับ​ความ​รุนแรง (N1 ต่ำ, N2 กลาง, N3 สูง) ตาม​พารามิเตอร์​ใน​ตาราง​ที่ 2 เมื่อ​รวม​กับ​ภาพ​ก่อน​เติม​สัญญาณ​รบกวน (Clean) จะ​ได้​สภาวะ​ภาพ​ทดสอบ​ทั้งหมด 16 สภาวะ (16 Corruption States) ใน​ระหว่าง​การ​ฝึกสอน​จะ​สุ่ม​สภาวะ 1 แบบ​ต่อ​ภาพ​ต่อ Epoch ส่วน​ชุด​ตรวจ​สอบ​และ​ชุด​ทดสอบ​ใช้​สัญญาณ​รบกวน​ที่​ตรึง​ไว้​เหมือน​กัน​ทุก​วิธี</w:t>
+        <w:t xml:space="preserve">นำภาพอ้างอิงที่ผ่านการคัดเลือกให้มีสัญญาณรบกวนเดิมต่ำ (หัวข้อ 5.1) มาย่อเป็น 256×256 พิกเซล แปลงเป็นช่วง [0, 1] แล้วเติมสัญญาณรบกวนจำลอง 5 ตระกูล ตระกูลละ 3 ระดับความรุนแรง (N1 ต่ำ, N2 กลาง, N3 สูง) ตามพารามิเตอร์ในตารางที่ 2 เมื่อรวมกับภาพก่อนเติมสัญญาณรบกวน (Clean) จะได้สภาวะภาพทดสอบทั้งหมด 16 สภาวะ (16 Corruption States) ในระหว่างการฝึกสอนจะสุ่มสภาวะ 1 แบบต่อภาพต่อ Epoch ส่วนชุดตรวจสอบและชุดทดสอบใช้สัญญาณรบกวนที่ตรึงไว้เหมือนกันทุกวิธี</w:t>
       </w:r>
     </w:p>
     <w:p>
@@ -3420,7 +3420,7 @@
           <w:sz w:val="28"/>
           <w:szCs w:val="28"/>
         </w:rPr>
-        <w:t xml:space="preserve">  พารามิเตอร์​ของ​สัญญาณ​รบกวน​จำลอง​แต่ละ​ระดับ​ความ​รุนแรง</w:t>
+        <w:t xml:space="preserve">  พารามิเตอร์ของสัญญาณรบกวนจำลองแต่ละระดับความรุนแรง</w:t>
       </w:r>
     </w:p>
     <w:tbl>
@@ -3479,7 +3479,7 @@
                 <w:sz w:val="24"/>
                 <w:szCs w:val="24"/>
               </w:rPr>
-              <w:t xml:space="preserve">ตระกูล​สัญญาณ​รบกวน</w:t>
+              <w:t xml:space="preserve">ตระกูลสัญญาณรบกวน</w:t>
             </w:r>
           </w:p>
         </w:tc>
@@ -3694,7 +3694,7 @@
                 <w:sz w:val="24"/>
                 <w:szCs w:val="24"/>
               </w:rPr>
-              <w:t xml:space="preserve">ส่วน​เบี่ยง​เบน​มาตรฐาน σ</w:t>
+              <w:t xml:space="preserve">ส่วนเบี่ยงเบนมาตรฐาน σ</w:t>
             </w:r>
           </w:p>
         </w:tc>
@@ -4204,7 +4204,7 @@
                 <w:sz w:val="24"/>
                 <w:szCs w:val="24"/>
               </w:rPr>
-              <w:t xml:space="preserve">สัดส่วน​พิกเซล​ที่​ถูก​แทนที่</w:t>
+              <w:t xml:space="preserve">สัดส่วนพิกเซลที่ถูกแทนที่</w:t>
             </w:r>
           </w:p>
         </w:tc>
@@ -4374,7 +4374,7 @@
                 <w:sz w:val="24"/>
                 <w:szCs w:val="24"/>
               </w:rPr>
-              <w:t xml:space="preserve">ส่วน​เบี่ยง​เบน​มาตรฐาน σ</w:t>
+              <w:t xml:space="preserve">ส่วนเบี่ยงเบนมาตรฐาน σ</w:t>
             </w:r>
           </w:p>
         </w:tc>
@@ -4496,7 +4496,7 @@
           <w:sz w:val="28"/>
           <w:szCs w:val="28"/>
         </w:rPr>
-        <w:t xml:space="preserve">จาก​นั้น​นำ​ภาพ​ทั้ง 16 สภาวะ​มา​ผ่าน​วิธี​การ​ลด​สัญญาณ​รบกวน​และ​การ​รวม​เทคนิค 12 วิธี ดัง​ตาราง​ที่ 3 (ฝึกสอน ResNet-50 แยก 12 แบบ​จำลอง และ DAE 1 แบบ​จำลอง​ที่​ใช้​ร่วม​กัน​ใน​กลุ่ม DAE → CLAHE)</w:t>
+        <w:t xml:space="preserve">จากนั้นนำภาพทั้ง 16 สภาวะมาผ่านวิธีการลดสัญญาณรบกวนและการรวมเทคนิค 12 วิธี ดังตารางที่ 3 (ฝึกสอน ResNet-50 แยก 12 แบบจำลอง และ DAE 1 แบบจำลองที่ใช้ร่วมกันในกลุ่ม DAE → CLAHE)</w:t>
       </w:r>
     </w:p>
     <w:p>
@@ -4521,7 +4521,7 @@
           <w:sz w:val="28"/>
           <w:szCs w:val="28"/>
         </w:rPr>
-        <w:t xml:space="preserve">  วิธี​การ​ลด​สัญญาณ​รบกวน​และ​การ​รวม​เทคนิค​ใน​การ​ทดลอง​ที่ 2</w:t>
+        <w:t xml:space="preserve">  วิธีการลดสัญญาณรบกวนและการรวมเทคนิคในการทดลองที่ 2</w:t>
       </w:r>
     </w:p>
     <w:tbl>
@@ -4651,7 +4651,7 @@
                 <w:sz w:val="24"/>
                 <w:szCs w:val="24"/>
               </w:rPr>
-              <w:t xml:space="preserve">ราย​ละเอียด</w:t>
+              <w:t xml:space="preserve">รายละเอียด</w:t>
             </w:r>
           </w:p>
         </w:tc>
@@ -4791,7 +4791,7 @@
                 <w:sz w:val="24"/>
                 <w:szCs w:val="24"/>
               </w:rPr>
-              <w:t xml:space="preserve">ภาพ​หลัง​เติม​สัญญาณ​รบกวน ไม่​ลด Noise</w:t>
+              <w:t xml:space="preserve">ภาพหลังเติมสัญญาณรบกวน ไม่ลด Noise</w:t>
             </w:r>
           </w:p>
         </w:tc>
@@ -5065,7 +5065,7 @@
                 <w:sz w:val="24"/>
                 <w:szCs w:val="24"/>
               </w:rPr>
-              <w:t xml:space="preserve">DWT db1 3 ระดับ → CLAHE (clip_limit = 2.0) ตัว​คูณ​เกณฑ์​ตัด 0.5, 1.0, 2.0</w:t>
+              <w:t xml:space="preserve">DWT db1 3 ระดับ → CLAHE (clip_limit = 2.0) ตัวคูณเกณฑ์ตัด 0.5, 1.0, 2.0</w:t>
             </w:r>
           </w:p>
         </w:tc>
@@ -5202,7 +5202,7 @@
                 <w:sz w:val="24"/>
                 <w:szCs w:val="24"/>
               </w:rPr>
-              <w:t xml:space="preserve">DAE → CLAHE (clip_limit = 2.0) สัดส่วน​ผสม​ภาพ DAE α = 0.25, 0.50, 1.00</w:t>
+              <w:t xml:space="preserve">DAE → CLAHE (clip_limit = 2.0) สัดส่วนผสมภาพ DAE α = 0.25, 0.50, 1.00</w:t>
             </w:r>
           </w:p>
         </w:tc>
@@ -5339,7 +5339,7 @@
                 <w:sz w:val="24"/>
                 <w:szCs w:val="24"/>
               </w:rPr>
-              <w:t xml:space="preserve">รวม​ภาพ​ฐาน​และ​การ​แยก​ย่อย DWT ระดับ 1–4 เข้า​ด้วย​กัน</w:t>
+              <w:t xml:space="preserve">รวมภาพฐานและการแยกย่อย DWT ระดับ 1–4 เข้าด้วยกัน</w:t>
             </w:r>
           </w:p>
         </w:tc>
@@ -5476,7 +5476,7 @@
                 <w:sz w:val="24"/>
                 <w:szCs w:val="24"/>
               </w:rPr>
-              <w:t xml:space="preserve">รวม​ย่าน​ความถี่ DFT ต่ำ (&lt; 0.125), กลาง (0.125–0.25) และ​สูง (&gt; 0.25 cycles/pixel)</w:t>
+              <w:t xml:space="preserve">รวมย่านความถี่ DFT ต่ำ (&lt; 0.125), กลาง (0.125–0.25) และสูง (&gt; 0.25 cycles/pixel)</w:t>
             </w:r>
           </w:p>
         </w:tc>
@@ -5588,7 +5588,7 @@
           <w:sz w:val="28"/>
           <w:szCs w:val="28"/>
         </w:rPr>
-        <w:t xml:space="preserve">  ตัวอย่าง​ภาพ Infiltration จาก​ชุด​ข้อมูล VinBigData ที่​เติม Gaussian Noise ระดับ N2 และ​ผล​จาก​วิธี​ลด​สัญญาณ​รบกวน​แต่ละ​วิธี​ใน​การ​ทดลอง​ที่ 2</w:t>
+        <w:t xml:space="preserve">  ตัวอย่างภาพ Infiltration จากชุดข้อมูล VinBigData ที่เติม Gaussian Noise ระดับ N2 และผลจากวิธีลดสัญญาณรบกวนแต่ละวิธีในการทดลองที่ 2</w:t>
       </w:r>
     </w:p>
     <w:p>
@@ -5605,7 +5605,7 @@
           <w:sz w:val="28"/>
           <w:szCs w:val="28"/>
         </w:rPr>
-        <w:t xml:space="preserve">5.4 การ​ประเมิน​คุณภาพ​การ​กู้​คืน​ภาพ (Objective Image Quality Metrics)</w:t>
+        <w:t xml:space="preserve">5.4 การประเมินคุณภาพการกู้คืนภาพ (Objective Image Quality Metrics)</w:t>
       </w:r>
     </w:p>
     <w:p>
@@ -5620,7 +5620,7 @@
           <w:sz w:val="28"/>
           <w:szCs w:val="28"/>
         </w:rPr>
-        <w:t xml:space="preserve">ประเมิน​ค่า PSNR และ SSIM ของ​ภาพ​ที่​ผ่าน​การ​ลด​สัญญาณ​รบกวน บน​ชุด​ภาพ​ทดสอบ​ที่​จำลอง​สัญญาณ​รบกวน​ทั้ง 5 ตระกูล (N1–N3) เทียบ​กับ​ภาพ​ก่อน​เติม​สัญญาณ​รบกวน (Clean) เพื่อ​วิเคราะห์​ความ​สัมพันธ์​ระหว่าง​คุณภาพ​ภาพ​ทาง​สถิติ (Image Fidelity) กับ​ประสิทธิภาพ​การ​จำแนก​โรค (Classification Performance)</w:t>
+        <w:t xml:space="preserve">ประเมินค่า PSNR และ SSIM ของภาพที่ผ่านการลดสัญญาณรบกวน บนชุดภาพทดสอบที่จำลองสัญญาณรบกวนทั้ง 5 ตระกูล (N1–N3) เทียบกับภาพก่อนเติมสัญญาณรบกวน (Clean) เพื่อวิเคราะห์ความสัมพันธ์ระหว่างคุณภาพภาพทางสถิติ (Image Fidelity) กับประสิทธิภาพการจำแนกโรค (Classification Performance)</w:t>
       </w:r>
     </w:p>
     <w:p>
@@ -5656,7 +5656,7 @@
           <w:sz w:val="28"/>
           <w:szCs w:val="28"/>
         </w:rPr>
-        <w:t xml:space="preserve"> วัด​ความ​เที่ยง​ตรง​ของ​สัญญาณ​ภาพ โดยที่ MAX คือ​ค่า​ความ​เข้ม​สูงสุด​ของ​ภาพ และ MSE คือ​ค่า​ความคลาด​เคลื่อน​กำลัง​สอง​เฉลี่ย</w:t>
+        <w:t xml:space="preserve"> วัดความเที่ยงตรงของสัญญาณภาพ โดยที่ MAX คือค่าความเข้มสูงสุดของภาพ และ MSE คือค่าความคลาดเคลื่อนกำลังสองเฉลี่ย</w:t>
       </w:r>
     </w:p>
     <w:p>
@@ -5734,7 +5734,7 @@
           <w:sz w:val="28"/>
           <w:szCs w:val="28"/>
         </w:rPr>
-        <w:t xml:space="preserve"> วัด​การ​รักษา​รูป​ร่าง​และ​โครงสร้าง​ทาง​กายวิภาค มี​ค่า​อยู่​ใน​ช่วง 0 ถึง 1 โดย​ค่าที่​สูง​หมาย​ถึง​โครงสร้าง​ใกล้​เคียง​ภาพ​อ้างอิง (Wang et al., 2004)</w:t>
+        <w:t xml:space="preserve"> วัดการรักษารูปร่างและโครงสร้างทางกายวิภาค มีค่าอยู่ในช่วง 0 ถึง 1 โดยค่าที่สูงหมายถึงโครงสร้างใกล้เคียงภาพอ้างอิง (Wang et al., 2004)</w:t>
       </w:r>
     </w:p>
     <w:p>
@@ -5751,7 +5751,7 @@
           <w:sz w:val="28"/>
           <w:szCs w:val="28"/>
         </w:rPr>
-        <w:t xml:space="preserve">5.5 การ​ฝึกสอน​แบบ​จำลอง​การ​จำแนก​โรค (Model Training &amp; Fair Comparison)</w:t>
+        <w:t xml:space="preserve">5.5 การฝึกสอนแบบจำลองการจำแนกโรค (Model Training &amp; Fair Comparison)</w:t>
       </w:r>
     </w:p>
     <w:p>
@@ -5777,7 +5777,7 @@
           <w:sz w:val="28"/>
           <w:szCs w:val="28"/>
         </w:rPr>
-        <w:t xml:space="preserve">ใช้​สถาปัตยกรรม ResNet-50 ที่​ฝึก​ล่วง​หน้า​บน ImageNet โครงสร้าง​เดียว​กัน​และ​ไฮ​เปอร์​พารามิเตอร์​คงที่​ภายใน​แต่ละ​การ​ทดลอง โดย​ฝึก​บน​ภาพ​ที่​ผ่าน​กระบวนการ​ลด​สัญญาณ​รบกวน​แต่ละ​รูป​แบบ​ด้วย​ชุด​ข้อมูล การ​แบ่ง​ชุด​ข้อมูล และ Random Seed (42) เดียวกัน</w:t>
+        <w:t xml:space="preserve">ใช้สถาปัตยกรรม ResNet-50 ที่ฝึกล่วงหน้าบน ImageNet โครงสร้างเดียวกันและไฮเปอร์พารามิเตอร์คงที่ภายในแต่ละการทดลอง โดยฝึกบนภาพที่ผ่านกระบวนการลดสัญญาณรบกวนแต่ละรูปแบบด้วยชุดข้อมูล การแบ่งชุดข้อมูล และ Random Seed (42) เดียวกัน</w:t>
       </w:r>
     </w:p>
     <w:p>
@@ -5805,15 +5805,15 @@
           <w:sz w:val="28"/>
           <w:szCs w:val="28"/>
         </w:rPr>
-        <w:t xml:space="preserve">การ​ทดลอง​ที่ 1:</w:t>
-      </w:r>
-      <w:r>
-        <w:rPr>
-          <w:rFonts w:ascii="TH Sarabun New" w:cs="TH Sarabun New" w:eastAsia="TH Sarabun New" w:hAnsi="TH Sarabun New"/>
-          <w:sz w:val="28"/>
-          <w:szCs w:val="28"/>
-        </w:rPr>
-        <w:t xml:space="preserve"> ฝึก​ทุก​ชั้น​ของ​โครง​ข่าย ใช้ Cross-Entropy Loss, Adam Optimizer, Learning Rate = 10⁻⁴, Batch Size = 32, จำนวน 7 Epochs พร้อม Random Horizontal Flip</w:t>
+        <w:t xml:space="preserve">การทดลองที่ 1:</w:t>
+      </w:r>
+      <w:r>
+        <w:rPr>
+          <w:rFonts w:ascii="TH Sarabun New" w:cs="TH Sarabun New" w:eastAsia="TH Sarabun New" w:hAnsi="TH Sarabun New"/>
+          <w:sz w:val="28"/>
+          <w:szCs w:val="28"/>
+        </w:rPr>
+        <w:t xml:space="preserve"> ฝึกทุกชั้นของโครงข่าย ใช้ Cross-Entropy Loss, Adam Optimizer, Learning Rate = 10⁻⁴, Batch Size = 32, จำนวน 7 Epochs พร้อม Random Horizontal Flip</w:t>
       </w:r>
     </w:p>
     <w:p>
@@ -5841,15 +5841,15 @@
           <w:sz w:val="28"/>
           <w:szCs w:val="28"/>
         </w:rPr>
-        <w:t xml:space="preserve">การ​ทดลอง​ที่ 2:</w:t>
-      </w:r>
-      <w:r>
-        <w:rPr>
-          <w:rFonts w:ascii="TH Sarabun New" w:cs="TH Sarabun New" w:eastAsia="TH Sarabun New" w:hAnsi="TH Sarabun New"/>
-          <w:sz w:val="28"/>
-          <w:szCs w:val="28"/>
-        </w:rPr>
-        <w:t xml:space="preserve"> ฝึก​ส่วน​หัว​จำแนก (Head) 3 Epochs แรก แล้ว​จึง​เปิด​ฝึก Layer4 ใช้ AdamW (Learning Rate = 10⁻⁴, Weight Decay = 10⁻⁴), Dropout 0.3, Effective Batch Size = 16, สูงสุด 20 Epochs พร้อม Early Stopping (Patience = 3) และ Data Augmentation (หมุน ±7°, เลื่อน 5%, ปรับ​ขนาด 0.95–1.05) เลือก Checkpoint จาก​ค่า Validation Loss ที่​ต่ำ​ที่สุด และ​กำหนด​เกณฑ์​ตัดสิน​ใจ (Threshold) ด้วย Youden's J จาก​ชุด​ตรวจ​สอบ โดย​ไม่​ใช้​ชุด​ทดสอบ​ใน​การ​เลือก​ใด ๆ</w:t>
+        <w:t xml:space="preserve">การทดลองที่ 2:</w:t>
+      </w:r>
+      <w:r>
+        <w:rPr>
+          <w:rFonts w:ascii="TH Sarabun New" w:cs="TH Sarabun New" w:eastAsia="TH Sarabun New" w:hAnsi="TH Sarabun New"/>
+          <w:sz w:val="28"/>
+          <w:szCs w:val="28"/>
+        </w:rPr>
+        <w:t xml:space="preserve"> ฝึกส่วนหัวจำแนก (Head) 3 Epochs แรก แล้วจึงเปิดฝึก Layer4 ใช้ AdamW (Learning Rate = 10⁻⁴, Weight Decay = 10⁻⁴), Dropout 0.3, Effective Batch Size = 16, สูงสุด 20 Epochs พร้อม Early Stopping (Patience = 3) และ Data Augmentation (หมุน ±7°, เลื่อน 5%, ปรับขนาด 0.95–1.05) เลือก Checkpoint จากค่า Validation Loss ที่ต่ำที่สุด และกำหนดเกณฑ์ตัดสินใจ (Threshold) ด้วย Youden's J จากชุดตรวจสอบ โดยไม่ใช้ชุดทดสอบในการเลือกใด ๆ</w:t>
       </w:r>
     </w:p>
     <w:p>
@@ -5866,7 +5866,7 @@
           <w:sz w:val="28"/>
           <w:szCs w:val="28"/>
         </w:rPr>
-        <w:t xml:space="preserve">5.6 การ​สกัด​และ​สร้าง​แผนภาพ​อธิบาย​ผล (XAI Implementation)</w:t>
+        <w:t xml:space="preserve">5.6 การสกัดและสร้างแผนภาพอธิบายผล (XAI Implementation)</w:t>
       </w:r>
     </w:p>
     <w:p>
@@ -5892,7 +5892,7 @@
           <w:sz w:val="28"/>
           <w:szCs w:val="28"/>
         </w:rPr>
-        <w:t xml:space="preserve">สกัด Heatmap ของ Infiltration ด้วย​เทคนิค Grad-CAM และ SHAP เพื่อ​แสดง​บริเวณ​ที่​แบบ​จำลอง​ใช้​ทำนาย Infiltration โดย​ใช้​แบบ​จำลอง​ที่​คัด​เลือก​ได้​จาก​การ​ทดลอง​ที่ 1 และ 2 (เช่น DAE → CLAHE L2) เปรียบ​เทียบ​กับ Baseline</w:t>
+        <w:t xml:space="preserve">สกัด Heatmap ของ Infiltration ด้วยเทคนิค Grad-CAM และ SHAP เพื่อแสดงบริเวณที่แบบจำลองใช้ทำนาย Infiltration โดยใช้แบบจำลองที่คัดเลือกได้จากการทดลองที่ 1 และ 2 (เช่น DAE → CLAHE L2) เปรียบเทียบกับ Baseline</w:t>
       </w:r>
     </w:p>
     <w:p>
@@ -5918,7 +5918,7 @@
           <w:sz w:val="28"/>
           <w:szCs w:val="28"/>
         </w:rPr>
-        <w:t xml:space="preserve">ปรับ​ขนาด Heatmap ให้​ตรง​กับ​ขนาด​ภาพ​ตั้ง​ต้น เพื่อ​ให้​สามารถ​ซ้อน​ทับ​ภาพ​และ​ประเมิน​ความ​สอดคล้อง​เชิง​ตำแหน่ง​ด้วย IoU และ Pointing Game ได้ และ​ทำการ Normalize ให้​อยู่​ใน​ช่วง [0, 1]</w:t>
+        <w:t xml:space="preserve">ปรับขนาด Heatmap ให้ตรงกับขนาดภาพตั้งต้น เพื่อให้สามารถซ้อนทับภาพและประเมินความสอดคล้องเชิงตำแหน่งด้วย IoU และ Pointing Game ได้ และทำการ Normalize ให้อยู่ในช่วง [0, 1]</w:t>
       </w:r>
     </w:p>
     <w:p>
@@ -5935,7 +5935,7 @@
           <w:sz w:val="28"/>
           <w:szCs w:val="28"/>
         </w:rPr>
-        <w:t xml:space="preserve">5.7 การ​ประเมิน​ประสิทธิภาพ​การ​จำแนก​โรค (Classification Evaluation)</w:t>
+        <w:t xml:space="preserve">5.7 การประเมินประสิทธิภาพการจำแนกโรค (Classification Evaluation)</w:t>
       </w:r>
     </w:p>
     <w:p>
@@ -5950,7 +5950,7 @@
           <w:sz w:val="28"/>
           <w:szCs w:val="28"/>
         </w:rPr>
-        <w:t xml:space="preserve">คำนวณ​ค่าตัว​ชี้​วัด​มาตรฐาน​ทางการ​แพทย์​บน​ชุด​ข้อมูล​ทดสอบ ดังนี้</w:t>
+        <w:t xml:space="preserve">คำนวณค่าตัวชี้วัดมาตรฐานทางการแพทย์บนชุดข้อมูลทดสอบ ดังนี้</w:t>
       </w:r>
     </w:p>
     <w:p>
@@ -6072,7 +6072,7 @@
           <w:sz w:val="28"/>
           <w:szCs w:val="28"/>
         </w:rPr>
-        <w:t xml:space="preserve">นอกจาก​นี้​ยัง​วัด​พื้นที่​ใต้​เส้น​โค้ง ROC (ROC-AUC) และ​พื้นที่​ใต้​เส้น​โค้ง Precision–Recall (PR-AUC) ซึ่ง​ไม่​ขึ้น​กับ​เกณฑ์​ตัดสิน​ใจ สำหรับ​การ​ทดลอง​ที่ 2 รายงาน​ค่า​เฉลี่ย​แบบ Macro-average ของ​ทั้ง 16 สภาวะ พร้อม​ทั้ง​นำ​เสนอ​ผล​ใน​รูป​แบบ Confusion Matrix</w:t>
+        <w:t xml:space="preserve">นอกจากนี้ยังวัดพื้นที่ใต้เส้นโค้ง ROC (ROC-AUC) และพื้นที่ใต้เส้นโค้ง Precision–Recall (PR-AUC) ซึ่งไม่ขึ้นกับเกณฑ์ตัดสินใจ สำหรับการทดลองที่ 2 รายงานค่าเฉลี่ยแบบ Macro-average ของทั้ง 16 สภาวะ พร้อมทั้งนำเสนอผลในรูปแบบ Confusion Matrix</w:t>
       </w:r>
     </w:p>
     <w:p>
@@ -6089,7 +6089,7 @@
           <w:sz w:val="28"/>
           <w:szCs w:val="28"/>
         </w:rPr>
-        <w:t xml:space="preserve">5.8 การ​ประเมิน​ความ​แม่นยำ​ของ​การ​อธิบาย​ผล​เชิง​สถิติ (XAI Quantitative Localization)</w:t>
+        <w:t xml:space="preserve">5.8 การประเมินความแม่นยำของการอธิบายผลเชิงสถิติ (XAI Quantitative Localization)</w:t>
       </w:r>
     </w:p>
     <w:p>
@@ -6104,7 +6104,7 @@
           <w:sz w:val="28"/>
           <w:szCs w:val="28"/>
         </w:rPr>
-        <w:t xml:space="preserve">ประเมิน​ความ​สอดคล้อง​ระหว่าง Saliency Map กับ Bounding Box ของ​รังสีแพทย์ ด้วย 3 ตัว​ชี้​วัด ดังนี้</w:t>
+        <w:t xml:space="preserve">ประเมินความสอดคล้องระหว่าง Saliency Map กับ Bounding Box ของรังสีแพทย์ ด้วย 3 ตัวชี้วัด ดังนี้</w:t>
       </w:r>
     </w:p>
     <w:p>
@@ -6140,7 +6140,7 @@
           <w:sz w:val="28"/>
           <w:szCs w:val="28"/>
         </w:rPr>
-        <w:t xml:space="preserve"> ประเมิน​ทั้ง​แบบ Strict (0 px Margin) และ​แบบ Margin 5 px Tolerance</w:t>
+        <w:t xml:space="preserve"> ประเมินทั้งแบบ Strict (0 px Margin) และแบบ Margin 5 px Tolerance</w:t>
       </w:r>
     </w:p>
     <w:p>
@@ -6300,7 +6300,7 @@
           <w:sz w:val="28"/>
           <w:szCs w:val="28"/>
         </w:rPr>
-        <w:t xml:space="preserve"> โดยที่ Mτ = {(x,y) | H(x,y) ≥ τ · max(H)} ที่​ระดับ​เกณฑ์​การ​ตัด τ = 0.3 และ τ = 0.5</w:t>
+        <w:t xml:space="preserve"> โดยที่ Mτ = {(x,y) | H(x,y) ≥ τ · max(H)} ที่ระดับเกณฑ์การตัด τ = 0.3 และ τ = 0.5</w:t>
       </w:r>
     </w:p>
     <w:p>
@@ -6338,7 +6338,7 @@
           <w:sz w:val="28"/>
           <w:szCs w:val="28"/>
         </w:rPr>
-        <w:t xml:space="preserve">นิยาม​ตัวแปร: H(x,y) คือ​ค่า​ความ​สว่าง​ของ Saliency Map ณ พิกัด (x,y), B คือ​พื้นที่ Bounding Box ของ​แพทย์ และ 𝕀(·) คือ Indicator Function ซึ่ง​มี​ค่า​เป็น 1 เมื่อ​จุด​สูงสุด​ตกใน​กรอบ และ​เป็น 0 เมื่อ​อยู่​นอก​กรอบ</w:t>
+        <w:t xml:space="preserve">นิยามตัวแปร: H(x,y) คือค่าความสว่างของ Saliency Map ณ พิกัด (x,y), B คือพื้นที่ Bounding Box ของแพทย์ และ 𝕀(·) คือ Indicator Function ซึ่งมีค่าเป็น 1 เมื่อจุดสูงสุดตกในกรอบ และเป็น 0 เมื่ออยู่นอกกรอบ</w:t>
       </w:r>
     </w:p>
     <w:p>
@@ -6355,7 +6355,7 @@
           <w:sz w:val="28"/>
           <w:szCs w:val="28"/>
         </w:rPr>
-        <w:t xml:space="preserve">5.9 ผล​การ​ศึกษา​และ​ทดลอง​เบื้อง​ต้น (Preliminary Experimental Results)</w:t>
+        <w:t xml:space="preserve">5.9 ผลการศึกษาและทดลองเบื้องต้น (Preliminary Experimental Results)</w:t>
       </w:r>
     </w:p>
     <w:p>
@@ -6370,7 +6370,7 @@
           <w:sz w:val="28"/>
           <w:szCs w:val="28"/>
         </w:rPr>
-        <w:t xml:space="preserve">ผล​การ​ทดลอง​เบื้อง​ต้น​ใน​รอบ​นี้​มุ่ง​เน้น​ประสิทธิภาพ​การ​จำแนก​โรค​และ​คุณภาพ​ภาพ​จาก​การ​ทดลอง​ที่ 1 และ 2 บน​ชุด​ข้อมูล​ทั้ง 2 ชุด ส่วน​การ​ประเมิน XAI เชิง​ปริมาณ (หัวข้อ 5.6 และ 5.8) จะ​ดำเนิน​การ​ใน​ระยะ​ถัด​ไป​โดย​ใช้​แบบ​จำลอง​ที่​คัด​เลือก​ได้​จาก​การ​ทดลอง​นี้ เนื่องจาก​การ​ขยาย​สภาวะ​การ​ทดลอง​ทำให้​ใช้​เวลา​ประมวล​ผล​เพิ่ม​ขึ้น​มาก (ตัวเลข​หนา​ใน​ตาราง​คือ​ค่า​สูงสุด​ของ​แต่ละ​คอลัมน์)</w:t>
+        <w:t xml:space="preserve">ผลการทดลองเบื้องต้นในรอบนี้มุ่งเน้นประสิทธิภาพการจำแนกโรคและคุณภาพภาพจากการทดลองที่ 1 และ 2 บนชุดข้อมูลทั้ง 2 ชุด ส่วนการประเมิน XAI เชิงปริมาณ (หัวข้อ 5.6 และ 5.8) จะดำเนินการในระยะถัดไปโดยใช้แบบจำลองที่คัดเลือกได้จากการทดลองนี้ เนื่องจากการขยายสภาวะการทดลองทำให้ใช้เวลาประมวลผลเพิ่มขึ้นมาก (ตัวเลขหนาในตารางคือค่าสูงสุดของแต่ละคอลัมน์)</w:t>
       </w:r>
     </w:p>
     <w:p>
@@ -6387,7 +6387,7 @@
           <w:sz w:val="28"/>
           <w:szCs w:val="28"/>
         </w:rPr>
-        <w:t xml:space="preserve">ผล​การ​ทดลอง​ที่ 1: การ​จำแนก​โรค​บน​ภาพ​ต้นฉบับ 21 สภาวะ</w:t>
+        <w:t xml:space="preserve">ผลการทดลองที่ 1: การจำแนกโรคบนภาพต้นฉบับ 21 สภาวะ</w:t>
       </w:r>
     </w:p>
     <w:p>
@@ -6412,7 +6412,7 @@
           <w:sz w:val="28"/>
           <w:szCs w:val="28"/>
         </w:rPr>
-        <w:t xml:space="preserve">  ผล​การ​จำแนก​โรค​บน​ชุด​ข้อมูล NIH ChestX-ray14 (การ​ทดลอง​ที่ 1, 21 สภาวะ)</w:t>
+        <w:t xml:space="preserve">  ผลการจำแนกโรคบนชุดข้อมูล NIH ChestX-ray14 (การทดลองที่ 1, 21 สภาวะ)</w:t>
       </w:r>
     </w:p>
     <w:p>
@@ -6427,7 +6427,7 @@
           <w:sz w:val="26"/>
           <w:szCs w:val="26"/>
         </w:rPr>
-        <w:t xml:space="preserve">(ResNet-50 ทดสอบ​บน Balanced Test Subset 100 ภาพ: Infiltration 50 ภาพ, No Finding 50 ภาพ)</w:t>
+        <w:t xml:space="preserve">(ResNet-50 ทดสอบบน Balanced Test Subset 100 ภาพ: Infiltration 50 ภาพ, No Finding 50 ภาพ)</w:t>
       </w:r>
     </w:p>
     <w:tbl>
@@ -6524,7 +6524,7 @@
                 <w:sz w:val="24"/>
                 <w:szCs w:val="24"/>
               </w:rPr>
-              <w:t xml:space="preserve">สภาวะ​การ​ทดลอง</w:t>
+              <w:t xml:space="preserve">สภาวะการทดลอง</w:t>
             </w:r>
           </w:p>
         </w:tc>
@@ -11707,7 +11707,7 @@
           <w:sz w:val="28"/>
           <w:szCs w:val="28"/>
         </w:rPr>
-        <w:t xml:space="preserve">  ผล​การ​จำแนก​โรค​บน​ชุด​ข้อมูล VinBigData Chest X-ray (การ​ทดลอง​ที่ 1, 21 สภาวะ)</w:t>
+        <w:t xml:space="preserve">  ผลการจำแนกโรคบนชุดข้อมูล VinBigData Chest X-ray (การทดลองที่ 1, 21 สภาวะ)</w:t>
       </w:r>
     </w:p>
     <w:p>
@@ -11722,7 +11722,7 @@
           <w:sz w:val="26"/>
           <w:szCs w:val="26"/>
         </w:rPr>
-        <w:t xml:space="preserve">(ResNet-50 ทดสอบ​บน Balanced Test Subset 100 ภาพ: Infiltration 50 ภาพ, No Finding 50 ภาพ)</w:t>
+        <w:t xml:space="preserve">(ResNet-50 ทดสอบบน Balanced Test Subset 100 ภาพ: Infiltration 50 ภาพ, No Finding 50 ภาพ)</w:t>
       </w:r>
     </w:p>
     <w:tbl>
@@ -11819,7 +11819,7 @@
                 <w:sz w:val="24"/>
                 <w:szCs w:val="24"/>
               </w:rPr>
-              <w:t xml:space="preserve">สภาวะ​การ​ทดลอง</w:t>
+              <w:t xml:space="preserve">สภาวะการทดลอง</w:t>
             </w:r>
           </w:p>
         </w:tc>
@@ -17044,7 +17044,7 @@
           <w:sz w:val="28"/>
           <w:szCs w:val="28"/>
         </w:rPr>
-        <w:t xml:space="preserve">  เม​ทริกซ์​ความ​สับสน (Confusion Matrices) ของ​สภาวะ​ตัวแทน 6 สภาวะ​ใน​การ​ทดลอง​ที่ 1 บน​ชุด​ข้อมูล NIH ChestX-ray14</w:t>
+        <w:t xml:space="preserve">  เมทริกซ์ความสับสน (Confusion Matrices) ของสภาวะตัวแทน 6 สภาวะในการทดลองที่ 1 บนชุดข้อมูล NIH ChestX-ray14</w:t>
       </w:r>
     </w:p>
     <w:p>
@@ -17115,7 +17115,7 @@
           <w:sz w:val="28"/>
           <w:szCs w:val="28"/>
         </w:rPr>
-        <w:t xml:space="preserve">  เม​ทริกซ์​ความ​สับสน (Confusion Matrices) ของ​สภาวะ​ตัวแทน 6 สภาวะ​ใน​การ​ทดลอง​ที่ 1 บน​ชุด​ข้อมูล VinBigData</w:t>
+        <w:t xml:space="preserve">  เมทริกซ์ความสับสน (Confusion Matrices) ของสภาวะตัวแทน 6 สภาวะในการทดลองที่ 1 บนชุดข้อมูล VinBigData</w:t>
       </w:r>
     </w:p>
     <w:p>
@@ -17132,7 +17132,7 @@
           <w:sz w:val="28"/>
           <w:szCs w:val="28"/>
         </w:rPr>
-        <w:t xml:space="preserve">ผล​การ​ทดลอง​ที่ 2: ความ​ทนทาน​ต่อ​สัญญาณ​รบกวน​จำลอง 16 สภาวะ​และ​การ​รวม​เทคนิค</w:t>
+        <w:t xml:space="preserve">ผลการทดลองที่ 2: ความทนทานต่อสัญญาณรบกวนจำลอง 16 สภาวะและการรวมเทคนิค</w:t>
       </w:r>
     </w:p>
     <w:p>
@@ -17157,7 +17157,7 @@
           <w:sz w:val="28"/>
           <w:szCs w:val="28"/>
         </w:rPr>
-        <w:t xml:space="preserve">  ผล​เฉลี่ย 16 สภาวะ​บน​ชุด​ข้อมูล NIH ChestX-ray14 (การ​ทดลอง​ที่ 2, 12 วิธี)</w:t>
+        <w:t xml:space="preserve">  ผลเฉลี่ย 16 สภาวะบนชุดข้อมูล NIH ChestX-ray14 (การทดลองที่ 2, 12 วิธี)</w:t>
       </w:r>
     </w:p>
     <w:p>
@@ -17172,7 +17172,7 @@
           <w:sz w:val="26"/>
           <w:szCs w:val="26"/>
         </w:rPr>
-        <w:t xml:space="preserve">(ค่า​เฉลี่ย Macro-average จาก 16 สภาวะ: Clean และ 5 ตระกูล​สัญญาณ​รบกวน × 3 ระดับ; ชุด​ทดสอบ 100 ภาพ​ต่อ​สภาวะ เรียง​ตาม Mean ROC-AUC)</w:t>
+        <w:t xml:space="preserve">(ค่าเฉลี่ย Macro-average จาก 16 สภาวะ: Clean และ 5 ตระกูลสัญญาณรบกวน × 3 ระดับ; ชุดทดสอบ 100 ภาพต่อสภาวะ เรียงตาม Mean ROC-AUC)</w:t>
       </w:r>
     </w:p>
     <w:tbl>
@@ -18812,7 +18812,7 @@
                 <w:sz w:val="24"/>
                 <w:szCs w:val="24"/>
               </w:rPr>
-              <w:t xml:space="preserve">baseline (ไม่​ลด Noise)</w:t>
+              <w:t xml:space="preserve">baseline (ไม่ลด Noise)</w:t>
             </w:r>
           </w:p>
         </w:tc>
@@ -21192,7 +21192,7 @@
           <w:sz w:val="28"/>
           <w:szCs w:val="28"/>
         </w:rPr>
-        <w:t xml:space="preserve">  ผล​เฉลี่ย 16 สภาวะ​บน​ชุด​ข้อมูล VinBigData (การ​ทดลอง​ที่ 2, 12 วิธี)</w:t>
+        <w:t xml:space="preserve">  ผลเฉลี่ย 16 สภาวะบนชุดข้อมูล VinBigData (การทดลองที่ 2, 12 วิธี)</w:t>
       </w:r>
     </w:p>
     <w:p>
@@ -21207,7 +21207,7 @@
           <w:sz w:val="26"/>
           <w:szCs w:val="26"/>
         </w:rPr>
-        <w:t xml:space="preserve">(ค่า​เฉลี่ย Macro-average จาก 16 สภาวะ: Clean และ 5 ตระกูล​สัญญาณ​รบกวน × 3 ระดับ; ชุด​ทดสอบ 100 ภาพ​ต่อ​สภาวะ เรียง​ตาม Mean ROC-AUC)</w:t>
+        <w:t xml:space="preserve">(ค่าเฉลี่ย Macro-average จาก 16 สภาวะ: Clean และ 5 ตระกูลสัญญาณรบกวน × 3 ระดับ; ชุดทดสอบ 100 ภาพต่อสภาวะ เรียงตาม Mean ROC-AUC)</w:t>
       </w:r>
     </w:p>
     <w:tbl>
@@ -22547,7 +22547,7 @@
                 <w:sz w:val="24"/>
                 <w:szCs w:val="24"/>
               </w:rPr>
-              <w:t xml:space="preserve">baseline (ไม่​ลด Noise)</w:t>
+              <w:t xml:space="preserve">baseline (ไม่ลด Noise)</w:t>
             </w:r>
           </w:p>
         </w:tc>
@@ -25229,7 +25229,7 @@
           <w:sz w:val="28"/>
           <w:szCs w:val="28"/>
         </w:rPr>
-        <w:t xml:space="preserve">  วิธี​ที่​ให้​ผล​ดี​ที่สุด​แยก​ตาม​ตระกูล​สัญญาณ​รบกวน เปรียบ​เทียบ 2 ชุด​ข้อมูล</w:t>
+        <w:t xml:space="preserve">  วิธีที่ให้ผลดีที่สุดแยกตามตระกูลสัญญาณรบกวน เปรียบเทียบ 2 ชุดข้อมูล</w:t>
       </w:r>
     </w:p>
     <w:p>
@@ -25244,7 +25244,7 @@
           <w:sz w:val="26"/>
           <w:szCs w:val="26"/>
         </w:rPr>
-        <w:t xml:space="preserve">(NIH เปรียบ​เทียบ​ด้วย ROC-AUC; VinBigData เปรียบ​เทียบ​ด้วย Accuracy และ ROC-AUC; ค่า​เฉลี่ย​ระดับ N1–N3)</w:t>
+        <w:t xml:space="preserve">(NIH เปรียบเทียบด้วย ROC-AUC; VinBigData เปรียบเทียบด้วย Accuracy และ ROC-AUC; ค่าเฉลี่ยระดับ N1–N3)</w:t>
       </w:r>
     </w:p>
     <w:tbl>
@@ -25303,7 +25303,7 @@
                 <w:sz w:val="24"/>
                 <w:szCs w:val="24"/>
               </w:rPr>
-              <w:t xml:space="preserve">ตระกูล​สัญญาณ​รบกวน</w:t>
+              <w:t xml:space="preserve">ตระกูลสัญญาณรบกวน</w:t>
             </w:r>
           </w:p>
         </w:tc>
@@ -25375,7 +25375,7 @@
                 <w:sz w:val="24"/>
                 <w:szCs w:val="24"/>
               </w:rPr>
-              <w:t xml:space="preserve">NIH: วิธี​ที่​ดี​ที่สุด (AUC)</w:t>
+              <w:t xml:space="preserve">NIH: วิธีที่ดีที่สุด (AUC)</w:t>
             </w:r>
           </w:p>
         </w:tc>
@@ -25447,7 +25447,7 @@
                 <w:sz w:val="24"/>
                 <w:szCs w:val="24"/>
               </w:rPr>
-              <w:t xml:space="preserve">VinBigData: วิธี​ที่​ดี​ที่สุด</w:t>
+              <w:t xml:space="preserve">VinBigData: วิธีที่ดีที่สุด</w:t>
             </w:r>
           </w:p>
         </w:tc>
@@ -25485,7 +25485,7 @@
                 <w:sz w:val="24"/>
                 <w:szCs w:val="24"/>
               </w:rPr>
-              <w:t xml:space="preserve">Clean (ก่อน​เติม Noise)</w:t>
+              <w:t xml:space="preserve">Clean (ก่อนเติม Noise)</w:t>
             </w:r>
           </w:p>
         </w:tc>
@@ -25787,7 +25787,7 @@
                 <w:sz w:val="24"/>
                 <w:szCs w:val="24"/>
               </w:rPr>
-              <w:t xml:space="preserve">dft_fusion (99.00%); ภาพ​เดี่ยว: dae_clahe_L1/L2 (96.67%)</w:t>
+              <w:t xml:space="preserve">dft_fusion (99.00%); ภาพเดี่ยว: dae_clahe_L1/L2 (96.67%)</w:t>
             </w:r>
           </w:p>
         </w:tc>
@@ -25957,7 +25957,7 @@
                 <w:sz w:val="24"/>
                 <w:szCs w:val="24"/>
               </w:rPr>
-              <w:t xml:space="preserve">dft_fusion (98.67%); ภาพ​เดี่ยว: median_L2 (97.67%)</w:t>
+              <w:t xml:space="preserve">dft_fusion (98.67%); ภาพเดี่ยว: median_L2 (97.67%)</w:t>
             </w:r>
           </w:p>
         </w:tc>
@@ -26127,7 +26127,7 @@
                 <w:sz w:val="24"/>
                 <w:szCs w:val="24"/>
               </w:rPr>
-              <w:t xml:space="preserve">dft_fusion (98.00%); ภาพ​เดี่ยว: dae_clahe_L1 (97.33%)</w:t>
+              <w:t xml:space="preserve">dft_fusion (98.00%); ภาพเดี่ยว: dae_clahe_L1 (97.33%)</w:t>
             </w:r>
           </w:p>
         </w:tc>
@@ -26467,7 +26467,7 @@
                 <w:sz w:val="24"/>
                 <w:szCs w:val="24"/>
               </w:rPr>
-              <w:t xml:space="preserve">dft_fusion (98.33%); ภาพ​เดี่ยว: dae_clahe_L1 (97.67%)</w:t>
+              <w:t xml:space="preserve">dft_fusion (98.33%); ภาพเดี่ยว: dae_clahe_L1 (97.67%)</w:t>
             </w:r>
           </w:p>
         </w:tc>
@@ -26546,7 +26546,7 @@
           <w:sz w:val="28"/>
           <w:szCs w:val="28"/>
         </w:rPr>
-        <w:t xml:space="preserve">  เม​ทริกซ์​ความ​สับสน​รวม 16 สภาวะ (1,600 การ​ทำนาย​ต่อ​วิธี) ของ 4 วิธี​สำคัญ​ใน​การ​ทดลอง​ที่ 2 บน​ชุด​ข้อมูล NIH ChestX-ray14</w:t>
+        <w:t xml:space="preserve">  เมทริกซ์ความสับสนรวม 16 สภาวะ (1,600 การทำนายต่อวิธี) ของ 4 วิธีสำคัญในการทดลองที่ 2 บนชุดข้อมูล NIH ChestX-ray14</w:t>
       </w:r>
     </w:p>
     <w:p>
@@ -26617,7 +26617,7 @@
           <w:sz w:val="28"/>
           <w:szCs w:val="28"/>
         </w:rPr>
-        <w:t xml:space="preserve">  เม​ทริกซ์​ความ​สับสน​รวม 16 สภาวะ (1,600 การ​ทำนาย​ต่อ​วิธี) ของ 4 วิธี​สำคัญ​ใน​การ​ทดลอง​ที่ 2 บน​ชุด​ข้อมูล VinBigData</w:t>
+        <w:t xml:space="preserve">  เมทริกซ์ความสับสนรวม 16 สภาวะ (1,600 การทำนายต่อวิธี) ของ 4 วิธีสำคัญในการทดลองที่ 2 บนชุดข้อมูล VinBigData</w:t>
       </w:r>
     </w:p>
     <w:p>
@@ -26642,7 +26642,7 @@
           <w:sz w:val="28"/>
           <w:szCs w:val="28"/>
         </w:rPr>
-        <w:t xml:space="preserve">  คุณภาพ​ภาพ (PSNR/SSIM) เทียบ​กับ​ประสิทธิภาพ​การ​จำแนก​โรค กรณี​ศึกษา Gaussian N3</w:t>
+        <w:t xml:space="preserve">  คุณภาพภาพ (PSNR/SSIM) เทียบกับประสิทธิภาพการจำแนกโรค กรณีศึกษา Gaussian N3</w:t>
       </w:r>
     </w:p>
     <w:tbl>
@@ -27824,7 +27824,7 @@
           <w:sz w:val="28"/>
           <w:szCs w:val="28"/>
         </w:rPr>
-        <w:t xml:space="preserve">  ความ​สัมพันธ์​ระหว่าง​ค่า PSNR เฉลี่ย​กับ ROC-AUC ของ​แต่ละ​วิธี​ที่​สภาวะ Gaussian N3 บน​ชุด​ข้อมูล NIH ChestX-ray14</w:t>
+        <w:t xml:space="preserve">  ความสัมพันธ์ระหว่างค่า PSNR เฉลี่ยกับ ROC-AUC ของแต่ละวิธีที่สภาวะ Gaussian N3 บนชุดข้อมูล NIH ChestX-ray14</w:t>
       </w:r>
     </w:p>
     <w:p>
@@ -27841,7 +27841,7 @@
           <w:sz w:val="28"/>
           <w:szCs w:val="28"/>
         </w:rPr>
-        <w:t xml:space="preserve">การ​วิเคราะห์​ผล​การ​ทดลอง</w:t>
+        <w:t xml:space="preserve">การวิเคราะห์ผลการทดลอง</w:t>
       </w:r>
     </w:p>
     <w:p>
@@ -27858,15 +27858,15 @@
           <w:sz w:val="28"/>
           <w:szCs w:val="28"/>
         </w:rPr>
-        <w:t xml:space="preserve">1. ผลก​ระ​ทบ​ของ​การ​เพิ่ม​ระดับ​เป็น L4 และ​หลัก​ฐาน​เชิง​ประจักษ์​ของ​ภาวะ Over-smoothing:</w:t>
-      </w:r>
-      <w:r>
-        <w:rPr>
-          <w:rFonts w:ascii="TH Sarabun New" w:cs="TH Sarabun New" w:eastAsia="TH Sarabun New" w:hAnsi="TH Sarabun New"/>
-          <w:sz w:val="28"/>
-          <w:szCs w:val="28"/>
-        </w:rPr>
-        <w:t xml:space="preserve"> ใน​การ​ทดลอง​ที่ 1 เมื่อ​เพิ่ม​ขนาด​ตัว​กรอง Median Filter จาก L3 (7×7) เป็น L4 (9×9) ความ​แม่นยำ​ลด​ลง​ทั้ง​ใน​ชุด​ข้อมูล NIH (จาก 59.00% เหลือ 57.00% และ F1-Score ลด​จาก 0.7007 เหลือ 0.6767) และ​ชุด​ข้อมูล VinBigData (จาก 91.00% เหลือ 87.00% และ F1-Score ลด​จาก 0.9072 เหลือ 0.8762) สอดคล้อง​กับ​ผล​ใน​การ​ทดลอง​ที่ 2 ที่​สภาวะ Gaussian N3 ซึ่ง Median L3 ให้​ค่า PSNR สูง​ที่สุด (29.79 dB บน NIH และ 29.85 dB บน VinBigData) แต่​ค่า ROC-AUC บน NIH ลด​ลง​จาก 0.6688 เหลือ 0.5624 และ Accuracy บน VinBigData ลด​ลง​จาก 99% เหลือ 94% (ตาราง​ที่ 9 และ​ภาพ​ที่ 6) แสดง​ว่าการ​เกลี่ย​ภาพ​ที่​รุนแรง​เกิน​ไป​ทำให้​ภาพ "ใกล้​ภาพ​อ้างอิง" มาก​ขึ้น​ใน​เชิง​สถิติ แต่​ลบ​เลือน​ขอบ​ฝ้า​จาง ๆ ของ Infiltration ที่​แบบ​จำลอง​ต้อง​ใช้​ใน​การ​จำแนก</w:t>
+        <w:t xml:space="preserve">1. ผลกระทบของการเพิ่มระดับเป็น L4 และหลักฐานเชิงประจักษ์ของภาวะ Over-smoothing:</w:t>
+      </w:r>
+      <w:r>
+        <w:rPr>
+          <w:rFonts w:ascii="TH Sarabun New" w:cs="TH Sarabun New" w:eastAsia="TH Sarabun New" w:hAnsi="TH Sarabun New"/>
+          <w:sz w:val="28"/>
+          <w:szCs w:val="28"/>
+        </w:rPr>
+        <w:t xml:space="preserve"> ในการทดลองที่ 1 เมื่อเพิ่มขนาดตัวกรอง Median Filter จาก L3 (7×7) เป็น L4 (9×9) ความแม่นยำลดลงทั้งในชุดข้อมูล NIH (จาก 59.00% เหลือ 57.00% และ F1-Score ลดจาก 0.7007 เหลือ 0.6767) และชุดข้อมูล VinBigData (จาก 91.00% เหลือ 87.00% และ F1-Score ลดจาก 0.9072 เหลือ 0.8762) สอดคล้องกับผลในการทดลองที่ 2 ที่สภาวะ Gaussian N3 ซึ่ง Median L3 ให้ค่า PSNR สูงที่สุด (29.79 dB บน NIH และ 29.85 dB บน VinBigData) แต่ค่า ROC-AUC บน NIH ลดลงจาก 0.6688 เหลือ 0.5624 และ Accuracy บน VinBigData ลดลงจาก 99% เหลือ 94% (ตารางที่ 9 และภาพที่ 6) แสดงว่าการเกลี่ยภาพที่รุนแรงเกินไปทำให้ภาพ "ใกล้ภาพอ้างอิง" มากขึ้นในเชิงสถิติ แต่ลบเลือนขอบฝ้าจาง ๆ ของ Infiltration ที่แบบจำลองต้องใช้ในการจำแนก</w:t>
       </w:r>
     </w:p>
     <w:p>
@@ -27883,15 +27883,15 @@
           <w:sz w:val="28"/>
           <w:szCs w:val="28"/>
         </w:rPr>
-        <w:t xml:space="preserve">2. ผล​ของ​การ​ทดลอง​ที่ 1 บน​ภาพ​ต้นฉบับ​ยัง​ไม่​ชี้​ผู้​ชนะ​ที่​ชัดเจน:</w:t>
-      </w:r>
-      <w:r>
-        <w:rPr>
-          <w:rFonts w:ascii="TH Sarabun New" w:cs="TH Sarabun New" w:eastAsia="TH Sarabun New" w:hAnsi="TH Sarabun New"/>
-          <w:sz w:val="28"/>
-          <w:szCs w:val="28"/>
-        </w:rPr>
-        <w:t xml:space="preserve"> บน NIH ค่า Accuracy ของ​ทุก​สภาวะ​อยู่​ใน​ช่วง 49–59% โดย Pure DWT L1 ให้ ROC-AUC สูงสุด (0.6616) และ CLAHE + DWT L1 ให้ Recall สูงสุด (0.9800) แต่​แบบ​จำลอง​ส่วน​ใหญ่​มี​แนว​โน้ม​ทำนาย​เป็น Infiltration มาก​เกิน​ไป (Specificity ต่ำ) บน VinBigData ภาพ​ดิบ (Baseline) ให้ Accuracy และ F1-Score สูงสุด (0.9200 และ 0.9231) ขณะ​ที่​การ​สังเคราะห์​ภาพ​เฉพาะ​ย่าน​ความถี่​เดียว (Low, Mid หรือ High Only) ทำให้ Accuracy ลด​ลง​เหลือ 78–85% แสดง​ว่า​ข้อมูล​ที่​จำเป็น​ต่อ​การ​จำแนก​กระจาย​อยู่​หลาย​ย่าน​ความถี่ ผล​นี้​เป็น​เหตุผล​ให้​พัฒนาการ​รวม​หลาย​มุม​มอง​ความถี่​ใน​การ​ทดลอง​ที่ 2</w:t>
+        <w:t xml:space="preserve">2. ผลของการทดลองที่ 1 บนภาพต้นฉบับยังไม่ชี้ผู้ชนะที่ชัดเจน:</w:t>
+      </w:r>
+      <w:r>
+        <w:rPr>
+          <w:rFonts w:ascii="TH Sarabun New" w:cs="TH Sarabun New" w:eastAsia="TH Sarabun New" w:hAnsi="TH Sarabun New"/>
+          <w:sz w:val="28"/>
+          <w:szCs w:val="28"/>
+        </w:rPr>
+        <w:t xml:space="preserve"> บน NIH ค่า Accuracy ของทุกสภาวะอยู่ในช่วง 49–59% โดย Pure DWT L1 ให้ ROC-AUC สูงสุด (0.6616) และ CLAHE + DWT L1 ให้ Recall สูงสุด (0.9800) แต่แบบจำลองส่วนใหญ่มีแนวโน้มทำนายเป็น Infiltration มากเกินไป (Specificity ต่ำ) บน VinBigData ภาพดิบ (Baseline) ให้ Accuracy และ F1-Score สูงสุด (0.9200 และ 0.9231) ขณะที่การสังเคราะห์ภาพเฉพาะย่านความถี่เดียว (Low, Mid หรือ High Only) ทำให้ Accuracy ลดลงเหลือ 78–85% แสดงว่าข้อมูลที่จำเป็นต่อการจำแนกกระจายอยู่หลายย่านความถี่ ผลนี้เป็นเหตุผลให้พัฒนาการรวมหลายมุมมองความถี่ในการทดลองที่ 2</w:t>
       </w:r>
     </w:p>
     <w:p>
@@ -27908,15 +27908,15 @@
           <w:sz w:val="28"/>
           <w:szCs w:val="28"/>
         </w:rPr>
-        <w:t xml:space="preserve">3. ประสิทธิภาพ​ของ DAE + CLAHE (โดย​เฉพาะ dae_clahe_strength_L2):</w:t>
-      </w:r>
-      <w:r>
-        <w:rPr>
-          <w:rFonts w:ascii="TH Sarabun New" w:cs="TH Sarabun New" w:eastAsia="TH Sarabun New" w:hAnsi="TH Sarabun New"/>
-          <w:sz w:val="28"/>
-          <w:szCs w:val="28"/>
-        </w:rPr>
-        <w:t xml:space="preserve"> ใน​การ​ทดสอบ​ความ​ทนทาน​ต่อ​สัญญาณ​รบกวน 16 สภาวะ DAE → CLAHE L2 ได้​อันดับ 1 ใน​กลุ่ม​ภาพ​เดี่ยว (1 View) ตรง​กัน​ทั้ง 2 ชุด​ข้อมูล โดย​บน NIH ได้ Mean ROC-AUC = 0.6711 และ Mean Accuracy = 62.13% (เพิ่ม​ขึ้น​จาก Baseline 4.69 จุด​เปอร์เซ็นต์ และ​เพิ่ม Specificity จาก 48.63% เป็น 60.88%) และ​บน VinBigData ได้ Mean ROC-AUC = 0.9970 และ Mean Accuracy = 96.50% (เพิ่ม​ขึ้น​จาก Baseline 1.13 จุด​เปอร์เซ็นต์ และ​เพิ่ม Recall จาก 93.50% เป็น 97.50%)</w:t>
+        <w:t xml:space="preserve">3. ประสิทธิภาพของ DAE + CLAHE (โดยเฉพาะ dae_clahe_strength_L2):</w:t>
+      </w:r>
+      <w:r>
+        <w:rPr>
+          <w:rFonts w:ascii="TH Sarabun New" w:cs="TH Sarabun New" w:eastAsia="TH Sarabun New" w:hAnsi="TH Sarabun New"/>
+          <w:sz w:val="28"/>
+          <w:szCs w:val="28"/>
+        </w:rPr>
+        <w:t xml:space="preserve"> ในการทดสอบความทนทานต่อสัญญาณรบกวน 16 สภาวะ DAE → CLAHE L2 ได้อันดับ 1 ในกลุ่มภาพเดี่ยว (1 View) ตรงกันทั้ง 2 ชุดข้อมูล โดยบน NIH ได้ Mean ROC-AUC = 0.6711 และ Mean Accuracy = 62.13% (เพิ่มขึ้นจาก Baseline 4.69 จุดเปอร์เซ็นต์ และเพิ่ม Specificity จาก 48.63% เป็น 60.88%) และบน VinBigData ได้ Mean ROC-AUC = 0.9970 และ Mean Accuracy = 96.50% (เพิ่มขึ้นจาก Baseline 1.13 จุดเปอร์เซ็นต์ และเพิ่ม Recall จาก 93.50% เป็น 97.50%)</w:t>
       </w:r>
     </w:p>
     <w:p>
@@ -27933,15 +27933,15 @@
           <w:sz w:val="28"/>
           <w:szCs w:val="28"/>
         </w:rPr>
-        <w:t xml:space="preserve">4. ประสิทธิภาพ​ของ​การ​รวม​เทคนิค​เชิง​ความถี่:</w:t>
-      </w:r>
-      <w:r>
-        <w:rPr>
-          <w:rFonts w:ascii="TH Sarabun New" w:cs="TH Sarabun New" w:eastAsia="TH Sarabun New" w:hAnsi="TH Sarabun New"/>
-          <w:sz w:val="28"/>
-          <w:szCs w:val="28"/>
-        </w:rPr>
-        <w:t xml:space="preserve"> การ​รวม​ย่าน​ความถี่​ต่ำ–กลาง–สูง​ด้วย DFT (3 Views) ช่วย​ยก​ระดับ Mean ROC-AUC บน NIH เป็น 0.6401 (สูง​กว่า Baseline 0.6367 เล็ก​น้อย) และ​ได้​อันดับ 1 โดย​รวม​บน VinBigData ด้วย Mean ROC-AUC = 0.9991, Mean Accuracy = 97.81% และ Recall = 98.38% ขณะ​ที่​การ​รวม DWT ระดับ 1–4 (5 Views) ให้​ผล​ต่ำ​กว่า Baseline ทั้ง 2 ชุด​ข้อมูล แสดง​ว่าการ​เพิ่ม​จำนวน​มุม​มอง​ไม่​ได้​ช่วย​เสมอ​ไป และ​วิธี​แยก​ย่าน​ความถี่​มี​ผล​ต่อ​ประสิทธิภาพ</w:t>
+        <w:t xml:space="preserve">4. ประสิทธิภาพของการรวมเทคนิคเชิงความถี่:</w:t>
+      </w:r>
+      <w:r>
+        <w:rPr>
+          <w:rFonts w:ascii="TH Sarabun New" w:cs="TH Sarabun New" w:eastAsia="TH Sarabun New" w:hAnsi="TH Sarabun New"/>
+          <w:sz w:val="28"/>
+          <w:szCs w:val="28"/>
+        </w:rPr>
+        <w:t xml:space="preserve"> การรวมย่านความถี่ต่ำ–กลาง–สูงด้วย DFT (3 Views) ช่วยยกระดับ Mean ROC-AUC บน NIH เป็น 0.6401 (สูงกว่า Baseline 0.6367 เล็กน้อย) และได้อันดับ 1 โดยรวมบน VinBigData ด้วย Mean ROC-AUC = 0.9991, Mean Accuracy = 97.81% และ Recall = 98.38% ขณะที่การรวม DWT ระดับ 1–4 (5 Views) ให้ผลต่ำกว่า Baseline ทั้ง 2 ชุดข้อมูล แสดงว่าการเพิ่มจำนวนมุมมองไม่ได้ช่วยเสมอไป และวิธีแยกย่านความถี่มีผลต่อประสิทธิภาพ</w:t>
       </w:r>
     </w:p>
     <w:p>
@@ -27958,15 +27958,15 @@
           <w:sz w:val="28"/>
           <w:szCs w:val="28"/>
         </w:rPr>
-        <w:t xml:space="preserve">5. ความ​จำเพาะ​ของ​แต่ละ​เทคนิค​ต่อ​ชนิด​สัญญาณ​รบกวน (Noise Family Specificity):</w:t>
-      </w:r>
-      <w:r>
-        <w:rPr>
-          <w:rFonts w:ascii="TH Sarabun New" w:cs="TH Sarabun New" w:eastAsia="TH Sarabun New" w:hAnsi="TH Sarabun New"/>
-          <w:sz w:val="28"/>
-          <w:szCs w:val="28"/>
-        </w:rPr>
-        <w:t xml:space="preserve"> DAE → CLAHE (L2/L3) เด่น​ที่สุด​ใน​การ​รับมือ​สัญญาณ​รบกวน​แบบ​กระจาย​ตัว​ต่อ​เนื่อง ได้แก่ Gaussian, Poisson, Poisson–Gaussian และ Speckle ส่วน Median Filter เด่น​ที่สุด​ใน​การ​ขจัด​สัญญาณ​รบกวน​แบบ​จุด (Salt-and-Pepper) โดย Median L1 กู้​คืน​ค่า ROC-AUC บน NIH จาก 0.6025 (Baseline) เป็น 0.6988 และ​บน VinBigData ที่​สภาวะ salt_pepper_N2 ซึ่ง​เป็น​จุด​อ่อนข​อง Baseline (Accuracy 89.00%) วิธี​ลด​สัญญาณ​รบกวน​ช่วย​กู้​คืน Accuracy เป็น 93.00–96.00% (ตาราง​ที่ 8)</w:t>
+        <w:t xml:space="preserve">5. ความจำเพาะของแต่ละเทคนิคต่อชนิดสัญญาณรบกวน (Noise Family Specificity):</w:t>
+      </w:r>
+      <w:r>
+        <w:rPr>
+          <w:rFonts w:ascii="TH Sarabun New" w:cs="TH Sarabun New" w:eastAsia="TH Sarabun New" w:hAnsi="TH Sarabun New"/>
+          <w:sz w:val="28"/>
+          <w:szCs w:val="28"/>
+        </w:rPr>
+        <w:t xml:space="preserve"> DAE → CLAHE (L2/L3) เด่นที่สุดในการรับมือสัญญาณรบกวนแบบกระจายตัวต่อเนื่อง ได้แก่ Gaussian, Poisson, Poisson–Gaussian และ Speckle ส่วน Median Filter เด่นที่สุดในการขจัดสัญญาณรบกวนแบบจุด (Salt-and-Pepper) โดย Median L1 กู้คืนค่า ROC-AUC บน NIH จาก 0.6025 (Baseline) เป็น 0.6988 และบน VinBigData ที่สภาวะ salt_pepper_N2 ซึ่งเป็นจุดอ่อนของ Baseline (Accuracy 89.00%) วิธีลดสัญญาณรบกวนช่วยกู้คืน Accuracy เป็น 93.00–96.00% (ตารางที่ 8)</w:t>
       </w:r>
     </w:p>
     <w:p>
@@ -27991,7 +27991,7 @@
           <w:sz w:val="28"/>
           <w:szCs w:val="28"/>
         </w:rPr>
-        <w:t xml:space="preserve"> ผล​เบื้อง​ต้น​สนับสนุน​ให้​เลือก DAE → CLAHE L2 เป็น​วิธี​หลัก​สำหรับ​การ​ประเมิน XAI ใน​ระยะ​ถัด​ไป โดย​เก็บ Baseline, Median L1 (สำหรับ Salt-and-Pepper) และ DFT Fusion ไว้​เป็น​คู่​เปรียบ​เทียบ ทั้งนี้​ผล​ดัง​กล่าว​มา​จาก​การ​ฝึก​ด้วย Random Seed เดียว​และ​ชุด​ทดสอบ 100 ภาพ จึง​ควร​ยืนยัน​ด้วย​การ​ฝึก​หลาย Seed ก่อน​สรุป​ผล​ทั่วไป</w:t>
+        <w:t xml:space="preserve"> ผลเบื้องต้นสนับสนุนให้เลือก DAE → CLAHE L2 เป็นวิธีหลักสำหรับการประเมิน XAI ในระยะถัดไป โดยเก็บ Baseline, Median L1 (สำหรับ Salt-and-Pepper) และ DFT Fusion ไว้เป็นคู่เปรียบเทียบ ทั้งนี้ผลดังกล่าวมาจากการฝึกด้วย Random Seed เดียวและชุดทดสอบ 100 ภาพ จึงควรยืนยันด้วยการฝึกหลาย Seed ก่อนสรุปผลทั่วไป</w:t>
       </w:r>
     </w:p>
     <w:p>
@@ -28007,7 +28007,7 @@
           <w:sz w:val="32"/>
           <w:szCs w:val="32"/>
         </w:rPr>
-        <w:t xml:space="preserve">6. ขอบเขต​และ​ข้อ​จำกัด​ของ​การ​วิจัย</w:t>
+        <w:t xml:space="preserve">6. ขอบเขตและข้อจำกัดของการวิจัย</w:t>
       </w:r>
     </w:p>
     <w:p>
@@ -28024,7 +28024,7 @@
           <w:sz w:val="28"/>
           <w:szCs w:val="28"/>
         </w:rPr>
-        <w:t xml:space="preserve">6.1 ขอบเขต​การ​วิจัย (Research Scope)</w:t>
+        <w:t xml:space="preserve">6.1 ขอบเขตการวิจัย (Research Scope)</w:t>
       </w:r>
     </w:p>
     <w:p>
@@ -28052,15 +28052,15 @@
           <w:sz w:val="28"/>
           <w:szCs w:val="28"/>
         </w:rPr>
-        <w:t xml:space="preserve">ชุด​ข้อมูล​ที่​ใช้:</w:t>
-      </w:r>
-      <w:r>
-        <w:rPr>
-          <w:rFonts w:ascii="TH Sarabun New" w:cs="TH Sarabun New" w:eastAsia="TH Sarabun New" w:hAnsi="TH Sarabun New"/>
-          <w:sz w:val="28"/>
-          <w:szCs w:val="28"/>
-        </w:rPr>
-        <w:t xml:space="preserve"> มุ่ง​เน้น​การ​ตรวจ​จับ​ภาวะ​ปอด​อักเสบ (Infiltration) เทียบ​กับ​ปอด​ปกติ (No Finding) บน​ชุด​ข้อมูล​มาตรฐาน 2 ชุด ได้แก่ NIH ChestX-ray14 และ VinBigData Chest X-ray โดย​แบ่ง​ชุด​ข้อมูล​ระดับ​ผู้​ป่วย (Patient-level Split) เพื่อ​ป้องกัน​การ​รั่ว​ไหล​ของ​ข้อมูล (Data Leakage)</w:t>
+        <w:t xml:space="preserve">ชุดข้อมูลที่ใช้:</w:t>
+      </w:r>
+      <w:r>
+        <w:rPr>
+          <w:rFonts w:ascii="TH Sarabun New" w:cs="TH Sarabun New" w:eastAsia="TH Sarabun New" w:hAnsi="TH Sarabun New"/>
+          <w:sz w:val="28"/>
+          <w:szCs w:val="28"/>
+        </w:rPr>
+        <w:t xml:space="preserve"> มุ่งเน้นการตรวจจับภาวะปอดอักเสบ (Infiltration) เทียบกับปอดปกติ (No Finding) บนชุดข้อมูลมาตรฐาน 2 ชุด ได้แก่ NIH ChestX-ray14 และ VinBigData Chest X-ray โดยแบ่งชุดข้อมูลระดับผู้ป่วย (Patient-level Split) เพื่อป้องกันการรั่วไหลของข้อมูล (Data Leakage)</w:t>
       </w:r>
     </w:p>
     <w:p>
@@ -28088,15 +28088,15 @@
           <w:sz w:val="28"/>
           <w:szCs w:val="28"/>
         </w:rPr>
-        <w:t xml:space="preserve">แบบ​จำ​ลอง​และ​อัล​กอ​ริ​ทึม:</w:t>
-      </w:r>
-      <w:r>
-        <w:rPr>
-          <w:rFonts w:ascii="TH Sarabun New" w:cs="TH Sarabun New" w:eastAsia="TH Sarabun New" w:hAnsi="TH Sarabun New"/>
-          <w:sz w:val="28"/>
-          <w:szCs w:val="28"/>
-        </w:rPr>
-        <w:t xml:space="preserve"> ใช้ ResNet-50 เป็น​สถาปัตยกรรม​หลัก​ภาย​ใต้​สภาวะ​ควบคุม​คงที่ (Fair Comparison) ร่วม​กับ​เทคนิค​การ​ลด​สัญญาณ​รบกวน​หลาย​ระดับ (L1–L4) ได้แก่ Median Filter, CLAHE + DWT, DAE + CLAHE และ Pure DWT การ​แยก​ย่าน​ความถี่ (DWT/DFT) และ​การ​รวม​เทคนิค (Multi-view Fusion) รวม​ถึง​การ​ทดสอบ​บน​ภาพ​จำลอง​สัญญาณ​รบกวน 5 ตระกูล 3 ระดับ​ความ​แรง</w:t>
+        <w:t xml:space="preserve">แบบจำลองและอัลกอริทึม:</w:t>
+      </w:r>
+      <w:r>
+        <w:rPr>
+          <w:rFonts w:ascii="TH Sarabun New" w:cs="TH Sarabun New" w:eastAsia="TH Sarabun New" w:hAnsi="TH Sarabun New"/>
+          <w:sz w:val="28"/>
+          <w:szCs w:val="28"/>
+        </w:rPr>
+        <w:t xml:space="preserve"> ใช้ ResNet-50 เป็นสถาปัตยกรรมหลักภายใต้สภาวะควบคุมคงที่ (Fair Comparison) ร่วมกับเทคนิคการลดสัญญาณรบกวนหลายระดับ (L1–L4) ได้แก่ Median Filter, CLAHE + DWT, DAE + CLAHE และ Pure DWT การแยกย่านความถี่ (DWT/DFT) และการรวมเทคนิค (Multi-view Fusion) รวมถึงการทดสอบบนภาพจำลองสัญญาณรบกวน 5 ตระกูล 3 ระดับความแรง</w:t>
       </w:r>
     </w:p>
     <w:p>
@@ -28124,15 +28124,15 @@
           <w:sz w:val="28"/>
           <w:szCs w:val="28"/>
         </w:rPr>
-        <w:t xml:space="preserve">ปัญญา​ประดิษฐ์​ที่​อธิบาย​ได้ (Explainable AI):</w:t>
-      </w:r>
-      <w:r>
-        <w:rPr>
-          <w:rFonts w:ascii="TH Sarabun New" w:cs="TH Sarabun New" w:eastAsia="TH Sarabun New" w:hAnsi="TH Sarabun New"/>
-          <w:sz w:val="28"/>
-          <w:szCs w:val="28"/>
-        </w:rPr>
-        <w:t xml:space="preserve"> ประยุกต์​ใช้​เทคนิค Grad-CAM และ SHAP เพื่อ​สร้าง​แผนที่​ความ​สนใจ​เชิง​พื้นที่ (Saliency Map)</w:t>
+        <w:t xml:space="preserve">ปัญญาประดิษฐ์ที่อธิบายได้ (Explainable AI):</w:t>
+      </w:r>
+      <w:r>
+        <w:rPr>
+          <w:rFonts w:ascii="TH Sarabun New" w:cs="TH Sarabun New" w:eastAsia="TH Sarabun New" w:hAnsi="TH Sarabun New"/>
+          <w:sz w:val="28"/>
+          <w:szCs w:val="28"/>
+        </w:rPr>
+        <w:t xml:space="preserve"> ประยุกต์ใช้เทคนิค Grad-CAM และ SHAP เพื่อสร้างแผนที่ความสนใจเชิงพื้นที่ (Saliency Map)</w:t>
       </w:r>
     </w:p>
     <w:p>
@@ -28160,15 +28160,15 @@
           <w:sz w:val="28"/>
           <w:szCs w:val="28"/>
         </w:rPr>
-        <w:t xml:space="preserve">การ​ประเมิน​ผล:</w:t>
-      </w:r>
-      <w:r>
-        <w:rPr>
-          <w:rFonts w:ascii="TH Sarabun New" w:cs="TH Sarabun New" w:eastAsia="TH Sarabun New" w:hAnsi="TH Sarabun New"/>
-          <w:sz w:val="28"/>
-          <w:szCs w:val="28"/>
-        </w:rPr>
-        <w:t xml:space="preserve"> ประเมิน​ประสิทธิภาพ​การ​จำแนก​โรค (Accuracy, Precision, Sensitivity, Specificity, F1-Score, ROC-AUC, PR-AUC) คุณภาพ​ภาพ (PSNR, SSIM) และ​ความ​ถูก​ต้อง​ของ​การ​ชี้​ตำแหน่ง​รอย​โรค​เชิง​สถิติ (Pointing Game Hit Rate, Energy Inside Bounding Box, IoU) เทียบ​กับ​พิกัด​รอย​โรค​จริง​ของ​รังสีแพทย์</w:t>
+        <w:t xml:space="preserve">การประเมินผล:</w:t>
+      </w:r>
+      <w:r>
+        <w:rPr>
+          <w:rFonts w:ascii="TH Sarabun New" w:cs="TH Sarabun New" w:eastAsia="TH Sarabun New" w:hAnsi="TH Sarabun New"/>
+          <w:sz w:val="28"/>
+          <w:szCs w:val="28"/>
+        </w:rPr>
+        <w:t xml:space="preserve"> ประเมินประสิทธิภาพการจำแนกโรค (Accuracy, Precision, Sensitivity, Specificity, F1-Score, ROC-AUC, PR-AUC) คุณภาพภาพ (PSNR, SSIM) และความถูกต้องของการชี้ตำแหน่งรอยโรคเชิงสถิติ (Pointing Game Hit Rate, Energy Inside Bounding Box, IoU) เทียบกับพิกัดรอยโรคจริงของรังสีแพทย์</w:t>
       </w:r>
     </w:p>
     <w:p>
@@ -28185,7 +28185,7 @@
           <w:sz w:val="28"/>
           <w:szCs w:val="28"/>
         </w:rPr>
-        <w:t xml:space="preserve">6.2 ขอบเขต​ด้าน​เครื่อง​มือ ซอฟต์แวร์ และ​ทรัพยากร​การ​ประมวล​ผล (Tools &amp; Computing Scope)</w:t>
+        <w:t xml:space="preserve">6.2 ขอบเขตด้านเครื่องมือ ซอฟต์แวร์ และทรัพยากรการประมวลผล (Tools &amp; Computing Scope)</w:t>
       </w:r>
     </w:p>
     <w:p>
@@ -28213,15 +28213,15 @@
           <w:sz w:val="28"/>
           <w:szCs w:val="28"/>
         </w:rPr>
-        <w:t xml:space="preserve">ภาษา​และ​ไลบรารี​หลัก:</w:t>
-      </w:r>
-      <w:r>
-        <w:rPr>
-          <w:rFonts w:ascii="TH Sarabun New" w:cs="TH Sarabun New" w:eastAsia="TH Sarabun New" w:hAnsi="TH Sarabun New"/>
-          <w:sz w:val="28"/>
-          <w:szCs w:val="28"/>
-        </w:rPr>
-        <w:t xml:space="preserve"> ใช้​ภาษา Python ร่วม​กับ​เฟรม​เวิร์ก PyTorch และ Torchvision ใน​การ​พัฒนา​และ​ฝึกสอน​แบบ​จำลอง, Scikit-learn สำหรับ​การ​ประเมิน​ตัว​ชี้​วัด, OpenCV และ PyWavelets สำหรับ​การ​ประมวล​ผล​ภาพ​และ​การ​แป​ลง​เวฟ​เล็ต และ Scikit-image สำหรับ​การ​จำลอง​สัญญาณ​รบกวน​และ​วัด​คุณภาพ​ภาพ</w:t>
+        <w:t xml:space="preserve">ภาษาและไลบรารีหลัก:</w:t>
+      </w:r>
+      <w:r>
+        <w:rPr>
+          <w:rFonts w:ascii="TH Sarabun New" w:cs="TH Sarabun New" w:eastAsia="TH Sarabun New" w:hAnsi="TH Sarabun New"/>
+          <w:sz w:val="28"/>
+          <w:szCs w:val="28"/>
+        </w:rPr>
+        <w:t xml:space="preserve"> ใช้ภาษา Python ร่วมกับเฟรมเวิร์ก PyTorch และ Torchvision ในการพัฒนาและฝึกสอนแบบจำลอง, Scikit-learn สำหรับการประเมินตัวชี้วัด, OpenCV และ PyWavelets สำหรับการประมวลผลภาพและการแปลงเวฟเล็ต และ Scikit-image สำหรับการจำลองสัญญาณรบกวนและวัดคุณภาพภาพ</w:t>
       </w:r>
     </w:p>
     <w:p>
@@ -28249,15 +28249,15 @@
           <w:sz w:val="28"/>
           <w:szCs w:val="28"/>
         </w:rPr>
-        <w:t xml:space="preserve">เครื่อง​มือ​สำหรับ​ปัญญา​ประดิษฐ์​ที่​อธิบาย​ได้ (XAI):</w:t>
-      </w:r>
-      <w:r>
-        <w:rPr>
-          <w:rFonts w:ascii="TH Sarabun New" w:cs="TH Sarabun New" w:eastAsia="TH Sarabun New" w:hAnsi="TH Sarabun New"/>
-          <w:sz w:val="28"/>
-          <w:szCs w:val="28"/>
-        </w:rPr>
-        <w:t xml:space="preserve"> ใช้​ไลบรารี PyTorch Grad-CAM สำหรับ​สร้าง Saliency Map และ​ไลบรารี SHAP สำหรับ​วิเคราะห์​การ​มี​ส่วน​ร่วม​ของ​พิกเซล (Pixel Attribution)</w:t>
+        <w:t xml:space="preserve">เครื่องมือสำหรับปัญญาประดิษฐ์ที่อธิบายได้ (XAI):</w:t>
+      </w:r>
+      <w:r>
+        <w:rPr>
+          <w:rFonts w:ascii="TH Sarabun New" w:cs="TH Sarabun New" w:eastAsia="TH Sarabun New" w:hAnsi="TH Sarabun New"/>
+          <w:sz w:val="28"/>
+          <w:szCs w:val="28"/>
+        </w:rPr>
+        <w:t xml:space="preserve"> ใช้ไลบรารี PyTorch Grad-CAM สำหรับสร้าง Saliency Map และไลบรารี SHAP สำหรับวิเคราะห์การมีส่วนร่วมของพิกเซล (Pixel Attribution)</w:t>
       </w:r>
     </w:p>
     <w:p>
@@ -28285,15 +28285,15 @@
           <w:sz w:val="28"/>
           <w:szCs w:val="28"/>
         </w:rPr>
-        <w:t xml:space="preserve">สภาพ​แวดล้อม​และ​ทรัพยากร​การ​ประมวล​ผล:</w:t>
-      </w:r>
-      <w:r>
-        <w:rPr>
-          <w:rFonts w:ascii="TH Sarabun New" w:cs="TH Sarabun New" w:eastAsia="TH Sarabun New" w:hAnsi="TH Sarabun New"/>
-          <w:sz w:val="28"/>
-          <w:szCs w:val="28"/>
-        </w:rPr>
-        <w:t xml:space="preserve"> ดำเนิน​การ​บน Google Colab Pro โดย​ใช้​หน่วย​ประมวล​ผลก​รา​ฟิก (GPU) สำหรับ​การ​ฝึกสอน​และ​ทดสอบ​แบบ​จำลอง ResNet-50 และ Denoising Autoencoder (DAE)</w:t>
+        <w:t xml:space="preserve">สภาพแวดล้อมและทรัพยากรการประมวลผล:</w:t>
+      </w:r>
+      <w:r>
+        <w:rPr>
+          <w:rFonts w:ascii="TH Sarabun New" w:cs="TH Sarabun New" w:eastAsia="TH Sarabun New" w:hAnsi="TH Sarabun New"/>
+          <w:sz w:val="28"/>
+          <w:szCs w:val="28"/>
+        </w:rPr>
+        <w:t xml:space="preserve"> ดำเนินการบน Google Colab Pro โดยใช้หน่วยประมวลผลกราฟิก (GPU) สำหรับการฝึกสอนและทดสอบแบบจำลอง ResNet-50 และ Denoising Autoencoder (DAE)</w:t>
       </w:r>
     </w:p>
     <w:p>
@@ -28310,7 +28310,7 @@
           <w:sz w:val="28"/>
           <w:szCs w:val="28"/>
         </w:rPr>
-        <w:t xml:space="preserve">6.3 ข้อ​จำกัด​ของ​การ​วิจัย (Limitations)</w:t>
+        <w:t xml:space="preserve">6.3 ข้อจำกัดของการวิจัย (Limitations)</w:t>
       </w:r>
     </w:p>
     <w:p>
@@ -28336,7 +28336,7 @@
           <w:sz w:val="28"/>
           <w:szCs w:val="28"/>
         </w:rPr>
-        <w:t xml:space="preserve">โครง​งาน​นี้​จัด​ทำ​ขึ้น​เพื่อ​วัตถุประสงค์​ทางการ​ศึกษา​และ​การ​วิจัย​เบื้อง​ต้น​เท่านั้น มิได้​มุ่ง​หมาย​ให้​นำ​ไป​ใช้​วินิจฉัย​โรค​ทาง​คลินิก​จริง​โดย​ไม่​ผ่าน​การ​ตรวจ​สอบ​และ​รับรอง​จาก​ผู้​เชี่ยวชาญ​ทางการ​แพทย์</w:t>
+        <w:t xml:space="preserve">โครงงานนี้จัดทำขึ้นเพื่อวัตถุประสงค์ทางการศึกษาและการวิจัยเบื้องต้นเท่านั้น มิได้มุ่งหมายให้นำไปใช้วินิจฉัยโรคทางคลินิกจริงโดยไม่ผ่านการตรวจสอบและรับรองจากผู้เชี่ยวชาญทางการแพทย์</w:t>
       </w:r>
     </w:p>
     <w:p>
@@ -28362,7 +28362,7 @@
           <w:sz w:val="28"/>
           <w:szCs w:val="28"/>
         </w:rPr>
-        <w:t xml:space="preserve">รอย​โรค Infiltration มี​ลักษณะ​เป็น​ฝ้า​กระจาย​ตัว ขอบเขต​ไม่​ชัดเจน และ​มี​ความ​แปรปรวน​ของ​การ​อ่าน​ผล​ระหว่าง​แพทย์​ผู้​เชี่ยวชาญ (Inter-observer Variability) ซึ่ง​อาจ​ส่ง​ผล​ต่อ​ความ​แม่นยำ​ของ​ฉลาก​และ​กรอบ Bounding Box อ้างอิง</w:t>
+        <w:t xml:space="preserve">รอยโรค Infiltration มีลักษณะเป็นฝ้ากระจายตัว ขอบเขตไม่ชัดเจน และมีความแปรปรวนของการอ่านผลระหว่างแพทย์ผู้เชี่ยวชาญ (Inter-observer Variability) ซึ่งอาจส่งผลต่อความแม่นยำของฉลากและกรอบ Bounding Box อ้างอิง</w:t>
       </w:r>
     </w:p>
     <w:p>
@@ -28388,7 +28388,7 @@
           <w:sz w:val="28"/>
           <w:szCs w:val="28"/>
         </w:rPr>
-        <w:t xml:space="preserve">สัญญาณ​รบกวน​จำลอง​ใช้​เพื่อ​วัด​ความ​ทนทาน​ของ​แบบ​จำลอง​ภาย​ใต้​เงื่อนไข​ควบคุม ไม่​ได้​เป็น​ตัวแทน​สัญญาณ​รบกวน​ทาง​กายภาพ​ของ​เครื่อง​เอกซเรย์​จริง​ทุก​รูป​แบบ</w:t>
+        <w:t xml:space="preserve">สัญญาณรบกวนจำลองใช้เพื่อวัดความทนทานของแบบจำลองภายใต้เงื่อนไขควบคุม ไม่ได้เป็นตัวแทนสัญญาณรบกวนทางกายภาพของเครื่องเอกซเรย์จริงทุกรูปแบบ</w:t>
       </w:r>
     </w:p>
     <w:p>
@@ -28414,7 +28414,7 @@
           <w:sz w:val="28"/>
           <w:szCs w:val="28"/>
         </w:rPr>
-        <w:t xml:space="preserve">ผล​การ​ทดลอง​เบื้อง​ต้น​มา​จาก​การ​ฝึก​ด้วย Random Seed เดียว​และ​ชุด​ทดสอบ​ขนาด 100 ภาพ​ต่อ​ชุด​ข้อมูล ความ​แตก​ต่าง​เล็ก​น้อย​ระหว่าง​วิธี​จึง​อาจ​ยัง​ไม่มี​นัย​สำคัญ​ทาง​สถิติ</w:t>
+        <w:t xml:space="preserve">ผลการทดลองเบื้องต้นมาจากการฝึกด้วย Random Seed เดียวและชุดทดสอบขนาด 100 ภาพต่อชุดข้อมูล ความแตกต่างเล็กน้อยระหว่างวิธีจึงอาจยังไม่มีนัยสำคัญทางสถิติ</w:t>
       </w:r>
     </w:p>
     <w:p>
@@ -28430,7 +28430,7 @@
           <w:sz w:val="32"/>
           <w:szCs w:val="32"/>
         </w:rPr>
-        <w:t xml:space="preserve">7. สถาน​ที่​ทำ​วิจัย</w:t>
+        <w:t xml:space="preserve">7. สถานที่ทำวิจัย</w:t>
       </w:r>
     </w:p>
     <w:p>
@@ -28445,7 +28445,7 @@
           <w:sz w:val="28"/>
           <w:szCs w:val="28"/>
         </w:rPr>
-        <w:t xml:space="preserve">สาขา​วิชา​วิทยาการ​คอมพิวเตอร์ วิทยาลัย​การ​คอมพิวเตอร์ มหาวิทยาลัย​ขอนแก่น</w:t>
+        <w:t xml:space="preserve">สาขาวิชาวิทยาการคอมพิวเตอร์ วิทยาลัยการคอมพิวเตอร์ มหาวิทยาลัยขอนแก่น</w:t>
       </w:r>
     </w:p>
     <w:p>
@@ -28461,7 +28461,7 @@
           <w:sz w:val="32"/>
           <w:szCs w:val="32"/>
         </w:rPr>
-        <w:t xml:space="preserve">8. ประโยชน์​ที่​คาด​ว่า​จะ​ได้​รับ</w:t>
+        <w:t xml:space="preserve">8. ประโยชน์ที่คาดว่าจะได้รับ</w:t>
       </w:r>
     </w:p>
     <w:p>
@@ -28487,7 +28487,7 @@
           <w:sz w:val="28"/>
           <w:szCs w:val="28"/>
         </w:rPr>
-        <w:t xml:space="preserve">ได้​แนวทาง​การ​เพิ่ม​ประสิทธิภาพ​การ​ตรวจ​จับ​ภาวะ​ปอด​อักเสบ​จาก​ภาพ​เอกซเรย์​ทรวงอก​ด้วย​การ​ลด​สัญญาณ​รบกวน​ร่วม​กับ​ปัญญา​ประดิษฐ์ พร้อม​ข้อ​แนะนำ​การ​เลือก​เทคนิค​ให้​เหมาะ​กับ​ชนิด​ของ​สัญญาณ​รบกวน</w:t>
+        <w:t xml:space="preserve">ได้แนวทางการเพิ่มประสิทธิภาพการตรวจจับภาวะปอดอักเสบจากภาพเอกซเรย์ทรวงอกด้วยการลดสัญญาณรบกวนร่วมกับปัญญาประดิษฐ์ พร้อมข้อแนะนำการเลือกเทคนิคให้เหมาะกับชนิดของสัญญาณรบกวน</w:t>
       </w:r>
     </w:p>
     <w:p>
@@ -28513,7 +28513,7 @@
           <w:sz w:val="28"/>
           <w:szCs w:val="28"/>
         </w:rPr>
-        <w:t xml:space="preserve">ได้​แบบ​จำลอง​ปัญญา​ประดิษฐ์​ที่​สามารถ​อธิบาย​เหตุผล​ของ​ผล​การ​ทำนาย​ได้ ซึ่ง​ช่วย​เพิ่ม​ความ​น่า​เชื่อ​ถือ​และ​ความ​โปร่งใส​ใน​การนำ​ไป​ใช้​สนับสนุน​การ​วินิจฉัย​ของ​บุคลากร​ทางการ​แพทย์</w:t>
+        <w:t xml:space="preserve">ได้แบบจำลองปัญญาประดิษฐ์ที่สามารถอธิบายเหตุผลของผลการทำนายได้ ซึ่งช่วยเพิ่มความน่าเชื่อถือและความโปร่งใสในการนำไปใช้สนับสนุนการวินิจฉัยของบุคลากรทางการแพทย์</w:t>
       </w:r>
     </w:p>
     <w:p>
@@ -28539,7 +28539,7 @@
           <w:sz w:val="28"/>
           <w:szCs w:val="28"/>
         </w:rPr>
-        <w:t xml:space="preserve">เป็น​แนวทาง​และ​องค์​ความ​รู้​พื้น​ฐาน​สำหรับ​การ​ต่อย​อด​งาน​วิจัย​ด้าน​การ​ประยุกต์​ใช้​ปัญญา​ประดิษฐ์​ที่​อธิบาย​ได้​ใน​ภาพ​ทางการ​แพทย์​ประเภท​อื่น ๆ ต่อ​ไป</w:t>
+        <w:t xml:space="preserve">เป็นแนวทางและองค์ความรู้พื้นฐานสำหรับการต่อยอดงานวิจัยด้านการประยุกต์ใช้ปัญญาประดิษฐ์ที่อธิบายได้ในภาพทางการแพทย์ประเภทอื่น ๆ ต่อไป</w:t>
       </w:r>
     </w:p>
     <w:p>
@@ -28565,7 +28565,7 @@
           <w:sz w:val="28"/>
           <w:szCs w:val="28"/>
         </w:rPr>
-        <w:t xml:space="preserve">ผู้​จัด​ทำได้​ฝึกฝน​ทักษะ​การ​ทบทวน​วรรณกรรม การ​พัฒนา​แบบ​จำลอง​ปัญญา​ประดิษฐ์ และ​การ​วิเคราะห์​ผลอ​ย่าง​เป็น​ระบบ ซึ่ง​เป็น​ประโยชน์​ต่อ​การ​ศึกษา​และ​การ​ทำงาน​ใน​อนาคต</w:t>
+        <w:t xml:space="preserve">ผู้จัดทำได้ฝึกฝนทักษะการทบทวนวรรณกรรม การพัฒนาแบบจำลองปัญญาประดิษฐ์ และการวิเคราะห์ผลอย่างเป็นระบบ ซึ่งเป็นประโยชน์ต่อการศึกษาและการทำงานในอนาคต</w:t>
       </w:r>
     </w:p>
     <w:p>
@@ -28581,7 +28581,7 @@
           <w:sz w:val="32"/>
           <w:szCs w:val="32"/>
         </w:rPr>
-        <w:t xml:space="preserve">9. แผน​และ​ระยะ​เวลา​ดำเนิน​การ</w:t>
+        <w:t xml:space="preserve">9. แผนและระยะเวลาดำเนินการ</w:t>
       </w:r>
     </w:p>
     <w:p>
@@ -28606,7 +28606,7 @@
           <w:sz w:val="28"/>
           <w:szCs w:val="28"/>
         </w:rPr>
-        <w:t xml:space="preserve">  แผน​และ​ระยะ​เวลา​ดำเนิน​การ</w:t>
+        <w:t xml:space="preserve">  แผนและระยะเวลาดำเนินการ</w:t>
       </w:r>
     </w:p>
     <w:tbl>
@@ -28660,7 +28660,7 @@
                 <w:sz w:val="24"/>
                 <w:szCs w:val="24"/>
               </w:rPr>
-              <w:t xml:space="preserve">การ​ดำเนิน​งาน</w:t>
+              <w:t xml:space="preserve">การดำเนินงาน</w:t>
             </w:r>
           </w:p>
         </w:tc>
@@ -29042,7 +29042,7 @@
                 <w:sz w:val="24"/>
                 <w:szCs w:val="24"/>
               </w:rPr>
-              <w:t xml:space="preserve">1. การ​จัดหา​และ​คัด​เลือก​ชุด​ข้อมูล NIH ChestX-ray14 และ VinBigData</w:t>
+              <w:t xml:space="preserve">1. การจัดหาและคัดเลือกชุดข้อมูล NIH ChestX-ray14 และ VinBigData</w:t>
             </w:r>
           </w:p>
         </w:tc>
@@ -29256,7 +29256,7 @@
                 <w:sz w:val="24"/>
                 <w:szCs w:val="24"/>
               </w:rPr>
-              <w:t xml:space="preserve">2. การเต​รี​ยม​และ​การ​ปรับ​สภาพ​ข้อมูล​ภาพ (Data Preprocessing)</w:t>
+              <w:t xml:space="preserve">2. การเตรียมและการปรับสภาพข้อมูลภาพ (Data Preprocessing)</w:t>
             </w:r>
           </w:p>
         </w:tc>
@@ -29470,7 +29470,7 @@
                 <w:sz w:val="24"/>
                 <w:szCs w:val="24"/>
               </w:rPr>
-              <w:t xml:space="preserve">3. การ​ทดลอง​ที่ 1: ลด​สัญญาณ​รบกวน L1–L4 และ​แยก​ย่าน​ความถี่ (21 สภาวะ)</w:t>
+              <w:t xml:space="preserve">3. การทดลองที่ 1: ลดสัญญาณรบกวน L1–L4 และแยกย่านความถี่ (21 สภาวะ)</w:t>
             </w:r>
           </w:p>
         </w:tc>
@@ -29685,7 +29685,7 @@
                 <w:sz w:val="24"/>
                 <w:szCs w:val="24"/>
               </w:rPr>
-              <w:t xml:space="preserve">4. การ​ทดลอง​ที่ 2: จำลอง​สัญญาณ​รบกวน 16 สภาวะ​และ​การ​รวม​เทคนิค</w:t>
+              <w:t xml:space="preserve">4. การทดลองที่ 2: จำลองสัญญาณรบกวน 16 สภาวะและการรวมเทคนิค</w:t>
             </w:r>
           </w:p>
         </w:tc>
@@ -29899,7 +29899,7 @@
                 <w:sz w:val="24"/>
                 <w:szCs w:val="24"/>
               </w:rPr>
-              <w:t xml:space="preserve">5. การ​ประเมิน​คุณภาพ​การ​กู้​คืน​ภาพ (PSNR, SSIM)</w:t>
+              <w:t xml:space="preserve">5. การประเมินคุณภาพการกู้คืนภาพ (PSNR, SSIM)</w:t>
             </w:r>
           </w:p>
         </w:tc>
@@ -30113,7 +30113,7 @@
                 <w:sz w:val="24"/>
                 <w:szCs w:val="24"/>
               </w:rPr>
-              <w:t xml:space="preserve">6. การ​ฝึกสอน​แบบ​จำลอง​ยืนยัน​ผล​หลาย Seed (Fair Comparison)</w:t>
+              <w:t xml:space="preserve">6. การฝึกสอนแบบจำลองยืนยันผลหลาย Seed (Fair Comparison)</w:t>
             </w:r>
           </w:p>
         </w:tc>
@@ -30329,7 +30329,7 @@
                 <w:sz w:val="24"/>
                 <w:szCs w:val="24"/>
               </w:rPr>
-              <w:t xml:space="preserve">7. การ​สกัด​และ​สร้าง​แผนภาพ​อธิบาย​ผล (XAI Implementation)</w:t>
+              <w:t xml:space="preserve">7. การสกัดและสร้างแผนภาพอธิบายผล (XAI Implementation)</w:t>
             </w:r>
           </w:p>
         </w:tc>
@@ -30544,7 +30544,7 @@
                 <w:sz w:val="24"/>
                 <w:szCs w:val="24"/>
               </w:rPr>
-              <w:t xml:space="preserve">8. การ​ประเมิน​ประสิทธิภาพ​การ​จำแนก​โรค</w:t>
+              <w:t xml:space="preserve">8. การประเมินประสิทธิภาพการจำแนกโรค</w:t>
             </w:r>
           </w:p>
         </w:tc>
@@ -30759,7 +30759,7 @@
                 <w:sz w:val="24"/>
                 <w:szCs w:val="24"/>
               </w:rPr>
-              <w:t xml:space="preserve">9. การ​ประเมิน​ความ​แม่นยำ​ของ​การ​อธิบาย​ผล​เชิง​สถิติ (XAI Localization)</w:t>
+              <w:t xml:space="preserve">9. การประเมินความแม่นยำของการอธิบายผลเชิงสถิติ (XAI Localization)</w:t>
             </w:r>
           </w:p>
         </w:tc>
@@ -30974,7 +30974,7 @@
                 <w:sz w:val="24"/>
                 <w:szCs w:val="24"/>
               </w:rPr>
-              <w:t xml:space="preserve">10. สรุป​ผล​และ​จัด​ทำ​รายงาน​ฉบับ​สมบูรณ์</w:t>
+              <w:t xml:space="preserve">10. สรุปผลและจัดทำรายงานฉบับสมบูรณ์</w:t>
             </w:r>
           </w:p>
         </w:tc>
@@ -31174,7 +31174,7 @@
           <w:sz w:val="32"/>
           <w:szCs w:val="32"/>
         </w:rPr>
-        <w:t xml:space="preserve">10. งบ​ประมาณ (Budget)</w:t>
+        <w:t xml:space="preserve">10. งบประมาณ (Budget)</w:t>
       </w:r>
     </w:p>
     <w:p>
@@ -31189,7 +31189,7 @@
           <w:sz w:val="28"/>
           <w:szCs w:val="28"/>
         </w:rPr>
-        <w:t xml:space="preserve">ใน​การ​ดำเนิน​โครง​งาน​วิจัย​นี้ มี​การ​ประมาณ​การ​ค่า​ใช้​จ่าย​แยก​ตาม​หมวด​หมู่ ดังนี้</w:t>
+        <w:t xml:space="preserve">ในการดำเนินโครงงานวิจัยนี้ มีการประมาณการค่าใช้จ่ายแยกตามหมวดหมู่ ดังนี้</w:t>
       </w:r>
     </w:p>
     <w:p>
@@ -31217,7 +31217,7 @@
           <w:sz w:val="28"/>
           <w:szCs w:val="28"/>
         </w:rPr>
-        <w:t xml:space="preserve">หมวด​ค่า​บริการ​ระบบ​คลา​วด์​และ​ทรัพยากร​คำนวณ</w:t>
+        <w:t xml:space="preserve">หมวดค่าบริการระบบคลาวด์และทรัพยากรคำนวณ</w:t>
       </w:r>
     </w:p>
     <w:p>
@@ -31243,7 +31243,7 @@
           <w:sz w:val="28"/>
           <w:szCs w:val="28"/>
         </w:rPr>
-        <w:t xml:space="preserve">ค่า​บริการ Google AI Pro (1,500 บาท/เดือน × 6 เดือน) เป็น​เงิน 9,000 บาท</w:t>
+        <w:t xml:space="preserve">ค่าบริการ Google AI Pro (1,500 บาท/เดือน × 6 เดือน) เป็นเงิน 9,000 บาท</w:t>
       </w:r>
     </w:p>
     <w:p>
@@ -31271,7 +31271,7 @@
           <w:sz w:val="28"/>
           <w:szCs w:val="28"/>
         </w:rPr>
-        <w:t xml:space="preserve">หมวด​วัสดุ​คอมพิวเตอร์​และ​อุปกรณ์​สำรอง​ข้อมูล</w:t>
+        <w:t xml:space="preserve">หมวดวัสดุคอมพิวเตอร์และอุปกรณ์สำรองข้อมูล</w:t>
       </w:r>
     </w:p>
     <w:p>
@@ -31297,7 +31297,7 @@
           <w:sz w:val="28"/>
           <w:szCs w:val="28"/>
         </w:rPr>
-        <w:t xml:space="preserve">ค่า​อุปกรณ์​สำรอง​ข้อมูล​ความเร็ว​สูง (Portable SSD/Flash Drive) จำนวน 1 ชุด เป็น​เงิน 1,200 บาท</w:t>
+        <w:t xml:space="preserve">ค่าอุปกรณ์สำรองข้อมูลความเร็วสูง (Portable SSD/Flash Drive) จำนวน 1 ชุด เป็นเงิน 1,200 บาท</w:t>
       </w:r>
     </w:p>
     <w:p>
@@ -31325,7 +31325,7 @@
           <w:sz w:val="28"/>
           <w:szCs w:val="28"/>
         </w:rPr>
-        <w:t xml:space="preserve">หมวด​ค่า​ใช้สอย​และ​การ​จัด​พิมพ์​เอกสาร</w:t>
+        <w:t xml:space="preserve">หมวดค่าใช้สอยและการจัดพิมพ์เอกสาร</w:t>
       </w:r>
     </w:p>
     <w:p>
@@ -31351,7 +31351,7 @@
           <w:sz w:val="28"/>
           <w:szCs w:val="28"/>
         </w:rPr>
-        <w:t xml:space="preserve">ค่า​จัด​ทำ​เอกสาร​เสนอ​เค้าโครง​โครง​งาน (4 เล่ม × 60 บาท) เป็น​เงิน 240 บาท</w:t>
+        <w:t xml:space="preserve">ค่าจัดทำเอกสารเสนอเค้าโครงโครงงาน (4 เล่ม × 60 บาท) เป็นเงิน 240 บาท</w:t>
       </w:r>
     </w:p>
     <w:p>
@@ -31377,7 +31377,7 @@
           <w:sz w:val="28"/>
           <w:szCs w:val="28"/>
         </w:rPr>
-        <w:t xml:space="preserve">ค่า​จัด​ทำ​รูป​เล่ม​รายงาน​โครง​งาน​ฉบับ​สมบูรณ์ (4 เล่ม × 150 บาท) เป็น​เงิน 600 บาท</w:t>
+        <w:t xml:space="preserve">ค่าจัดทำรูปเล่มรายงานโครงงานฉบับสมบูรณ์ (4 เล่ม × 150 บาท) เป็นเงิน 600 บาท</w:t>
       </w:r>
     </w:p>
     <w:p>
@@ -31403,7 +31403,7 @@
           <w:sz w:val="28"/>
           <w:szCs w:val="28"/>
         </w:rPr>
-        <w:t xml:space="preserve">ค่า​จัด​พิมพ์​โปสเตอร์​นำ​เสนอ​ผล​งาน​วิจัย (1 แผ่น) เป็น​เงิน 400 บาท</w:t>
+        <w:t xml:space="preserve">ค่าจัดพิมพ์โปสเตอร์นำเสนอผลงานวิจัย (1 แผ่น) เป็นเงิน 400 บาท</w:t>
       </w:r>
     </w:p>
     <w:p>
@@ -31420,7 +31420,7 @@
           <w:sz w:val="28"/>
           <w:szCs w:val="28"/>
         </w:rPr>
-        <w:t xml:space="preserve">รวม​เป็น​เงิน​งบ​ประมาณ​ทั้ง​สิ้น 11,440 บาท (หนึ่ง​หมื่น​หนึ่ง​พัน​สี่​ร้อย​สี่​สิบ​บาท​ถ้วน)</w:t>
+        <w:t xml:space="preserve">รวมเป็นเงินงบประมาณทั้งสิ้น 11,440 บาท (หนึ่งหมื่นหนึ่งพันสี่ร้อยสี่สิบบาทถ้วน)</w:t>
       </w:r>
     </w:p>
     <w:p>
@@ -31436,7 +31436,7 @@
           <w:sz w:val="32"/>
           <w:szCs w:val="32"/>
         </w:rPr>
-        <w:t xml:space="preserve">11. เอกสาร​อ้างอิง</w:t>
+        <w:t xml:space="preserve">11. เอกสารอ้างอิง</w:t>
       </w:r>
     </w:p>
     <w:p>
@@ -32572,7 +32572,7 @@
           <w:sz w:val="28"/>
           <w:szCs w:val="28"/>
         </w:rPr>
-        <w:t xml:space="preserve">ลงชื่อ​ผู้​ทำ​โครง​งาน .............................................</w:t>
+        <w:t xml:space="preserve">ลงชื่อผู้ทำโครงงาน .............................................</w:t>
       </w:r>
     </w:p>
     <w:p>
@@ -32586,7 +32586,7 @@
           <w:sz w:val="28"/>
           <w:szCs w:val="28"/>
         </w:rPr>
-        <w:t xml:space="preserve">                       (นาย​ปิยะ​พล ตุ่น​ป่า)</w:t>
+        <w:t xml:space="preserve">                       (นายปิยะพล ตุ่นป่า)</w:t>
       </w:r>
     </w:p>
     <w:p>
@@ -32600,7 +32600,7 @@
           <w:sz w:val="28"/>
           <w:szCs w:val="28"/>
         </w:rPr>
-        <w:t xml:space="preserve">วัน​ที่ ............................................................</w:t>
+        <w:t xml:space="preserve">วันที่ ............................................................</w:t>
       </w:r>
     </w:p>
     <w:p>
@@ -32627,7 +32627,7 @@
           <w:sz w:val="28"/>
           <w:szCs w:val="28"/>
         </w:rPr>
-        <w:t xml:space="preserve">ลงชื่อ​ผู้​ทำ​โครง​งาน .............................................</w:t>
+        <w:t xml:space="preserve">ลงชื่อผู้ทำโครงงาน .............................................</w:t>
       </w:r>
     </w:p>
     <w:p>
@@ -32641,7 +32641,7 @@
           <w:sz w:val="28"/>
           <w:szCs w:val="28"/>
         </w:rPr>
-        <w:t xml:space="preserve">                       (นาย​สัพพัญญู คำ​ตุ้ม)</w:t>
+        <w:t xml:space="preserve">                       (นายสัพพัญญู คำตุ้ม)</w:t>
       </w:r>
     </w:p>
     <w:p>
@@ -32655,7 +32655,7 @@
           <w:sz w:val="28"/>
           <w:szCs w:val="28"/>
         </w:rPr>
-        <w:t xml:space="preserve">วัน​ที่ ............................................................</w:t>
+        <w:t xml:space="preserve">วันที่ ............................................................</w:t>
       </w:r>
     </w:p>
     <w:p>
@@ -32696,7 +32696,7 @@
           <w:sz w:val="28"/>
           <w:szCs w:val="28"/>
         </w:rPr>
-        <w:t xml:space="preserve">การ​ตรวจ​สอบ​จาก​อาจารย์​ที่​ปรึกษา​โครง​งาน</w:t>
+        <w:t xml:space="preserve">การตรวจสอบจากอาจารย์ที่ปรึกษาโครงงาน</w:t>
       </w:r>
     </w:p>
     <w:p>
@@ -32710,7 +32710,7 @@
           <w:sz w:val="28"/>
           <w:szCs w:val="28"/>
         </w:rPr>
-        <w:t xml:space="preserve">(   ) ตรวจ​สอบ​แล้ว เห็น​ชอบ​ตาม​เสนอ</w:t>
+        <w:t xml:space="preserve">(   ) ตรวจสอบแล้ว เห็นชอบตามเสนอ</w:t>
       </w:r>
     </w:p>
     <w:p>
@@ -32765,7 +32765,7 @@
           <w:sz w:val="28"/>
           <w:szCs w:val="28"/>
         </w:rPr>
-        <w:t xml:space="preserve">              (อ.ดร.พบพร ด่าน​วิ​รุ​ทัย)</w:t>
+        <w:t xml:space="preserve">              (อ.ดร.พบพร ด่านวิรุทัย)</w:t>
       </w:r>
     </w:p>
     <w:p>
@@ -32779,7 +32779,7 @@
           <w:sz w:val="28"/>
           <w:szCs w:val="28"/>
         </w:rPr>
-        <w:t xml:space="preserve">วัน​ที่ ......................................................</w:t>
+        <w:t xml:space="preserve">วันที่ ......................................................</w:t>
       </w:r>
     </w:p>
     <w:sectPr>

</xml_diff>